<commit_message>
Backup uitbreiding isolatie- en glas-rapport module
Nieuw: teksten_elementen.py, afbeeldingen templates, 4 nieuwe output-rapporten.
Gewijzigd: narratives, report, fill_template, teksten_bouwperiodes, main, Word-template, HTML-stijl.

Co-Authored-By: Claude Sonnet 4.6 <noreply@anthropic.com>
</commit_message>
<xml_diff>
--- a/output/quickscan_8501BR_25.docx
+++ b/output/quickscan_8501BR_25.docx
@@ -2,178 +2,212 @@
 <file path=word/document.xml><?xml version="1.0" encoding="utf-8"?>
 <w:document xmlns:wpc="http://schemas.microsoft.com/office/word/2010/wordprocessingCanvas" xmlns:cx="http://schemas.microsoft.com/office/drawing/2014/chartex" xmlns:cx1="http://schemas.microsoft.com/office/drawing/2015/9/8/chartex" xmlns:cx2="http://schemas.microsoft.com/office/drawing/2015/10/21/chartex" xmlns:cx3="http://schemas.microsoft.com/office/drawing/2016/5/9/chartex" xmlns:cx4="http://schemas.microsoft.com/office/drawing/2016/5/10/chartex" xmlns:cx5="http://schemas.microsoft.com/office/drawing/2016/5/11/chartex" xmlns:cx6="http://schemas.microsoft.com/office/drawing/2016/5/12/chartex" xmlns:cx7="http://schemas.microsoft.com/office/drawing/2016/5/13/chartex" xmlns:cx8="http://schemas.microsoft.com/office/drawing/2016/5/14/chartex" xmlns:mc="http://schemas.openxmlformats.org/markup-compatibility/2006" xmlns:aink="http://schemas.microsoft.com/office/drawing/2016/ink" xmlns:am3d="http://schemas.microsoft.com/office/drawing/2017/model3d" xmlns:o="urn:schemas-microsoft-com:office:office" xmlns:oel="http://schemas.microsoft.com/office/2019/extlst" xmlns:r="http://schemas.openxmlformats.org/officeDocument/2006/relationships" xmlns:m="http://schemas.openxmlformats.org/officeDocument/2006/math" xmlns:v="urn:schemas-microsoft-com:vml" xmlns:wp14="http://schemas.microsoft.com/office/word/2010/wordprocessingDrawing" xmlns:wp="http://schemas.openxmlformats.org/drawingml/2006/wordprocessingDrawing" xmlns:w10="urn:schemas-microsoft-com:office:word" xmlns:w="http://schemas.openxmlformats.org/wordprocessingml/2006/main" xmlns:w14="http://schemas.microsoft.com/office/word/2010/wordml" xmlns:w15="http://schemas.microsoft.com/office/word/2012/wordml" xmlns:w16cex="http://schemas.microsoft.com/office/word/2018/wordml/cex" xmlns:w16cid="http://schemas.microsoft.com/office/word/2016/wordml/cid" xmlns:w16="http://schemas.microsoft.com/office/word/2018/wordml" xmlns:w16du="http://schemas.microsoft.com/office/word/2023/wordml/word16du" xmlns:w16sdtdh="http://schemas.microsoft.com/office/word/2020/wordml/sdtdatahash" xmlns:w16sdtfl="http://schemas.microsoft.com/office/word/2024/wordml/sdtformatlock" xmlns:w16se="http://schemas.microsoft.com/office/word/2015/wordml/symex" xmlns:wpg="http://schemas.microsoft.com/office/word/2010/wordprocessingGroup" xmlns:wpi="http://schemas.microsoft.com/office/word/2010/wordprocessingInk" xmlns:wne="http://schemas.microsoft.com/office/word/2006/wordml" xmlns:wps="http://schemas.microsoft.com/office/word/2010/wordprocessingShape" mc:Ignorable="w14 w15 w16se w16cid w16 w16cex w16sdtdh w16sdtfl w16du wp14">
   <w:body>
-    <w:p>
-      <w:pPr>
-        <w:spacing w:before="1440" w:after="200"/>
-      </w:pPr>
-      <w:proofErr w:type="spellStart"/>
-      <w:r>
-        <w:rPr>
-          <w:rFonts w:ascii="Georgia" w:eastAsia="Georgia" w:hAnsi="Georgia" w:cs="Georgia"/>
+    <w:tbl>
+      <w:tblPr>
+        <w:tblW w:w="5000" w:type="pct"/>
+        <w:tblBorders>
+          <w:top w:val="none"/>
+          <w:left w:val="none"/>
+          <w:bottom w:val="none"/>
+          <w:right w:val="none"/>
+          <w:insideH w:val="none"/>
+          <w:insideV w:val="none"/>
+        </w:tblBorders>
+      </w:tblPr>
+      <w:tblGrid>
+        <w:gridCol w:w="9026"/>
+      </w:tblGrid>
+      <w:tr>
+        <w:trPr>
+          <w:trHeight w:val="1600" w:hRule="atLeast"/>
+        </w:trPr>
+        <w:tc>
+          <w:tcPr>
+            <w:tcW w:w="5000" w:type="pct"/>
+            <w:shd w:val="clear" w:color="auto" w:fill="1A1A1A"/>
+            <w:tcMar>
+              <w:top w:w="240" w:type="dxa"/>
+              <w:left w:w="360" w:type="dxa"/>
+              <w:bottom w:w="240" w:type="dxa"/>
+              <w:right w:w="360" w:type="dxa"/>
+            </w:tcMar>
+          </w:tcPr>
+          <w:p>
+            <w:pPr>
+              <w:spacing w:before="0" w:after="80"/>
+              <w:shd w:val="clear" w:color="auto" w:fill="1A1A1A"/>
+            </w:pPr>
+            <w:r>
+              <w:rPr>
+                <w:b/>
+                <w:rFonts w:ascii="Calibri" w:hAnsi="Calibri" w:cs="Calibri"/>
+                <w:sz w:val="60"/>
+                <w:szCs w:val="60"/>
+                <w:color w:val="FFFFFF"/>
+              </w:rPr>
+              <w:t xml:space="preserve">Pand</w:t>
+            </w:r>
+            <w:r>
+              <w:rPr>
+                <w:b/>
+                <w:rFonts w:ascii="Calibri" w:hAnsi="Calibri" w:cs="Calibri"/>
+                <w:sz w:val="60"/>
+                <w:szCs w:val="60"/>
+                <w:color w:val="5AAA00"/>
+              </w:rPr>
+              <w:t xml:space="preserve">IQ</w:t>
+            </w:r>
+          </w:p>
+          <w:p>
+            <w:pPr>
+              <w:spacing w:before="0" w:after="0"/>
+              <w:shd w:val="clear" w:color="auto" w:fill="1A1A1A"/>
+            </w:pPr>
+            <w:r>
+              <w:rPr>
+                <w:b/>
+                <w:rFonts w:ascii="Calibri" w:hAnsi="Calibri" w:cs="Calibri"/>
+                <w:sz w:val="18"/>
+                <w:szCs w:val="18"/>
+                <w:color w:val="5AAA00"/>
+                <w:spacing w:val="40"/>
+              </w:rPr>
+              <w:t xml:space="preserve">WONEN</w:t>
+            </w:r>
+          </w:p>
+        </w:tc>
+      </w:tr>
+    </w:tbl>
+    <w:tbl>
+      <w:tblPr>
+        <w:tblW w:w="5000" w:type="pct"/>
+        <w:tblBorders>
+          <w:top w:val="none"/>
+          <w:left w:val="none"/>
+          <w:bottom w:val="none"/>
+          <w:right w:val="none"/>
+          <w:insideH w:val="none"/>
+          <w:insideV w:val="none"/>
+        </w:tblBorders>
+      </w:tblPr>
+      <w:tblGrid>
+        <w:gridCol w:w="9026"/>
+      </w:tblGrid>
+      <w:tr>
+        <w:trPr>
+          <w:trHeight w:val="100" w:hRule="atLeast"/>
+        </w:trPr>
+        <w:tc>
+          <w:tcPr>
+            <w:tcW w:w="5000" w:type="pct"/>
+            <w:shd w:val="clear" w:color="auto" w:fill="D4E832"/>
+            <w:tcMar>
+              <w:top w:w="240" w:type="dxa"/>
+              <w:left w:w="360" w:type="dxa"/>
+              <w:bottom w:w="240" w:type="dxa"/>
+              <w:right w:w="360" w:type="dxa"/>
+            </w:tcMar>
+          </w:tcPr>
+          <w:p>
+            <w:pPr>
+              <w:spacing w:before="0" w:after="0"/>
+              <w:shd w:val="clear" w:color="auto" w:fill="D4E832"/>
+            </w:pPr>
+          </w:p>
+        </w:tc>
+      </w:tr>
+    </w:tbl>
+    <w:p>
+      <w:pPr>
+        <w:spacing w:before="600" w:after="0"/>
+      </w:pPr>
+    </w:p>
+    <w:p>
+      <w:pPr>
+        <w:spacing w:before="0" w:after="120"/>
+      </w:pPr>
+      <w:r>
+        <w:rPr>
           <w:b/>
-          <w:bCs/>
-          <w:color w:val="0B1F3A"/>
-          <w:sz w:val="72"/>
-          <w:szCs w:val="72"/>
-        </w:rPr>
-        <w:t>Pand</w:t>
-      </w:r>
-      <w:r>
-        <w:rPr>
-          <w:rFonts w:ascii="Georgia" w:eastAsia="Georgia" w:hAnsi="Georgia" w:cs="Georgia"/>
-          <w:b/>
-          <w:bCs/>
-          <w:color w:val="3DBDBD"/>
-          <w:sz w:val="72"/>
-          <w:szCs w:val="72"/>
-        </w:rPr>
-        <w:t>IQ</w:t>
-      </w:r>
-      <w:proofErr w:type="spellEnd"/>
-    </w:p>
-    <w:p>
-      <w:pPr>
-        <w:spacing w:after="480"/>
-      </w:pPr>
-      <w:r>
-        <w:rPr>
-          <w:color w:val="5A6A85"/>
-          <w:sz w:val="20"/>
-          <w:szCs w:val="20"/>
-        </w:rPr>
-        <w:t>www.PandIQ.nl</w:t>
-      </w:r>
-    </w:p>
-    <w:p>
-      <w:pPr>
-        <w:pBdr>
-          <w:bottom w:val="single" w:sz="12" w:space="1" w:color="2E6BE6"/>
-        </w:pBdr>
-        <w:spacing w:after="480"/>
-      </w:pPr>
-    </w:p>
-    <w:p>
-      <w:pPr>
-        <w:spacing w:before="480" w:after="120"/>
-      </w:pPr>
-      <w:r>
-        <w:rPr>
-          <w:rFonts w:ascii="Georgia" w:eastAsia="Georgia" w:hAnsi="Georgia" w:cs="Georgia"/>
-          <w:b/>
-          <w:bCs/>
-          <w:color w:val="0B1F3A"/>
+          <w:rFonts w:ascii="Calibri" w:hAnsi="Calibri" w:cs="Calibri"/>
           <w:sz w:val="64"/>
           <w:szCs w:val="64"/>
-        </w:rPr>
-        <w:t>Advies verduurzaming</w:t>
-      </w:r>
-    </w:p>
-    <w:p>
-      <w:pPr>
-        <w:spacing w:after="480"/>
-      </w:pPr>
-      <w:r>
-        <w:rPr>
-          <w:color w:val="5A6A85"/>
-          <w:sz w:val="32"/>
-          <w:szCs w:val="32"/>
-        </w:rPr>
-        <w:t xml:space="preserve">Isolatie </w:t>
-      </w:r>
-      <w:proofErr w:type="spellStart"/>
-      <w:r>
-        <w:rPr>
-          <w:color w:val="5A6A85"/>
-          <w:sz w:val="32"/>
-          <w:szCs w:val="32"/>
-        </w:rPr>
-        <w:t>Quickscan</w:t>
-      </w:r>
-      <w:proofErr w:type="spellEnd"/>
-    </w:p>
-    <w:p>
-      <w:pPr>
-        <w:spacing w:after="120"/>
+          <w:color w:val="1A1A1A"/>
+        </w:rPr>
+        <w:t xml:space="preserve">Isolatie Quickscan</w:t>
+      </w:r>
+    </w:p>
+    <w:p>
+      <w:pPr>
+        <w:spacing w:before="0" w:after="0"/>
+      </w:pPr>
+      <w:r>
+        <w:rPr>
+          <w:rFonts w:ascii="Calibri" w:hAnsi="Calibri" w:cs="Calibri"/>
+          <w:sz w:val="26"/>
+          <w:szCs w:val="26"/>
+          <w:color w:val="666666"/>
+        </w:rPr>
+        <w:t xml:space="preserve">Energierapport verduurzaming</w:t>
+      </w:r>
+    </w:p>
+    <w:p>
+      <w:pPr>
+        <w:spacing w:before="640" w:after="0"/>
+      </w:pPr>
+    </w:p>
+    <w:p>
+      <w:pPr>
+        <w:spacing w:before="0" w:after="80"/>
       </w:pPr>
       <w:r>
         <w:rPr>
           <w:b/>
-          <w:bCs/>
-          <w:color w:val="0B1F3A"/>
-          <w:sz w:val="24"/>
-          <w:szCs w:val="24"/>
-        </w:rPr>
-        <w:t xml:space="preserve">Adres:  Visstraat 25, 8501BR Joure</w:t>
-      </w:r>
-      <w:r>
-        <w:rPr>
-          <w:color w:val="1A2340"/>
-        </w:rPr>
-        <w:t/>
-      </w:r>
-    </w:p>
-    <w:p>
-      <w:pPr>
-        <w:spacing w:after="240"/>
-      </w:pPr>
-      <w:r>
-        <w:rPr>
-          <w:b/>
-          <w:bCs/>
-          <w:color w:val="0B1F3A"/>
-          <w:sz w:val="24"/>
-          <w:szCs w:val="24"/>
-        </w:rPr>
-        <w:t xml:space="preserve">Datum:  3 april 2026</w:t>
-      </w:r>
-      <w:r>
-        <w:rPr>
-          <w:color w:val="1A2340"/>
-        </w:rPr>
-        <w:t/>
-      </w:r>
-    </w:p>
-    <w:p>
-      <w:pPr>
-        <w:spacing w:after="160"/>
-      </w:pPr>
-      <w:r>
-        <w:rPr>
-          <w:i/>
-          <w:iCs/>
-          <w:color w:val="5A6A85"/>
+          <w:rFonts w:ascii="Calibri" w:hAnsi="Calibri" w:cs="Calibri"/>
+          <w:sz w:val="28"/>
+          <w:szCs w:val="28"/>
+          <w:color w:val="1A1A1A"/>
+        </w:rPr>
+        <w:t xml:space="preserve">Visstraat 25, 8501BR Joure</w:t>
+      </w:r>
+    </w:p>
+    <w:p>
+      <w:pPr>
+        <w:spacing w:before="0" w:after="0"/>
+      </w:pPr>
+      <w:r>
+        <w:rPr>
+          <w:rFonts w:ascii="Calibri" w:hAnsi="Calibri" w:cs="Calibri"/>
+          <w:sz w:val="22"/>
+          <w:szCs w:val="22"/>
+          <w:color w:val="666666"/>
+        </w:rPr>
+        <w:t xml:space="preserve">6 april 2026</w:t>
+      </w:r>
+    </w:p>
+    <w:p>
+      <w:pPr>
+        <w:spacing w:before="800" w:after="0"/>
+      </w:pPr>
+    </w:p>
+    <w:p>
+      <w:pPr>
+        <w:spacing w:before="0" w:after="0"/>
+      </w:pPr>
+      <w:r>
+        <w:rPr>
+          <w:rFonts w:ascii="Calibri" w:hAnsi="Calibri" w:cs="Calibri"/>
           <w:sz w:val="18"/>
           <w:szCs w:val="18"/>
-        </w:rPr>
-        <w:t>Indicatief rapport op basis van openbare registraties (BAG &amp; EP-Online)</w:t>
-      </w:r>
-    </w:p>
-    <w:p>
-      <w:pPr>
-        <w:spacing w:before="160" w:after="160"/>
-      </w:pPr>
-      <w:r>
-        <w:rPr>
-          <w:color w:val="FFFFFF"/>
-        </w:rPr>
-        <w:t xml:space="preserve"/>
-      </w:r>
-      <w:proofErr w:type="spellStart"/>
-      <w:r>
-        <w:rPr>
-          <w:color w:val="FFFFFF"/>
-        </w:rPr>
-        <w:t/>
-      </w:r>
-      <w:proofErr w:type="spellEnd"/>
-      <w:r>
-        <w:rPr>
-          <w:color w:val="FFFFFF"/>
-        </w:rPr>
-        <w:t/>
-      </w:r>
-    </w:p>
-    <w:p>
+          <w:color w:val="999999"/>
+        </w:rPr>
+        <w:t xml:space="preserve">Indicatief rapport op basis van openbare registraties (BAG &amp; EP-Online)</w:t>
+      </w:r>
+    </w:p>
+    <w:p>
+      <w:pPr>
+        <w:spacing w:before="0" w:after="0"/>
+      </w:pPr>
       <w:r>
         <w:br w:type="page"/>
       </w:r>
@@ -185,12 +219,12 @@
           <w:bottom w:val="single" w:sz="4" w:space="4" w:color="2E6BE6"/>
         </w:pBdr>
         <w:rPr>
-          <w:color w:val="2E6BE6"/>
-        </w:rPr>
-      </w:pPr>
-      <w:r>
-        <w:rPr>
-          <w:color w:val="2E6BE6"/>
+          <w:color w:val="5AAA00"/>
+        </w:rPr>
+      </w:pPr>
+      <w:r>
+        <w:rPr>
+          <w:color w:val="5AAA00"/>
         </w:rPr>
         <w:lastRenderedPageBreak/>
         <w:t>Interpretatie en context</w:t>
@@ -200,14 +234,14 @@
       <w:pPr>
         <w:spacing w:before="160" w:after="80"/>
         <w:rPr>
-          <w:color w:val="2E6BE6"/>
+          <w:color w:val="5AAA00"/>
         </w:rPr>
       </w:pPr>
       <w:r>
         <w:rPr>
           <w:b/>
           <w:bCs/>
-          <w:color w:val="2E6BE6"/>
+          <w:color w:val="5AAA00"/>
         </w:rPr>
         <w:t>Gebouwprofiel</w:t>
       </w:r>
@@ -215,11 +249,14 @@
     <w:p>
       <w:pPr>
         <w:spacing w:before="60" w:after="160"/>
-      </w:pPr>
-      <w:r>
         <w:rPr>
           <w:color w:val="1A2340"/>
         </w:rPr>
+      </w:pPr>
+      <w:r>
+        <w:rPr>
+          <w:color w:val="1A2340"/>
+        </w:rPr>
         <w:t xml:space="preserve">Dit rapport is opgesteld op basis van openbare registraties (BAG en EP-Online) voor Visstraat 25, 8501BR Joure. De woning is gebouwd in 1876.</w:t>
       </w:r>
       <w:proofErr w:type="spellStart"/>
@@ -236,6 +273,11 @@
         </w:rPr>
         <w:t/>
       </w:r>
+    </w:p>
+    <w:p>
+      <w:pPr>
+        <w:spacing w:before="60" w:after="160"/>
+      </w:pPr>
     </w:p>
     <w:p>
       <w:pPr>
@@ -248,12 +290,15 @@
     <w:p>
       <w:pPr>
         <w:spacing w:before="160" w:after="80"/>
+        <w:rPr>
+          <w:color w:val="5AAA00"/>
+        </w:rPr>
       </w:pPr>
       <w:r>
         <w:rPr>
           <w:b/>
           <w:bCs/>
-          <w:color w:val="2E6BE6"/>
+          <w:color w:val="5AAA00"/>
         </w:rPr>
         <w:t>Energieprestatie</w:t>
       </w:r>
@@ -261,76 +306,38 @@
     <w:p>
       <w:pPr>
         <w:spacing w:before="60" w:after="160"/>
-        <w:rPr>
-          <w:color w:val="1A2340"/>
-        </w:rPr>
-      </w:pPr>
-      <w:r>
-        <w:rPr>
-          <w:color w:val="1A2340"/>
-        </w:rPr>
-        <w:t>D</w:t>
-      </w:r>
-      <w:r>
-        <w:rPr>
-          <w:color w:val="1A2340"/>
-        </w:rPr>
-        <w:t>e energieprestatie van uw woning wordt onder andere bepaald door twee begrippen: energiebehoefte en warmtebehoefte.</w:t>
+      </w:pPr>
+      <w:r>
+        <w:t>De energieprestatie van uw woning wordt onder andere bepaald door twee begrippen: energiebehoefte en warmtebehoefte.</w:t>
       </w:r>
     </w:p>
     <w:p>
       <w:pPr>
         <w:spacing w:before="60" w:after="160"/>
-        <w:rPr>
-          <w:color w:val="1A2340"/>
-        </w:rPr>
       </w:pPr>
       <w:r>
         <w:rPr>
           <w:b/>
           <w:bCs/>
-          <w:color w:val="1A2340"/>
         </w:rPr>
         <w:t>Warmtebehoefte</w:t>
       </w:r>
       <w:r>
-        <w:rPr>
-          <w:color w:val="1A2340"/>
-        </w:rPr>
-        <w:t xml:space="preserve"> geeft </w:t>
-      </w:r>
-      <w:r>
-        <w:rPr>
-          <w:color w:val="5A6A85"/>
-        </w:rPr>
-        <w:t>aan hoeveel warmte uw woning nodig heeft om comfortabel op temperatuur te blijven. Dit zegt vooral iets over de</w:t>
-      </w:r>
-      <w:r>
-        <w:rPr>
-          <w:color w:val="1A2340"/>
-        </w:rPr>
-        <w:t xml:space="preserve"> kwaliteit van de isolatie en de gebouwschil.</w:t>
+        <w:t xml:space="preserve"> geeft aan hoeveel warmte uw woning nodig heeft om comfortabel op temperatuur te blijven. Dit zegt vooral iets over de kwaliteit van de isolatie en de gebouwschil.</w:t>
       </w:r>
     </w:p>
     <w:p>
       <w:pPr>
         <w:spacing w:before="60" w:after="160"/>
-        <w:rPr>
-          <w:color w:val="1A2340"/>
-        </w:rPr>
       </w:pPr>
       <w:r>
         <w:rPr>
           <w:b/>
           <w:bCs/>
-          <w:color w:val="1A2340"/>
         </w:rPr>
         <w:t>Energiebehoefte</w:t>
       </w:r>
       <w:r>
-        <w:rPr>
-          <w:color w:val="1A2340"/>
-        </w:rPr>
         <w:t xml:space="preserve"> is breder en omvat het totale energieverbruik van de woning. Dit is dus inclusief verwarming, maar ook warm water en ventilatie.</w:t>
       </w:r>
     </w:p>
@@ -386,86 +393,92 @@
     </w:p>
     <w:p>
       <w:pPr>
-        <w:spacing w:before="60" w:after="160"/>
-      </w:pPr>
-      <w:r>
-        <w:rPr>
-          <w:color w:val="1A2340"/>
-        </w:rPr>
-        <w:br/>
-        <w:t xml:space="preserve">Uw woning:Er zijn geen EP-Online kengetallen beschikbaar voor deze woning. De energieprestatie kan daardoor niet automatisch worden geduid. Een maatwerkadvies geeft hier meer inzicht.</w:t>
-      </w:r>
-      <w:r>
-        <w:rPr>
-          <w:b/>
-          <w:bCs/>
-          <w:color w:val="1A2340"/>
-        </w:rPr>
-        <w:t/>
-      </w:r>
-      <w:r>
-        <w:rPr>
-          <w:b/>
-          <w:bCs/>
-          <w:color w:val="1A2340"/>
-        </w:rPr>
-        <w:t/>
-      </w:r>
-      <w:r>
-        <w:rPr>
-          <w:color w:val="1A2340"/>
-        </w:rPr>
-        <w:br/>
-      </w:r>
-      <w:r>
-        <w:rPr>
-          <w:color w:val="1A2340"/>
-        </w:rPr>
-        <w:br/>
-      </w:r>
-      <w:r>
-        <w:rPr>
-          <w:color w:val="1A2340"/>
-        </w:rPr>
-        <w:t/>
-      </w:r>
-      <w:proofErr w:type="spellStart"/>
-      <w:r>
-        <w:rPr>
-          <w:color w:val="1A2340"/>
-        </w:rPr>
-        <w:t/>
-      </w:r>
-      <w:proofErr w:type="spellEnd"/>
-      <w:r>
-        <w:rPr>
-          <w:color w:val="1A2340"/>
-        </w:rPr>
-        <w:t/>
-      </w:r>
-    </w:p>
-    <w:p>
-      <w:pPr>
         <w:pBdr>
           <w:bottom w:val="single" w:sz="2" w:space="0" w:color="D0D8EC"/>
         </w:pBdr>
         <w:spacing w:before="160" w:after="160"/>
-      </w:pPr>
-    </w:p>
-    <w:p>
-      <w:pPr>
-        <w:spacing w:before="160" w:after="80"/>
+        <w:rPr>
+          <w:color w:val="1A2340"/>
+        </w:rPr>
+      </w:pPr>
+      <w:r>
+        <w:rPr>
+          <w:color w:val="1A2340"/>
+        </w:rPr>
+        <w:br/>
+        <w:t xml:space="preserve">Uw woning:Er zijn geen EP-Online kengetallen beschikbaar voor deze woning. De energieprestatie kan daardoor niet automatisch worden geduid. Een maatwerkadvies geeft hier meer inzicht.</w:t>
+      </w:r>
+      <w:r>
         <w:rPr>
           <w:b/>
           <w:bCs/>
-          <w:color w:val="2E6BE6"/>
-        </w:rPr>
-      </w:pPr>
+          <w:color w:val="1A2340"/>
+        </w:rPr>
+        <w:t/>
+      </w:r>
       <w:r>
         <w:rPr>
           <w:b/>
           <w:bCs/>
-          <w:color w:val="2E6BE6"/>
+          <w:color w:val="1A2340"/>
+        </w:rPr>
+        <w:t/>
+      </w:r>
+      <w:r>
+        <w:rPr>
+          <w:color w:val="1A2340"/>
+        </w:rPr>
+        <w:br/>
+      </w:r>
+      <w:r>
+        <w:rPr>
+          <w:color w:val="1A2340"/>
+        </w:rPr>
+        <w:br/>
+      </w:r>
+      <w:r>
+        <w:rPr>
+          <w:color w:val="1A2340"/>
+        </w:rPr>
+        <w:t/>
+      </w:r>
+      <w:proofErr w:type="spellStart"/>
+      <w:r>
+        <w:rPr>
+          <w:color w:val="1A2340"/>
+        </w:rPr>
+        <w:t/>
+      </w:r>
+      <w:proofErr w:type="spellEnd"/>
+      <w:r>
+        <w:rPr>
+          <w:color w:val="1A2340"/>
+        </w:rPr>
+        <w:t/>
+      </w:r>
+    </w:p>
+    <w:p>
+      <w:pPr>
+        <w:pBdr>
+          <w:bottom w:val="single" w:sz="2" w:space="0" w:color="D0D8EC"/>
+        </w:pBdr>
+        <w:spacing w:before="160" w:after="160"/>
+      </w:pPr>
+    </w:p>
+    <w:p>
+      <w:pPr>
+        <w:spacing w:before="60" w:after="160"/>
+        <w:rPr>
+          <w:b/>
+          <w:bCs/>
+          <w:color w:val="5AAA00"/>
+        </w:rPr>
+      </w:pPr>
+      <w:r>
+        <w:rPr>
+          <w:b/>
+          <w:bCs/>
+          <w:color w:val="5AAA00"/>
         </w:rPr>
         <w:t>Basis en totstandkoming van dit rapport</w:t>
       </w:r>
@@ -594,7 +607,7 @@
       </w:pPr>
       <w:r>
         <w:rPr>
-          <w:color w:val="2E6BE6"/>
+          <w:color w:val="5AAA00"/>
         </w:rPr>
         <w:t>Woninggegevens</w:t>
       </w:r>
@@ -604,9 +617,6 @@
         <w:spacing w:before="60" w:after="60"/>
       </w:pPr>
       <w:r>
-        <w:rPr>
-          <w:color w:val="5A6A85"/>
-        </w:rPr>
         <w:t>Onderstaande gegevens zijn afkomstig uit de Basisregistratie Adressen en Gebouwen (BAG) en de landelijke energielabelregistratie EP-Online.</w:t>
       </w:r>
     </w:p>
@@ -637,11 +647,12 @@
         <w:tc>
           <w:tcPr>
             <w:gridSpan w:val="2"/>
-            <w:shd w:val="clear" w:color="auto" w:fill="2F6FA3"/>
-          </w:tcPr>
-          <w:p>
-            <w:r>
-              <w:rPr>
+            <w:shd w:val="clear" w:color="auto" w:fill="5AAA00"/>
+          </w:tcPr>
+          <w:p>
+            <w:r>
+              <w:rPr>
+                <w:rFonts w:ascii="Calibri" w:hAnsi="Calibri" w:cs="Calibri"/>
                 <w:b/>
                 <w:color w:val="FFFFFF"/>
                 <w:sz w:val="22"/>
@@ -673,10 +684,11 @@
           <w:p>
             <w:r>
               <w:rPr>
+                <w:rFonts w:ascii="Calibri" w:hAnsi="Calibri"/>
                 <w:b/>
                 <w:bCs/>
                 <w:color w:val="1F2937"/>
-                <w:sz w:val="21"/>
+                <w:sz w:val="22"/>
                 <w:szCs w:val="20"/>
               </w:rPr>
               <w:t>Adres</w:t>
@@ -703,9 +715,10 @@
           <w:p>
             <w:r>
               <w:rPr>
+                <w:rFonts w:ascii="Calibri" w:hAnsi="Calibri"/>
                 <w:b w:val="0"/>
                 <w:color w:val="1F2937"/>
-                <w:sz w:val="21"/>
+                <w:sz w:val="22"/>
               </w:rPr>
               <w:t xml:space="preserve">Visstraat 25, 8501BR Joure</w:t>
             </w:r>
@@ -733,10 +746,11 @@
           <w:p>
             <w:r>
               <w:rPr>
+                <w:rFonts w:ascii="Calibri" w:hAnsi="Calibri"/>
                 <w:b/>
                 <w:bCs/>
                 <w:color w:val="1F2937"/>
-                <w:sz w:val="21"/>
+                <w:sz w:val="22"/>
                 <w:szCs w:val="20"/>
               </w:rPr>
               <w:t>Datum rapport</w:t>
@@ -763,11 +777,12 @@
           <w:p>
             <w:r>
               <w:rPr>
+                <w:rFonts w:ascii="Calibri" w:hAnsi="Calibri"/>
                 <w:b w:val="0"/>
                 <w:color w:val="1F2937"/>
-                <w:sz w:val="21"/>
-              </w:rPr>
-              <w:t xml:space="preserve">3 april 2026</w:t>
+                <w:sz w:val="22"/>
+              </w:rPr>
+              <w:t xml:space="preserve">6 april 2026</w:t>
             </w:r>
           </w:p>
         </w:tc>
@@ -793,10 +808,11 @@
           <w:p>
             <w:r>
               <w:rPr>
+                <w:rFonts w:ascii="Calibri" w:hAnsi="Calibri"/>
                 <w:b/>
                 <w:bCs/>
                 <w:color w:val="1F2937"/>
-                <w:sz w:val="21"/>
+                <w:sz w:val="22"/>
                 <w:szCs w:val="20"/>
               </w:rPr>
               <w:t>Bouwjaar</w:t>
@@ -823,9 +839,10 @@
           <w:p>
             <w:r>
               <w:rPr>
+                <w:rFonts w:ascii="Calibri" w:hAnsi="Calibri"/>
                 <w:b w:val="0"/>
                 <w:color w:val="1F2937"/>
-                <w:sz w:val="21"/>
+                <w:sz w:val="22"/>
               </w:rPr>
               <w:t xml:space="preserve">1876</w:t>
             </w:r>
@@ -853,10 +870,11 @@
           <w:p>
             <w:r>
               <w:rPr>
+                <w:rFonts w:ascii="Calibri" w:hAnsi="Calibri"/>
                 <w:b/>
                 <w:bCs/>
                 <w:color w:val="1F2937"/>
-                <w:sz w:val="21"/>
+                <w:sz w:val="22"/>
                 <w:szCs w:val="20"/>
               </w:rPr>
               <w:t>Bouwperiode</w:t>
@@ -883,9 +901,10 @@
           <w:p>
             <w:r>
               <w:rPr>
+                <w:rFonts w:ascii="Calibri" w:hAnsi="Calibri"/>
                 <w:b w:val="0"/>
                 <w:color w:val="1F2937"/>
-                <w:sz w:val="21"/>
+                <w:sz w:val="22"/>
               </w:rPr>
               <w:t xml:space="preserve">voor 1975</w:t>
             </w:r>
@@ -913,10 +932,11 @@
           <w:p>
             <w:r>
               <w:rPr>
+                <w:rFonts w:ascii="Calibri" w:hAnsi="Calibri"/>
                 <w:b/>
                 <w:bCs/>
                 <w:color w:val="1F2937"/>
-                <w:sz w:val="21"/>
+                <w:sz w:val="22"/>
                 <w:szCs w:val="20"/>
               </w:rPr>
               <w:t>Gebruiksoppervlakte</w:t>
@@ -943,9 +963,10 @@
           <w:p>
             <w:r>
               <w:rPr>
+                <w:rFonts w:ascii="Calibri" w:hAnsi="Calibri"/>
                 <w:b w:val="0"/>
                 <w:color w:val="1F2937"/>
-                <w:sz w:val="21"/>
+                <w:sz w:val="22"/>
               </w:rPr>
               <w:t xml:space="preserve">82 m²</w:t>
             </w:r>
@@ -973,10 +994,11 @@
           <w:p>
             <w:r>
               <w:rPr>
+                <w:rFonts w:ascii="Calibri" w:hAnsi="Calibri"/>
                 <w:b/>
                 <w:bCs/>
                 <w:color w:val="1F2937"/>
-                <w:sz w:val="21"/>
+                <w:sz w:val="22"/>
                 <w:szCs w:val="20"/>
               </w:rPr>
               <w:t>Energielabel</w:t>
@@ -1003,9 +1025,10 @@
           <w:p>
             <w:r>
               <w:rPr>
+                <w:rFonts w:ascii="Calibri" w:hAnsi="Calibri"/>
                 <w:b w:val="0"/>
                 <w:color w:val="1F2937"/>
-                <w:sz w:val="21"/>
+                <w:sz w:val="22"/>
               </w:rPr>
               <w:t xml:space="preserve">—</w:t>
             </w:r>
@@ -1033,10 +1056,11 @@
           <w:p>
             <w:r>
               <w:rPr>
+                <w:rFonts w:ascii="Calibri" w:hAnsi="Calibri"/>
                 <w:b/>
                 <w:bCs/>
                 <w:color w:val="1F2937"/>
-                <w:sz w:val="21"/>
+                <w:sz w:val="22"/>
                 <w:szCs w:val="20"/>
               </w:rPr>
               <w:t>Registratiedatum</w:t>
@@ -1063,9 +1087,10 @@
           <w:p>
             <w:r>
               <w:rPr>
+                <w:rFonts w:ascii="Calibri" w:hAnsi="Calibri"/>
                 <w:b w:val="0"/>
                 <w:color w:val="1F2937"/>
-                <w:sz w:val="21"/>
+                <w:sz w:val="22"/>
               </w:rPr>
               <w:t xml:space="preserve">—</w:t>
             </w:r>
@@ -1093,10 +1118,11 @@
           <w:p>
             <w:r>
               <w:rPr>
+                <w:rFonts w:ascii="Calibri" w:hAnsi="Calibri"/>
                 <w:b/>
                 <w:bCs/>
                 <w:color w:val="1F2937"/>
-                <w:sz w:val="21"/>
+                <w:sz w:val="22"/>
                 <w:szCs w:val="20"/>
               </w:rPr>
               <w:t>Geldig tot</w:t>
@@ -1123,27 +1149,30 @@
           <w:p>
             <w:r>
               <w:rPr>
+                <w:rFonts w:ascii="Calibri" w:hAnsi="Calibri"/>
                 <w:b w:val="0"/>
                 <w:color w:val="1F2937"/>
-                <w:sz w:val="21"/>
+                <w:sz w:val="22"/>
               </w:rPr>
               <w:t xml:space="preserve">—</w:t>
             </w:r>
             <w:proofErr w:type="spellStart"/>
             <w:r>
               <w:rPr>
+                <w:rFonts w:ascii="Calibri" w:hAnsi="Calibri"/>
                 <w:b w:val="0"/>
                 <w:color w:val="1F2937"/>
-                <w:sz w:val="21"/>
+                <w:sz w:val="22"/>
               </w:rPr>
               <w:t/>
             </w:r>
             <w:proofErr w:type="spellEnd"/>
             <w:r>
               <w:rPr>
+                <w:rFonts w:ascii="Calibri" w:hAnsi="Calibri"/>
                 <w:b w:val="0"/>
                 <w:color w:val="1F2937"/>
-                <w:sz w:val="21"/>
+                <w:sz w:val="22"/>
               </w:rPr>
               <w:t/>
             </w:r>
@@ -1171,10 +1200,11 @@
           <w:p>
             <w:r>
               <w:rPr>
+                <w:rFonts w:ascii="Calibri" w:hAnsi="Calibri"/>
                 <w:b/>
                 <w:bCs/>
                 <w:color w:val="1F2937"/>
-                <w:sz w:val="21"/>
+                <w:sz w:val="22"/>
                 <w:szCs w:val="20"/>
               </w:rPr>
               <w:t>Energiebehoefte</w:t>
@@ -1201,9 +1231,10 @@
           <w:p>
             <w:r>
               <w:rPr>
+                <w:rFonts w:ascii="Calibri" w:hAnsi="Calibri"/>
                 <w:b w:val="0"/>
                 <w:color w:val="1F2937"/>
-                <w:sz w:val="21"/>
+                <w:sz w:val="22"/>
               </w:rPr>
               <w:t xml:space="preserve">—</w:t>
             </w:r>
@@ -1231,10 +1262,11 @@
           <w:p>
             <w:r>
               <w:rPr>
+                <w:rFonts w:ascii="Calibri" w:hAnsi="Calibri"/>
                 <w:b/>
                 <w:bCs/>
                 <w:color w:val="1F2937"/>
-                <w:sz w:val="21"/>
+                <w:sz w:val="22"/>
                 <w:szCs w:val="20"/>
               </w:rPr>
               <w:t>Warmtebehoefte</w:t>
@@ -1261,9 +1293,10 @@
           <w:p>
             <w:r>
               <w:rPr>
+                <w:rFonts w:ascii="Calibri" w:hAnsi="Calibri"/>
                 <w:b w:val="0"/>
                 <w:color w:val="1F2937"/>
-                <w:sz w:val="21"/>
+                <w:sz w:val="22"/>
               </w:rPr>
               <w:t xml:space="preserve">—</w:t>
             </w:r>
@@ -1291,10 +1324,11 @@
           <w:p>
             <w:r>
               <w:rPr>
+                <w:rFonts w:ascii="Calibri" w:hAnsi="Calibri"/>
                 <w:b/>
                 <w:bCs/>
                 <w:color w:val="1F2937"/>
-                <w:sz w:val="21"/>
+                <w:sz w:val="22"/>
                 <w:szCs w:val="20"/>
               </w:rPr>
               <w:t>Woningtype</w:t>
@@ -1321,9 +1355,10 @@
           <w:p>
             <w:r>
               <w:rPr>
+                <w:rFonts w:ascii="Calibri" w:hAnsi="Calibri"/>
                 <w:b w:val="0"/>
                 <w:color w:val="1F2937"/>
-                <w:sz w:val="21"/>
+                <w:sz w:val="22"/>
               </w:rPr>
               <w:t xml:space="preserve">—</w:t>
             </w:r>
@@ -1344,7 +1379,6 @@
         <w:rPr>
           <w:i/>
           <w:iCs/>
-          <w:color w:val="5A6A85"/>
         </w:rPr>
         <w:t>Bron: Basisregistratie Adressen en Gebouwen (BAG/PDOK) en landelijke energielabelregistratie EP-Online.</w:t>
       </w:r>
@@ -1360,8 +1394,14 @@
         <w:pBdr>
           <w:bottom w:val="single" w:sz="4" w:space="4" w:color="2E6BE6"/>
         </w:pBdr>
-      </w:pPr>
-      <w:r>
+        <w:rPr>
+          <w:color w:val="5AAA00"/>
+        </w:rPr>
+      </w:pPr>
+      <w:r>
+        <w:rPr>
+          <w:color w:val="5AAA00"/>
+        </w:rPr>
         <w:t>Kenmerken van deze bouwperiode</w:t>
       </w:r>
     </w:p>
@@ -1403,12 +1443,12 @@
           <w:bottom w:val="single" w:sz="4" w:space="4" w:color="2E6BE6"/>
         </w:pBdr>
         <w:rPr>
-          <w:color w:val="2E6BE6"/>
-        </w:rPr>
-      </w:pPr>
-      <w:r>
-        <w:rPr>
-          <w:color w:val="2E6BE6"/>
+          <w:color w:val="5AAA00"/>
+        </w:rPr>
+      </w:pPr>
+      <w:r>
+        <w:rPr>
+          <w:color w:val="5AAA00"/>
         </w:rPr>
         <w:t>Kansen en verbeterpotentieel</w:t>
       </w:r>
@@ -1418,9 +1458,6 @@
         <w:spacing w:before="60" w:after="60"/>
       </w:pPr>
       <w:r>
-        <w:rPr>
-          <w:color w:val="5A6A85"/>
-        </w:rPr>
         <w:t>Een lage score betekent niet dat geen actie mogelijk is, maar dat het rendement ten opzichte van de investering doorgaans beperkter is.</w:t>
       </w:r>
     </w:p>
@@ -1455,7 +1492,7 @@
         <w:tc>
           <w:tcPr>
             <w:tcW w:w="2400" w:type="dxa"/>
-            <w:shd w:val="clear" w:color="auto" w:fill="F4F6FA"/>
+            <w:shd w:val="clear" w:color="auto" w:fill="5AAA00"/>
             <w:tcMar>
               <w:top w:w="80" w:type="dxa"/>
               <w:left w:w="120" w:type="dxa"/>
@@ -1464,11 +1501,16 @@
             </w:tcMar>
           </w:tcPr>
           <w:p>
+            <w:pPr>
+              <w:rPr>
+                <w:color w:val="FFFFFF" w:themeColor="background1"/>
+              </w:rPr>
+            </w:pPr>
             <w:r>
               <w:rPr>
                 <w:b/>
                 <w:bCs/>
-                <w:color w:val="0B1F3A"/>
+                <w:color w:val="FFFFFF" w:themeColor="background1"/>
                 <w:sz w:val="20"/>
                 <w:szCs w:val="20"/>
               </w:rPr>
@@ -1479,7 +1521,7 @@
         <w:tc>
           <w:tcPr>
             <w:tcW w:w="1400" w:type="dxa"/>
-            <w:shd w:val="clear" w:color="auto" w:fill="F4F6FA"/>
+            <w:shd w:val="clear" w:color="auto" w:fill="5AAA00"/>
             <w:tcMar>
               <w:top w:w="80" w:type="dxa"/>
               <w:left w:w="120" w:type="dxa"/>
@@ -1488,11 +1530,16 @@
             </w:tcMar>
           </w:tcPr>
           <w:p>
+            <w:pPr>
+              <w:rPr>
+                <w:color w:val="FFFFFF" w:themeColor="background1"/>
+              </w:rPr>
+            </w:pPr>
             <w:r>
               <w:rPr>
                 <w:b/>
                 <w:bCs/>
-                <w:color w:val="0B1F3A"/>
+                <w:color w:val="FFFFFF" w:themeColor="background1"/>
                 <w:sz w:val="20"/>
                 <w:szCs w:val="20"/>
               </w:rPr>
@@ -1503,7 +1550,7 @@
         <w:tc>
           <w:tcPr>
             <w:tcW w:w="5226" w:type="dxa"/>
-            <w:shd w:val="clear" w:color="auto" w:fill="F4F6FA"/>
+            <w:shd w:val="clear" w:color="auto" w:fill="5AAA00"/>
             <w:tcMar>
               <w:top w:w="80" w:type="dxa"/>
               <w:left w:w="120" w:type="dxa"/>
@@ -1512,11 +1559,16 @@
             </w:tcMar>
           </w:tcPr>
           <w:p>
+            <w:pPr>
+              <w:rPr>
+                <w:color w:val="FFFFFF" w:themeColor="background1"/>
+              </w:rPr>
+            </w:pPr>
             <w:r>
               <w:rPr>
                 <w:b/>
                 <w:bCs/>
-                <w:color w:val="0B1F3A"/>
+                <w:color w:val="FFFFFF" w:themeColor="background1"/>
                 <w:sz w:val="20"/>
                 <w:szCs w:val="20"/>
               </w:rPr>
@@ -1928,6 +1980,294 @@
     </w:tbl>
     <w:p>
       <w:pPr>
+        <w:pStyle w:val="Normal"/>
+        <w:spacing w:before="0" w:after="160"/>
+      </w:pPr>
+      <w:r>
+        <w:rPr>
+          <w:rFonts w:ascii="Calibri" w:hAnsi="Calibri" w:cs="Calibri"/>
+          <w:sz w:val="22"/>
+          <w:szCs w:val="22"/>
+        </w:rPr>
+        <w:t xml:space="preserve"/>
+      </w:r>
+    </w:p>
+    <w:p>
+      <w:pPr>
+        <w:pStyle w:val="Normal"/>
+        <w:spacing w:before="0" w:after="160"/>
+      </w:pPr>
+      <w:r>
+        <w:rPr>
+          <w:b/>
+          <w:rFonts w:ascii="Calibri" w:hAnsi="Calibri" w:cs="Calibri"/>
+          <w:sz w:val="22"/>
+          <w:szCs w:val="22"/>
+          <w:color w:val="5AAA00"/>
+        </w:rPr>
+        <w:t xml:space="preserve">Dak — score 4/5 (Slecht)</w:t>
+      </w:r>
+    </w:p>
+    <w:p>
+      <w:pPr>
+        <w:pStyle w:val="Normal"/>
+        <w:spacing w:before="0" w:after="160"/>
+      </w:pPr>
+      <w:r>
+        <w:rPr>
+          <w:rFonts w:ascii="Calibri" w:hAnsi="Calibri" w:cs="Calibri"/>
+          <w:sz w:val="22"/>
+          <w:szCs w:val="22"/>
+        </w:rPr>
+        <w:t xml:space="preserve">Dakisolatie houdt opstijgende warme lucht binnen de woning vast en is daarmee een van de meest effectieve energiemaatregelen. Een slecht geïsoleerd dak is verantwoordelijk voor een groot deel van het totale warmteverlies. Uw woning lijkt te voldoen aan de standaard waardoor u op dit onderdeel weinig winst kan behalen.</w:t>
+      </w:r>
+    </w:p>
+    <w:p>
+      <w:pPr>
+        <w:pStyle w:val="Normal"/>
+        <w:spacing w:before="0" w:after="160"/>
+      </w:pPr>
+      <w:r>
+        <w:rPr>
+          <w:rFonts w:ascii="Calibri" w:hAnsi="Calibri" w:cs="Calibri"/>
+          <w:sz w:val="22"/>
+          <w:szCs w:val="22"/>
+        </w:rPr>
+        <w:t xml:space="preserve">Uw dak is niet of gering geïsoleerd, maar onvoldoende dik voor de huidige normen. Er is nog aanzienlijk warmteverlies via de kap. Opschalen naar een hogere Rc-waarde verbetert het binnenklimaat op de bovenverdieping en verlaagt de stookkosten.</w:t>
+      </w:r>
+    </w:p>
+    <w:p>
+      <w:pPr>
+        <w:pStyle w:val="Normal"/>
+        <w:spacing w:before="0" w:after="160"/>
+      </w:pPr>
+      <w:r>
+        <w:rPr>
+          <w:rFonts w:ascii="Calibri" w:hAnsi="Calibri" w:cs="Calibri"/>
+          <w:sz w:val="22"/>
+          <w:szCs w:val="22"/>
+        </w:rPr>
+        <w:t xml:space="preserve"/>
+      </w:r>
+    </w:p>
+    <w:p>
+      <w:pPr>
+        <w:pStyle w:val="Normal"/>
+        <w:spacing w:before="0" w:after="160"/>
+      </w:pPr>
+      <w:r>
+        <w:rPr>
+          <w:b/>
+          <w:rFonts w:ascii="Calibri" w:hAnsi="Calibri" w:cs="Calibri"/>
+          <w:sz w:val="22"/>
+          <w:szCs w:val="22"/>
+          <w:color w:val="5AAA00"/>
+        </w:rPr>
+        <w:t xml:space="preserve">Gevel — score 4/5 (Slecht)</w:t>
+      </w:r>
+    </w:p>
+    <w:p>
+      <w:pPr>
+        <w:pStyle w:val="Normal"/>
+        <w:spacing w:before="0" w:after="160"/>
+      </w:pPr>
+      <w:r>
+        <w:rPr>
+          <w:rFonts w:ascii="Calibri" w:hAnsi="Calibri" w:cs="Calibri"/>
+          <w:sz w:val="22"/>
+          <w:szCs w:val="22"/>
+        </w:rPr>
+        <w:t xml:space="preserve">Gevelisolatie brengt een thermische laag aan in de spouw of tegen de muren om warmteverlies te beperken. Zonder isolatie ontsnapt warmte via het metselwerk en koelen binnenmuren af.</w:t>
+      </w:r>
+    </w:p>
+    <w:p>
+      <w:pPr>
+        <w:pStyle w:val="Normal"/>
+        <w:spacing w:before="0" w:after="160"/>
+      </w:pPr>
+      <w:r>
+        <w:rPr>
+          <w:rFonts w:ascii="Calibri" w:hAnsi="Calibri" w:cs="Calibri"/>
+          <w:sz w:val="22"/>
+          <w:szCs w:val="22"/>
+        </w:rPr>
+        <w:t xml:space="preserve">De huidige gevelisolatie is er niet of onvoldoende waardoor de verwarmingsinstallatie harder werkt dan nodig is. Bijzetten naar een hogere Rc-waardezorgt voor minder energieverlies, een lagere warmtevraag en verbetert binnenklimaat.</w:t>
+      </w:r>
+    </w:p>
+    <w:p>
+      <w:pPr>
+        <w:pStyle w:val="Normal"/>
+        <w:spacing w:before="0" w:after="160"/>
+      </w:pPr>
+      <w:r>
+        <w:rPr>
+          <w:rFonts w:ascii="Calibri" w:hAnsi="Calibri" w:cs="Calibri"/>
+          <w:sz w:val="22"/>
+          <w:szCs w:val="22"/>
+        </w:rPr>
+        <w:t xml:space="preserve"/>
+      </w:r>
+    </w:p>
+    <w:p>
+      <w:pPr>
+        <w:pStyle w:val="Normal"/>
+        <w:spacing w:before="0" w:after="160"/>
+      </w:pPr>
+      <w:r>
+        <w:rPr>
+          <w:b/>
+          <w:rFonts w:ascii="Calibri" w:hAnsi="Calibri" w:cs="Calibri"/>
+          <w:sz w:val="22"/>
+          <w:szCs w:val="22"/>
+          <w:color w:val="5AAA00"/>
+        </w:rPr>
+        <w:t xml:space="preserve">Vloer — score 4/5 (Slecht)</w:t>
+      </w:r>
+    </w:p>
+    <w:p>
+      <w:pPr>
+        <w:pStyle w:val="Normal"/>
+        <w:spacing w:before="0" w:after="160"/>
+      </w:pPr>
+      <w:r>
+        <w:rPr>
+          <w:rFonts w:ascii="Calibri" w:hAnsi="Calibri" w:cs="Calibri"/>
+          <w:sz w:val="22"/>
+          <w:szCs w:val="22"/>
+        </w:rPr>
+        <w:t xml:space="preserve">Vloerisolatie vormt een barrière tussen de warme leefruimte en de koude grond of kruipruimte. Het stopt warmteverlies via de onderzijde en gaat optrekkend vocht uit de kruipruimte tegen.Uw woning lijkt goed geïsoleerd waardoor u op dit onderdeel weinig winst kan behalen.</w:t>
+      </w:r>
+    </w:p>
+    <w:p>
+      <w:pPr>
+        <w:pStyle w:val="Normal"/>
+        <w:spacing w:before="0" w:after="160"/>
+      </w:pPr>
+      <w:r>
+        <w:rPr>
+          <w:rFonts w:ascii="Calibri" w:hAnsi="Calibri" w:cs="Calibri"/>
+          <w:sz w:val="22"/>
+          <w:szCs w:val="22"/>
+        </w:rPr>
+        <w:t xml:space="preserve">De huidige vloerisolatie is onvoldoende, waardoor er nog warmteverlies via de onderkant optreedt en de kruipruimte invloed heeft op het binnenklimaat. Vervangen van de isolatie naar een hogere Rc verlaagd het verlies en verhoogt het wooncomfort.</w:t>
+      </w:r>
+    </w:p>
+    <w:p>
+      <w:pPr>
+        <w:pStyle w:val="Normal"/>
+        <w:spacing w:before="0" w:after="160"/>
+      </w:pPr>
+      <w:r>
+        <w:rPr>
+          <w:rFonts w:ascii="Calibri" w:hAnsi="Calibri" w:cs="Calibri"/>
+          <w:sz w:val="22"/>
+          <w:szCs w:val="22"/>
+        </w:rPr>
+        <w:t xml:space="preserve"/>
+      </w:r>
+    </w:p>
+    <w:p>
+      <w:pPr>
+        <w:pStyle w:val="Normal"/>
+        <w:spacing w:before="0" w:after="160"/>
+      </w:pPr>
+      <w:r>
+        <w:rPr>
+          <w:b/>
+          <w:rFonts w:ascii="Calibri" w:hAnsi="Calibri" w:cs="Calibri"/>
+          <w:sz w:val="22"/>
+          <w:szCs w:val="22"/>
+          <w:color w:val="5AAA00"/>
+        </w:rPr>
+        <w:t xml:space="preserve">Glas — score 4/5 (Slecht)</w:t>
+      </w:r>
+    </w:p>
+    <w:p>
+      <w:pPr>
+        <w:pStyle w:val="Normal"/>
+        <w:spacing w:before="0" w:after="160"/>
+      </w:pPr>
+      <w:r>
+        <w:rPr>
+          <w:rFonts w:ascii="Calibri" w:hAnsi="Calibri" w:cs="Calibri"/>
+          <w:sz w:val="22"/>
+          <w:szCs w:val="22"/>
+        </w:rPr>
+        <w:t xml:space="preserve">Isolerend glas vervangt enkel of verouderd dubbel glas door ruiten met een warmtereflecterende coating die warmte binnenhoudt en koudeval bij de ramen voorkomt. Ramen zijn de zwakste plekken in de isolatieschil van een woning.</w:t>
+      </w:r>
+    </w:p>
+    <w:p>
+      <w:pPr>
+        <w:pStyle w:val="Normal"/>
+        <w:spacing w:before="0" w:after="160"/>
+      </w:pPr>
+      <w:r>
+        <w:rPr>
+          <w:rFonts w:ascii="Calibri" w:hAnsi="Calibri" w:cs="Calibri"/>
+          <w:sz w:val="22"/>
+          <w:szCs w:val="22"/>
+        </w:rPr>
+        <w:t xml:space="preserve">Het aanwezige enkel of oud dubbel glas is verouderd of lek en presteert  niet meer als bij aanleg. Vervangen door nieuwe HR++ ruiten verbetert het binnenklimaat direct en elimineert koude luchtstromen langs de ramen.</w:t>
+      </w:r>
+    </w:p>
+    <w:p>
+      <w:pPr>
+        <w:pStyle w:val="Normal"/>
+        <w:spacing w:before="0" w:after="160"/>
+      </w:pPr>
+      <w:r>
+        <w:rPr>
+          <w:rFonts w:ascii="Calibri" w:hAnsi="Calibri" w:cs="Calibri"/>
+          <w:sz w:val="22"/>
+          <w:szCs w:val="22"/>
+        </w:rPr>
+        <w:t xml:space="preserve"/>
+      </w:r>
+    </w:p>
+    <w:p>
+      <w:pPr>
+        <w:pStyle w:val="Normal"/>
+        <w:spacing w:before="0" w:after="160"/>
+      </w:pPr>
+      <w:r>
+        <w:rPr>
+          <w:rFonts w:ascii="Calibri" w:hAnsi="Calibri" w:cs="Calibri"/>
+          <w:sz w:val="22"/>
+          <w:szCs w:val="22"/>
+        </w:rPr>
+        <w:t xml:space="preserve">Heeft u al verbeteringen uitgevoerd of wilt u dit aanpakken en nog een stap verder gaan, dan kunt u zich richten op het optimaliseren van installaties en het verder verlagen van uw energieverbruik.</w:t>
+      </w:r>
+    </w:p>
+    <w:p>
+      <w:pPr>
+        <w:pStyle w:val="Normal"/>
+        <w:spacing w:before="0" w:after="160"/>
+      </w:pPr>
+      <w:r>
+        <w:rPr>
+          <w:rFonts w:ascii="Calibri" w:hAnsi="Calibri" w:cs="Calibri"/>
+          <w:sz w:val="22"/>
+          <w:szCs w:val="22"/>
+        </w:rPr>
+        <w:t xml:space="preserve">Denk aan het toepassen van zonnepanelen, het overstappen naar een (hybride) warmtepomp en het verbeteren van uw verwarmingssysteem. In combinatie met goede ventilatie zorgt dit voor een comfortabel en gezond binnenklimaat. Ook batterijopslag kan interessant zijn om energie tijdelijk op te slaan.</w:t>
+      </w:r>
+    </w:p>
+    <w:p>
+      <w:pPr>
+        <w:pStyle w:val="Normal"/>
+        <w:spacing w:before="0" w:after="160"/>
+      </w:pPr>
+      <w:r>
+        <w:rPr>
+          <w:rFonts w:ascii="Calibri" w:hAnsi="Calibri" w:cs="Calibri"/>
+          <w:sz w:val="22"/>
+          <w:szCs w:val="22"/>
+        </w:rPr>
+        <w:t xml:space="preserve">Door isolatie en installaties slim te combineren, werkt u stap voor stap toe naar een woning die klaar is voor een toekomst met minder of geen aardgas.</w:t>
+      </w:r>
+    </w:p>
+    <w:p>
+      <w:pPr>
         <w:spacing w:before="240"/>
       </w:pPr>
     </w:p>
@@ -1946,34 +2286,317 @@
     </w:p>
     <w:p>
       <w:pPr>
-        <w:spacing w:before="160" w:after="80"/>
-      </w:pPr>
-      <w:r>
         <w:rPr>
           <w:b/>
           <w:bCs/>
           <w:color w:val="2E6BE6"/>
         </w:rPr>
-        <w:t>Mogelijke a</w:t>
-      </w:r>
+      </w:pPr>
       <w:r>
         <w:rPr>
           <w:b/>
           <w:bCs/>
           <w:color w:val="2E6BE6"/>
         </w:rPr>
+        <w:br w:type="page"/>
+      </w:r>
+    </w:p>
+    <w:p>
+      <w:pPr>
+        <w:spacing w:before="160" w:after="80"/>
+        <w:rPr>
+          <w:b/>
+          <w:bCs/>
+          <w:color w:val="5AAA00"/>
+        </w:rPr>
+      </w:pPr>
+      <w:r>
+        <w:rPr>
+          <w:noProof/>
+          <w:color w:val="5AAA00"/>
+        </w:rPr>
+        <w:lastRenderedPageBreak/>
+        <w:drawing>
+          <wp:anchor distT="0" distB="0" distL="114300" distR="114300" simplePos="0" relativeHeight="251658240" behindDoc="0" locked="0" layoutInCell="1" allowOverlap="1" wp14:anchorId="3BE3A933" wp14:editId="47C5FB0D">
+            <wp:simplePos x="0" y="0"/>
+            <wp:positionH relativeFrom="column">
+              <wp:posOffset>3532401</wp:posOffset>
+            </wp:positionH>
+            <wp:positionV relativeFrom="paragraph">
+              <wp:posOffset>517</wp:posOffset>
+            </wp:positionV>
+            <wp:extent cx="1807735" cy="1818167"/>
+            <wp:effectExtent l="0" t="0" r="2540" b="0"/>
+            <wp:wrapSquare wrapText="bothSides"/>
+            <wp:docPr id="704646831" name="Afbeelding 2"/>
+            <wp:cNvGraphicFramePr>
+              <a:graphicFrameLocks xmlns:a="http://schemas.openxmlformats.org/drawingml/2006/main" noChangeAspect="1"/>
+            </wp:cNvGraphicFramePr>
+            <a:graphic xmlns:a="http://schemas.openxmlformats.org/drawingml/2006/main">
+              <a:graphicData uri="http://schemas.openxmlformats.org/drawingml/2006/picture">
+                <pic:pic xmlns:pic="http://schemas.openxmlformats.org/drawingml/2006/picture">
+                  <pic:nvPicPr>
+                    <pic:cNvPr id="704646831" name="Afbeelding 704646831"/>
+                    <pic:cNvPicPr/>
+                  </pic:nvPicPr>
+                  <pic:blipFill rotWithShape="1">
+                    <a:blip r:embed="rId7" cstate="print">
+                      <a:extLst>
+                        <a:ext uri="{28A0092B-C50C-407E-A947-70E740481C1C}">
+                          <a14:useLocalDpi xmlns:a14="http://schemas.microsoft.com/office/drawing/2010/main" val="0"/>
+                        </a:ext>
+                      </a:extLst>
+                    </a:blip>
+                    <a:srcRect l="16187" r="17559"/>
+                    <a:stretch>
+                      <a:fillRect/>
+                    </a:stretch>
+                  </pic:blipFill>
+                  <pic:spPr bwMode="auto">
+                    <a:xfrm>
+                      <a:off x="0" y="0"/>
+                      <a:ext cx="1807735" cy="1818167"/>
+                    </a:xfrm>
+                    <a:prstGeom prst="rect">
+                      <a:avLst/>
+                    </a:prstGeom>
+                    <a:ln>
+                      <a:noFill/>
+                    </a:ln>
+                    <a:extLst>
+                      <a:ext uri="{53640926-AAD7-44D8-BBD7-CCE9431645EC}">
+                        <a14:shadowObscured xmlns:a14="http://schemas.microsoft.com/office/drawing/2010/main"/>
+                      </a:ext>
+                    </a:extLst>
+                  </pic:spPr>
+                </pic:pic>
+              </a:graphicData>
+            </a:graphic>
+            <wp14:sizeRelH relativeFrom="margin">
+              <wp14:pctWidth>0</wp14:pctWidth>
+            </wp14:sizeRelH>
+            <wp14:sizeRelV relativeFrom="margin">
+              <wp14:pctHeight>0</wp14:pctHeight>
+            </wp14:sizeRelV>
+          </wp:anchor>
+        </w:drawing>
+      </w:r>
+      <w:r>
+        <w:rPr>
+          <w:b/>
+          <w:bCs/>
+          <w:color w:val="5AAA00"/>
+        </w:rPr>
+        <w:t>Mogelijke a</w:t>
+      </w:r>
+      <w:r>
+        <w:rPr>
+          <w:b/>
+          <w:bCs/>
+          <w:color w:val="5AAA00"/>
+        </w:rPr>
         <w:t>anpak</w:t>
       </w:r>
     </w:p>
     <w:p>
       <w:pPr>
+        <w:spacing w:before="160" w:after="80"/>
+      </w:pPr>
+      <w:r>
+        <w:t>Een logische aanpak volgt de isola</w:t>
+      </w:r>
+      <w:r>
+        <w:t>tietrias:</w:t>
+      </w:r>
+    </w:p>
+    <w:p>
+      <w:pPr>
+        <w:pStyle w:val="Lijstalinea"/>
+        <w:numPr>
+          <w:ilvl w:val="0"/>
+          <w:numId w:val="4"/>
+        </w:numPr>
+        <w:spacing w:before="160" w:after="80"/>
+      </w:pPr>
+      <w:r>
+        <w:t>Beperk warmteverlies door te isoleren;</w:t>
+      </w:r>
+    </w:p>
+    <w:p>
+      <w:pPr>
+        <w:pStyle w:val="Lijstalinea"/>
+        <w:numPr>
+          <w:ilvl w:val="0"/>
+          <w:numId w:val="4"/>
+        </w:numPr>
+        <w:spacing w:before="160" w:after="80"/>
+      </w:pPr>
+      <w:r>
+        <w:t>Optimaliseer het afgiftesysteem</w:t>
+      </w:r>
+      <w:r>
+        <w:t>;</w:t>
+      </w:r>
+    </w:p>
+    <w:p>
+      <w:pPr>
+        <w:pStyle w:val="Lijstalinea"/>
+        <w:numPr>
+          <w:ilvl w:val="0"/>
+          <w:numId w:val="4"/>
+        </w:numPr>
+        <w:spacing w:before="160" w:after="80"/>
+      </w:pPr>
+      <w:r>
+        <w:t>Verduurzaam de opwek door bijvoorbeeld een warmtepomp of zonnepanelen</w:t>
+      </w:r>
+      <w:r>
+        <w:t>;</w:t>
+      </w:r>
+    </w:p>
+    <w:p>
+      <w:pPr>
+        <w:spacing w:before="160" w:after="80"/>
+      </w:pPr>
+    </w:p>
+    <w:p>
+      <w:pPr>
+        <w:spacing w:before="160" w:after="80"/>
+      </w:pPr>
+      <w:r>
+        <w:rPr>
+          <w:noProof/>
+        </w:rPr>
+        <w:drawing>
+          <wp:anchor distT="0" distB="0" distL="114300" distR="114300" simplePos="0" relativeHeight="251659264" behindDoc="0" locked="0" layoutInCell="1" allowOverlap="1" wp14:anchorId="28DDBF24" wp14:editId="4190CC40">
+            <wp:simplePos x="0" y="0"/>
+            <wp:positionH relativeFrom="column">
+              <wp:posOffset>1703705</wp:posOffset>
+            </wp:positionH>
+            <wp:positionV relativeFrom="paragraph">
+              <wp:posOffset>271706</wp:posOffset>
+            </wp:positionV>
+            <wp:extent cx="2891790" cy="2397760"/>
+            <wp:effectExtent l="0" t="0" r="3810" b="2540"/>
+            <wp:wrapSquare wrapText="bothSides"/>
+            <wp:docPr id="638879154" name="Afbeelding 1"/>
+            <wp:cNvGraphicFramePr>
+              <a:graphicFrameLocks xmlns:a="http://schemas.openxmlformats.org/drawingml/2006/main" noChangeAspect="1"/>
+            </wp:cNvGraphicFramePr>
+            <a:graphic xmlns:a="http://schemas.openxmlformats.org/drawingml/2006/main">
+              <a:graphicData uri="http://schemas.openxmlformats.org/drawingml/2006/picture">
+                <pic:pic xmlns:pic="http://schemas.openxmlformats.org/drawingml/2006/picture">
+                  <pic:nvPicPr>
+                    <pic:cNvPr id="638879154" name="Afbeelding 638879154"/>
+                    <pic:cNvPicPr/>
+                  </pic:nvPicPr>
+                  <pic:blipFill rotWithShape="1">
+                    <a:blip r:embed="rId8" cstate="print">
+                      <a:extLst>
+                        <a:ext uri="{28A0092B-C50C-407E-A947-70E740481C1C}">
+                          <a14:useLocalDpi xmlns:a14="http://schemas.microsoft.com/office/drawing/2010/main" val="0"/>
+                        </a:ext>
+                      </a:extLst>
+                    </a:blip>
+                    <a:srcRect l="19600"/>
+                    <a:stretch>
+                      <a:fillRect/>
+                    </a:stretch>
+                  </pic:blipFill>
+                  <pic:spPr bwMode="auto">
+                    <a:xfrm>
+                      <a:off x="0" y="0"/>
+                      <a:ext cx="2891790" cy="2397760"/>
+                    </a:xfrm>
+                    <a:prstGeom prst="rect">
+                      <a:avLst/>
+                    </a:prstGeom>
+                    <a:ln>
+                      <a:noFill/>
+                    </a:ln>
+                    <a:extLst>
+                      <a:ext uri="{53640926-AAD7-44D8-BBD7-CCE9431645EC}">
+                        <a14:shadowObscured xmlns:a14="http://schemas.microsoft.com/office/drawing/2010/main"/>
+                      </a:ext>
+                    </a:extLst>
+                  </pic:spPr>
+                </pic:pic>
+              </a:graphicData>
+            </a:graphic>
+            <wp14:sizeRelH relativeFrom="margin">
+              <wp14:pctWidth>0</wp14:pctWidth>
+            </wp14:sizeRelH>
+            <wp14:sizeRelV relativeFrom="margin">
+              <wp14:pctHeight>0</wp14:pctHeight>
+            </wp14:sizeRelV>
+          </wp:anchor>
+        </w:drawing>
+      </w:r>
+    </w:p>
+    <w:p>
+      <w:pPr>
+        <w:spacing w:before="160" w:after="80"/>
+      </w:pPr>
+    </w:p>
+    <w:p>
+      <w:pPr>
+        <w:spacing w:before="160" w:after="80"/>
+      </w:pPr>
+    </w:p>
+    <w:p>
+      <w:pPr>
+        <w:spacing w:before="160" w:after="80"/>
+      </w:pPr>
+    </w:p>
+    <w:p>
+      <w:pPr>
+        <w:spacing w:before="160" w:after="80"/>
+      </w:pPr>
+    </w:p>
+    <w:p>
+      <w:pPr>
+        <w:spacing w:before="160" w:after="80"/>
+      </w:pPr>
+    </w:p>
+    <w:p>
+      <w:pPr>
+        <w:spacing w:before="160" w:after="80"/>
+      </w:pPr>
+    </w:p>
+    <w:p>
+      <w:pPr>
+        <w:spacing w:before="160" w:after="80"/>
+      </w:pPr>
+    </w:p>
+    <w:p>
+      <w:pPr>
+        <w:spacing w:before="160" w:after="80"/>
+      </w:pPr>
+    </w:p>
+    <w:p>
+      <w:pPr>
+        <w:spacing w:before="160" w:after="80"/>
+      </w:pPr>
+    </w:p>
+    <w:p>
+      <w:pPr>
+        <w:spacing w:before="160" w:after="80"/>
+      </w:pPr>
+    </w:p>
+    <w:p>
+      <w:pPr>
+        <w:spacing w:before="160" w:after="80"/>
+      </w:pPr>
+    </w:p>
+    <w:p>
+      <w:pPr>
         <w:spacing w:before="60" w:after="160"/>
       </w:pPr>
       <w:r>
         <w:rPr>
           <w:color w:val="1A2340"/>
         </w:rPr>
-        <w:t xml:space="preserve">Een logische aanpak volgt de isolatietrias: (1) beperk warmteverlies via de schil, (2) optimaliseer het afgiftesysteem, (3) verduurzaam de opwek (warmtepomp of zonnepanelen).</w:t>
+        <w:t xml:space="preserve">Aanbevolen maatregelen voor deze bouwperiode:</w:t>
       </w:r>
       <w:proofErr w:type="spellStart"/>
       <w:r>
@@ -1992,6 +2615,61 @@
     </w:p>
     <w:p>
       <w:pPr>
+        <w:spacing w:before="60" w:after="160"/>
+      </w:pPr>
+      <w:r>
+        <w:rPr>
+          <w:color w:val="1A2340"/>
+        </w:rPr>
+        <w:t xml:space="preserve">- Gevel: isoleer de binnenzijde of buitenzijde bij massieve muren, of na-isoleer de spouw indien deze aanwezig en schoon is.</w:t>
+      </w:r>
+    </w:p>
+    <w:p>
+      <w:pPr>
+        <w:spacing w:before="60" w:after="160"/>
+      </w:pPr>
+      <w:r>
+        <w:rPr>
+          <w:color w:val="1A2340"/>
+        </w:rPr>
+        <w:t xml:space="preserve">- Dak: breng volledige isolatie aan, aangezien de oorspronkelijke waarde nagenoeg nul is.</w:t>
+      </w:r>
+    </w:p>
+    <w:p>
+      <w:pPr>
+        <w:spacing w:before="60" w:after="160"/>
+      </w:pPr>
+      <w:r>
+        <w:rPr>
+          <w:color w:val="1A2340"/>
+        </w:rPr>
+        <w:t xml:space="preserve">- Vloer: isoleer de houten vloer of de bodem van de kruipruimte om optrekkend vocht en kou tegen te gaan.</w:t>
+      </w:r>
+    </w:p>
+    <w:p>
+      <w:pPr>
+        <w:spacing w:before="60" w:after="160"/>
+      </w:pPr>
+      <w:r>
+        <w:rPr>
+          <w:color w:val="1A2340"/>
+        </w:rPr>
+        <w:t xml:space="preserve">- Ramen: vervang enkel glas door HR++ of vacuümglas.</w:t>
+      </w:r>
+    </w:p>
+    <w:p>
+      <w:pPr>
+        <w:spacing w:before="60" w:after="160"/>
+      </w:pPr>
+      <w:r>
+        <w:rPr>
+          <w:color w:val="1A2340"/>
+        </w:rPr>
+        <w:t xml:space="preserve">- Ventilatie: breng gecontroleerde ventilatie aan (zoals decentrale WTW) om de verhoogde luchtvochtigheid na kierdichting te beheersen.</w:t>
+      </w:r>
+    </w:p>
+    <w:p>
+      <w:pPr>
         <w:spacing w:before="120" w:after="120"/>
       </w:pPr>
     </w:p>
@@ -2003,8 +2681,13 @@
         <w:rPr>
           <w:color w:val="1A2340"/>
         </w:rPr>
-        <w:t xml:space="preserve">Aanbevolen maatregelen voor deze bouwperiode:</w:t>
-      </w:r>
+        <w:t xml:space="preserve">Laat een schil-scan uitvoeren om te bepalen welke isolatiemaatregel het meest rendabel is voor uw specifieke situatie.</w:t>
+      </w:r>
+    </w:p>
+    <w:p>
+      <w:pPr>
+        <w:spacing w:before="120" w:after="120"/>
+      </w:pPr>
     </w:p>
     <w:p>
       <w:pPr>
@@ -2014,83 +2697,7 @@
         <w:rPr>
           <w:color w:val="1A2340"/>
         </w:rPr>
-        <w:t xml:space="preserve">- Gevel: isoleer de binnenzijde of buitenzijde bij massieve muren, of na-isoleer de spouw indien deze aanwezig en schoon is.</w:t>
-      </w:r>
-    </w:p>
-    <w:p>
-      <w:pPr>
-        <w:spacing w:before="60" w:after="160"/>
-      </w:pPr>
-      <w:r>
-        <w:rPr>
-          <w:color w:val="1A2340"/>
-        </w:rPr>
-        <w:t xml:space="preserve">- Dak: breng volledige isolatie aan, aangezien de oorspronkelijke waarde nagenoeg nul is.</w:t>
-      </w:r>
-    </w:p>
-    <w:p>
-      <w:pPr>
-        <w:spacing w:before="60" w:after="160"/>
-      </w:pPr>
-      <w:r>
-        <w:rPr>
-          <w:color w:val="1A2340"/>
-        </w:rPr>
-        <w:t xml:space="preserve">- Vloer: isoleer de houten vloer of de bodem van de kruipruimte om optrekkend vocht en kou tegen te gaan.</w:t>
-      </w:r>
-    </w:p>
-    <w:p>
-      <w:pPr>
-        <w:spacing w:before="60" w:after="160"/>
-      </w:pPr>
-      <w:r>
-        <w:rPr>
-          <w:color w:val="1A2340"/>
-        </w:rPr>
-        <w:t xml:space="preserve">- Ramen: vervang enkel glas door HR++ of vacuümglas.</w:t>
-      </w:r>
-    </w:p>
-    <w:p>
-      <w:pPr>
-        <w:spacing w:before="60" w:after="160"/>
-      </w:pPr>
-      <w:r>
-        <w:rPr>
-          <w:color w:val="1A2340"/>
-        </w:rPr>
-        <w:t xml:space="preserve">- Ventilatie: breng gecontroleerde ventilatie aan (zoals decentrale WTW) om de verhoogde luchtvochtigheid na kierdichting te beheersen.</w:t>
-      </w:r>
-    </w:p>
-    <w:p>
-      <w:pPr>
-        <w:spacing w:before="120" w:after="120"/>
-      </w:pPr>
-    </w:p>
-    <w:p>
-      <w:pPr>
-        <w:spacing w:before="60" w:after="160"/>
-      </w:pPr>
-      <w:r>
-        <w:rPr>
-          <w:color w:val="1A2340"/>
-        </w:rPr>
-        <w:t xml:space="preserve">Laat een schil-scan uitvoeren om te bepalen welke isolatiemaatregel het meest rendabel is voor uw specifieke situatie.</w:t>
-      </w:r>
-    </w:p>
-    <w:p>
-      <w:pPr>
-        <w:spacing w:before="120" w:after="120"/>
-      </w:pPr>
-    </w:p>
-    <w:p>
-      <w:pPr>
-        <w:spacing w:before="60" w:after="160"/>
-      </w:pPr>
-      <w:r>
-        <w:rPr>
-          <w:color w:val="1A2340"/>
-        </w:rPr>
-        <w:t xml:space="preserve">De bovenstaande aanbevelingen zijn indicatief op basis van registratiedata. Bevestiging via foto-inspectie of een maatwerkadvies is altijd aan te raden.</w:t>
+        <w:t xml:space="preserve">De bovenstaande aanbevelingen zijn indicatief op basis van registratiedata. Maatwerkadvies door erkende bedrijven is altijd aan te raden.</w:t>
       </w:r>
     </w:p>
     <w:p>
@@ -2108,12 +2715,12 @@
           <w:bottom w:val="single" w:sz="4" w:space="4" w:color="2E6BE6"/>
         </w:pBdr>
         <w:rPr>
-          <w:color w:val="2E6BE6"/>
-        </w:rPr>
-      </w:pPr>
-      <w:r>
-        <w:rPr>
-          <w:color w:val="2E6BE6"/>
+          <w:color w:val="5AAA00"/>
+        </w:rPr>
+      </w:pPr>
+      <w:r>
+        <w:rPr>
+          <w:color w:val="5AAA00"/>
         </w:rPr>
         <w:lastRenderedPageBreak/>
         <w:t>Aandachtspunten en risico’s</w:t>
@@ -2127,7 +2734,7 @@
         <w:rPr>
           <w:color w:val="1A2340"/>
         </w:rPr>
-        <w:t xml:space="preserve">- Vocht en houtrot: deze woningen zijn often 'dampopen' gebouwd zonder spouw of met een zeer smalle spouw. Bij binnenisolatie daalt de temperatuur van de oorspronkelijke muur sterk, met condensatierisico als gevolg. Gebruik vochtregulerende folies (zoals Intello) en dampopen materialen zoals houtvezel of vlas — vermijd volledig dampdichte plastics.</w:t>
+        <w:t xml:space="preserve">- Vocht en houtrot: deze woningen zijn vaak 'dampopen' gebouwd zonder spouw of met een zeer smalle spouw. Bij binnenisolatie daalt de temperatuur van de oorspronkelijke muur sterk, met condensatierisico als gevolg. Gebruik vochtregulerende folies (zoals Intello) en dampopen materialen zoals houtvezel of vlas — vermijd volledig dampdichte plastics.</w:t>
       </w:r>
       <w:proofErr w:type="spellStart"/>
       <w:r>
@@ -2208,42 +2815,46 @@
           <w:bottom w:val="single" w:sz="4" w:space="4" w:color="2E6BE6"/>
         </w:pBdr>
         <w:rPr>
-          <w:color w:val="2E6BE6"/>
-        </w:rPr>
-      </w:pPr>
-      <w:r>
-        <w:rPr>
-          <w:color w:val="2E6BE6"/>
+          <w:color w:val="5AAA00"/>
+        </w:rPr>
+      </w:pPr>
+      <w:r>
+        <w:rPr>
+          <w:color w:val="5AAA00"/>
         </w:rPr>
         <w:t>Mogelijk relevante subsidies</w:t>
       </w:r>
     </w:p>
     <w:tbl>
       <w:tblPr>
-        <w:tblW w:type="auto" w:w="0"/>
+        <w:tblW w:w="9026" w:type="dxa"/>
         <w:tblLook w:firstColumn="1" w:firstRow="1" w:lastColumn="0" w:lastRow="0" w:noHBand="0" w:noVBand="1" w:val="04A0"/>
       </w:tblPr>
       <w:tblGrid>
-        <w:gridCol w:w="1928"/>
-        <w:gridCol w:w="1928"/>
-        <w:gridCol w:w="1928"/>
-        <w:gridCol w:w="1928"/>
-        <w:gridCol w:w="1928"/>
+        <w:gridCol w:w="3200"/>
+        <w:gridCol w:w="1456"/>
+        <w:gridCol w:w="1457"/>
+        <w:gridCol w:w="1457"/>
+        <w:gridCol w:w="1456"/>
       </w:tblGrid>
       <w:tr>
-        <w:tc>
-          <w:tcPr>
-            <w:tcW w:type="dxa" w:w="1928"/>
-            <w:shd w:val="clear" w:color="auto" w:fill="2F6FA3"/>
-          </w:tcPr>
-          <w:p>
-            <w:r/>
-            <w:r>
-              <w:rPr>
+        <w:trPr>
+          <w:trHeight w:val="400" w:hRule="atLeast"/>
+        </w:trPr>
+        <w:tc>
+          <w:tcPr>
+            <w:tcW w:w="3200" w:type="dxa"/>
+            <w:shd w:val="clear" w:color="auto" w:fill="5AAA00"/>
+          </w:tcPr>
+          <w:p>
+            <w:r/>
+            <w:r>
+              <w:rPr>
+                <w:rFonts w:ascii="Calibri" w:hAnsi="Calibri"/>
                 <w:b/>
                 <w:i w:val="0"/>
                 <w:color w:val="FFFFFF"/>
-                <w:sz w:val="18"/>
+                <w:sz w:val="22"/>
               </w:rPr>
               <w:t>Maatregel</w:t>
             </w:r>
@@ -2251,17 +2862,18 @@
         </w:tc>
         <w:tc>
           <w:tcPr>
-            <w:tcW w:type="dxa" w:w="1928"/>
-            <w:shd w:val="clear" w:color="auto" w:fill="2F6FA3"/>
-          </w:tcPr>
-          <w:p>
-            <w:r/>
-            <w:r>
-              <w:rPr>
+            <w:tcW w:w="1456" w:type="dxa"/>
+            <w:shd w:val="clear" w:color="auto" w:fill="5AAA00"/>
+          </w:tcPr>
+          <w:p>
+            <w:r/>
+            <w:r>
+              <w:rPr>
+                <w:rFonts w:ascii="Calibri" w:hAnsi="Calibri"/>
                 <w:b/>
                 <w:i w:val="0"/>
                 <w:color w:val="FFFFFF"/>
-                <w:sz w:val="18"/>
+                <w:sz w:val="22"/>
               </w:rPr>
               <w:t>Enkelvoudig</w:t>
             </w:r>
@@ -2269,17 +2881,18 @@
         </w:tc>
         <w:tc>
           <w:tcPr>
-            <w:tcW w:type="dxa" w:w="1928"/>
-            <w:shd w:val="clear" w:color="auto" w:fill="2F6FA3"/>
-          </w:tcPr>
-          <w:p>
-            <w:r/>
-            <w:r>
-              <w:rPr>
+            <w:tcW w:w="1457" w:type="dxa"/>
+            <w:shd w:val="clear" w:color="auto" w:fill="5AAA00"/>
+          </w:tcPr>
+          <w:p>
+            <w:r/>
+            <w:r>
+              <w:rPr>
+                <w:rFonts w:ascii="Calibri" w:hAnsi="Calibri"/>
                 <w:b/>
                 <w:i w:val="0"/>
                 <w:color w:val="FFFFFF"/>
-                <w:sz w:val="18"/>
+                <w:sz w:val="22"/>
               </w:rPr>
               <w:t>Meervoudig</w:t>
             </w:r>
@@ -2287,17 +2900,18 @@
         </w:tc>
         <w:tc>
           <w:tcPr>
-            <w:tcW w:type="dxa" w:w="1928"/>
-            <w:shd w:val="clear" w:color="auto" w:fill="2F6FA3"/>
-          </w:tcPr>
-          <w:p>
-            <w:r/>
-            <w:r>
-              <w:rPr>
+            <w:tcW w:w="1457" w:type="dxa"/>
+            <w:shd w:val="clear" w:color="auto" w:fill="5AAA00"/>
+          </w:tcPr>
+          <w:p>
+            <w:r/>
+            <w:r>
+              <w:rPr>
+                <w:rFonts w:ascii="Calibri" w:hAnsi="Calibri"/>
                 <w:b/>
                 <w:i w:val="0"/>
                 <w:color w:val="FFFFFF"/>
-                <w:sz w:val="18"/>
+                <w:sz w:val="22"/>
               </w:rPr>
               <w:t>Biobased bonus</w:t>
             </w:r>
@@ -2305,17 +2919,18 @@
         </w:tc>
         <w:tc>
           <w:tcPr>
-            <w:tcW w:type="dxa" w:w="1928"/>
-            <w:shd w:val="clear" w:color="auto" w:fill="2F6FA3"/>
-          </w:tcPr>
-          <w:p>
-            <w:r/>
-            <w:r>
-              <w:rPr>
+            <w:tcW w:w="1456" w:type="dxa"/>
+            <w:shd w:val="clear" w:color="auto" w:fill="5AAA00"/>
+          </w:tcPr>
+          <w:p>
+            <w:r/>
+            <w:r>
+              <w:rPr>
+                <w:rFonts w:ascii="Calibri" w:hAnsi="Calibri"/>
                 <w:b/>
                 <w:i w:val="0"/>
                 <w:color w:val="FFFFFF"/>
-                <w:sz w:val="18"/>
+                <w:sz w:val="22"/>
               </w:rPr>
               <w:t>Min. Rc/Rd</w:t>
             </w:r>
@@ -2323,19 +2938,23 @@
         </w:tc>
       </w:tr>
       <w:tr>
-        <w:tc>
-          <w:tcPr>
-            <w:tcW w:type="dxa" w:w="1928"/>
-            <w:shd w:val="clear" w:color="auto" w:fill="FFFFFF"/>
-          </w:tcPr>
-          <w:p>
-            <w:r/>
-            <w:r>
-              <w:rPr>
+        <w:trPr>
+          <w:trHeight w:val="400" w:hRule="atLeast"/>
+        </w:trPr>
+        <w:tc>
+          <w:tcPr>
+            <w:tcW w:type="dxa" w:w="3200"/>
+            <w:shd w:val="clear" w:color="auto" w:fill="FFFFFF"/>
+          </w:tcPr>
+          <w:p>
+            <w:r/>
+            <w:r>
+              <w:rPr>
+                <w:rFonts w:ascii="Calibri" w:hAnsi="Calibri"/>
                 <w:b/>
                 <w:i w:val="0"/>
                 <w:color w:val="1D1D1B"/>
-                <w:sz w:val="18"/>
+                <w:sz w:val="22"/>
               </w:rPr>
               <w:t>Gevelisolatie (binnen/buiten)</w:t>
             </w:r>
@@ -2343,17 +2962,18 @@
         </w:tc>
         <w:tc>
           <w:tcPr>
-            <w:tcW w:type="dxa" w:w="1928"/>
-            <w:shd w:val="clear" w:color="auto" w:fill="FFFFFF"/>
-          </w:tcPr>
-          <w:p>
-            <w:r/>
-            <w:r>
-              <w:rPr>
+            <w:tcW w:type="dxa" w:w="1456"/>
+            <w:shd w:val="clear" w:color="auto" w:fill="FFFFFF"/>
+          </w:tcPr>
+          <w:p>
+            <w:r/>
+            <w:r>
+              <w:rPr>
+                <w:rFonts w:ascii="Calibri" w:hAnsi="Calibri"/>
                 <w:b w:val="0"/>
                 <w:i w:val="0"/>
                 <w:color w:val="1D1D1B"/>
-                <w:sz w:val="18"/>
+                <w:sz w:val="22"/>
               </w:rPr>
               <w:t>€ 10.13/m²</w:t>
             </w:r>
@@ -2361,17 +2981,18 @@
         </w:tc>
         <w:tc>
           <w:tcPr>
-            <w:tcW w:type="dxa" w:w="1928"/>
-            <w:shd w:val="clear" w:color="auto" w:fill="FFFFFF"/>
-          </w:tcPr>
-          <w:p>
-            <w:r/>
-            <w:r>
-              <w:rPr>
+            <w:tcW w:type="dxa" w:w="1457"/>
+            <w:shd w:val="clear" w:color="auto" w:fill="FFFFFF"/>
+          </w:tcPr>
+          <w:p>
+            <w:r/>
+            <w:r>
+              <w:rPr>
+                <w:rFonts w:ascii="Calibri" w:hAnsi="Calibri"/>
                 <w:b/>
                 <w:i w:val="0"/>
                 <w:color w:val="1D1D1B"/>
-                <w:sz w:val="18"/>
+                <w:sz w:val="22"/>
               </w:rPr>
               <w:t>€ 20.25/m²</w:t>
             </w:r>
@@ -2379,17 +3000,18 @@
         </w:tc>
         <w:tc>
           <w:tcPr>
-            <w:tcW w:type="dxa" w:w="1928"/>
-            <w:shd w:val="clear" w:color="auto" w:fill="FFFFFF"/>
-          </w:tcPr>
-          <w:p>
-            <w:r/>
-            <w:r>
-              <w:rPr>
+            <w:tcW w:type="dxa" w:w="1457"/>
+            <w:shd w:val="clear" w:color="auto" w:fill="FFFFFF"/>
+          </w:tcPr>
+          <w:p>
+            <w:r/>
+            <w:r>
+              <w:rPr>
+                <w:rFonts w:ascii="Calibri" w:hAnsi="Calibri"/>
                 <w:b w:val="0"/>
                 <w:i w:val="0"/>
                 <w:color w:val="1D1D1B"/>
-                <w:sz w:val="18"/>
+                <w:sz w:val="22"/>
               </w:rPr>
               <w:t>+ € 6.00/m²</w:t>
             </w:r>
@@ -2397,17 +3019,18 @@
         </w:tc>
         <w:tc>
           <w:tcPr>
-            <w:tcW w:type="dxa" w:w="1928"/>
-            <w:shd w:val="clear" w:color="auto" w:fill="FFFFFF"/>
-          </w:tcPr>
-          <w:p>
-            <w:r/>
-            <w:r>
-              <w:rPr>
+            <w:tcW w:type="dxa" w:w="1456"/>
+            <w:shd w:val="clear" w:color="auto" w:fill="FFFFFF"/>
+          </w:tcPr>
+          <w:p>
+            <w:r/>
+            <w:r>
+              <w:rPr>
+                <w:rFonts w:ascii="Calibri" w:hAnsi="Calibri"/>
                 <w:b w:val="0"/>
                 <w:i w:val="0"/>
                 <w:color w:val="1D1D1B"/>
-                <w:sz w:val="18"/>
+                <w:sz w:val="22"/>
               </w:rPr>
               <w:t>Rc ≥ 3,5 / Rd ≥ 2,5 m²K/W</w:t>
             </w:r>
@@ -2415,19 +3038,23 @@
         </w:tc>
       </w:tr>
       <w:tr>
-        <w:tc>
-          <w:tcPr>
-            <w:tcW w:type="dxa" w:w="1928"/>
-            <w:shd w:val="clear" w:color="auto" w:fill="FFFFFF"/>
-          </w:tcPr>
-          <w:p>
-            <w:r/>
-            <w:r>
-              <w:rPr>
+        <w:trPr>
+          <w:trHeight w:val="400" w:hRule="atLeast"/>
+        </w:trPr>
+        <w:tc>
+          <w:tcPr>
+            <w:tcW w:type="dxa" w:w="3200"/>
+            <w:shd w:val="clear" w:color="auto" w:fill="FFFFFF"/>
+          </w:tcPr>
+          <w:p>
+            <w:r/>
+            <w:r>
+              <w:rPr>
+                <w:rFonts w:ascii="Calibri" w:hAnsi="Calibri"/>
                 <w:b/>
                 <w:i w:val="0"/>
                 <w:color w:val="1D1D1B"/>
-                <w:sz w:val="18"/>
+                <w:sz w:val="22"/>
               </w:rPr>
               <w:t>Dakisolatie</w:t>
             </w:r>
@@ -2435,17 +3062,18 @@
         </w:tc>
         <w:tc>
           <w:tcPr>
-            <w:tcW w:type="dxa" w:w="1928"/>
-            <w:shd w:val="clear" w:color="auto" w:fill="FFFFFF"/>
-          </w:tcPr>
-          <w:p>
-            <w:r/>
-            <w:r>
-              <w:rPr>
+            <w:tcW w:type="dxa" w:w="1456"/>
+            <w:shd w:val="clear" w:color="auto" w:fill="FFFFFF"/>
+          </w:tcPr>
+          <w:p>
+            <w:r/>
+            <w:r>
+              <w:rPr>
+                <w:rFonts w:ascii="Calibri" w:hAnsi="Calibri"/>
                 <w:b w:val="0"/>
                 <w:i w:val="0"/>
                 <w:color w:val="1D1D1B"/>
-                <w:sz w:val="18"/>
+                <w:sz w:val="22"/>
               </w:rPr>
               <w:t>€ 8.13/m²</w:t>
             </w:r>
@@ -2453,17 +3081,18 @@
         </w:tc>
         <w:tc>
           <w:tcPr>
-            <w:tcW w:type="dxa" w:w="1928"/>
-            <w:shd w:val="clear" w:color="auto" w:fill="FFFFFF"/>
-          </w:tcPr>
-          <w:p>
-            <w:r/>
-            <w:r>
-              <w:rPr>
+            <w:tcW w:type="dxa" w:w="1457"/>
+            <w:shd w:val="clear" w:color="auto" w:fill="FFFFFF"/>
+          </w:tcPr>
+          <w:p>
+            <w:r/>
+            <w:r>
+              <w:rPr>
+                <w:rFonts w:ascii="Calibri" w:hAnsi="Calibri"/>
                 <w:b/>
                 <w:i w:val="0"/>
                 <w:color w:val="1D1D1B"/>
-                <w:sz w:val="18"/>
+                <w:sz w:val="22"/>
               </w:rPr>
               <w:t>€ 16.25/m²</w:t>
             </w:r>
@@ -2471,17 +3100,18 @@
         </w:tc>
         <w:tc>
           <w:tcPr>
-            <w:tcW w:type="dxa" w:w="1928"/>
-            <w:shd w:val="clear" w:color="auto" w:fill="FFFFFF"/>
-          </w:tcPr>
-          <w:p>
-            <w:r/>
-            <w:r>
-              <w:rPr>
+            <w:tcW w:type="dxa" w:w="1457"/>
+            <w:shd w:val="clear" w:color="auto" w:fill="FFFFFF"/>
+          </w:tcPr>
+          <w:p>
+            <w:r/>
+            <w:r>
+              <w:rPr>
+                <w:rFonts w:ascii="Calibri" w:hAnsi="Calibri"/>
                 <w:b w:val="0"/>
                 <w:i w:val="0"/>
                 <w:color w:val="1D1D1B"/>
-                <w:sz w:val="18"/>
+                <w:sz w:val="22"/>
               </w:rPr>
               <w:t>+ € 5.00/m²</w:t>
             </w:r>
@@ -2489,17 +3119,18 @@
         </w:tc>
         <w:tc>
           <w:tcPr>
-            <w:tcW w:type="dxa" w:w="1928"/>
-            <w:shd w:val="clear" w:color="auto" w:fill="FFFFFF"/>
-          </w:tcPr>
-          <w:p>
-            <w:r/>
-            <w:r>
-              <w:rPr>
+            <w:tcW w:type="dxa" w:w="1456"/>
+            <w:shd w:val="clear" w:color="auto" w:fill="FFFFFF"/>
+          </w:tcPr>
+          <w:p>
+            <w:r/>
+            <w:r>
+              <w:rPr>
+                <w:rFonts w:ascii="Calibri" w:hAnsi="Calibri"/>
                 <w:b w:val="0"/>
                 <w:i w:val="0"/>
                 <w:color w:val="1D1D1B"/>
-                <w:sz w:val="18"/>
+                <w:sz w:val="22"/>
               </w:rPr>
               <w:t>Rc ≥ 3,5 m²K/W</w:t>
             </w:r>
@@ -2507,19 +3138,23 @@
         </w:tc>
       </w:tr>
       <w:tr>
-        <w:tc>
-          <w:tcPr>
-            <w:tcW w:type="dxa" w:w="1928"/>
-            <w:shd w:val="clear" w:color="auto" w:fill="FFFFFF"/>
-          </w:tcPr>
-          <w:p>
-            <w:r/>
-            <w:r>
-              <w:rPr>
+        <w:trPr>
+          <w:trHeight w:val="400" w:hRule="atLeast"/>
+        </w:trPr>
+        <w:tc>
+          <w:tcPr>
+            <w:tcW w:type="dxa" w:w="3200"/>
+            <w:shd w:val="clear" w:color="auto" w:fill="FFFFFF"/>
+          </w:tcPr>
+          <w:p>
+            <w:r/>
+            <w:r>
+              <w:rPr>
+                <w:rFonts w:ascii="Calibri" w:hAnsi="Calibri"/>
                 <w:b/>
                 <w:i w:val="0"/>
                 <w:color w:val="1D1D1B"/>
-                <w:sz w:val="18"/>
+                <w:sz w:val="22"/>
               </w:rPr>
               <w:t>Zoldervloerisolatie</w:t>
             </w:r>
@@ -2527,17 +3162,18 @@
         </w:tc>
         <w:tc>
           <w:tcPr>
-            <w:tcW w:type="dxa" w:w="1928"/>
-            <w:shd w:val="clear" w:color="auto" w:fill="FFFFFF"/>
-          </w:tcPr>
-          <w:p>
-            <w:r/>
-            <w:r>
-              <w:rPr>
+            <w:tcW w:type="dxa" w:w="1456"/>
+            <w:shd w:val="clear" w:color="auto" w:fill="FFFFFF"/>
+          </w:tcPr>
+          <w:p>
+            <w:r/>
+            <w:r>
+              <w:rPr>
+                <w:rFonts w:ascii="Calibri" w:hAnsi="Calibri"/>
                 <w:b w:val="0"/>
                 <w:i w:val="0"/>
                 <w:color w:val="1D1D1B"/>
-                <w:sz w:val="18"/>
+                <w:sz w:val="22"/>
               </w:rPr>
               <w:t>€ 2.00/m²</w:t>
             </w:r>
@@ -2545,17 +3181,18 @@
         </w:tc>
         <w:tc>
           <w:tcPr>
-            <w:tcW w:type="dxa" w:w="1928"/>
-            <w:shd w:val="clear" w:color="auto" w:fill="FFFFFF"/>
-          </w:tcPr>
-          <w:p>
-            <w:r/>
-            <w:r>
-              <w:rPr>
+            <w:tcW w:type="dxa" w:w="1457"/>
+            <w:shd w:val="clear" w:color="auto" w:fill="FFFFFF"/>
+          </w:tcPr>
+          <w:p>
+            <w:r/>
+            <w:r>
+              <w:rPr>
+                <w:rFonts w:ascii="Calibri" w:hAnsi="Calibri"/>
                 <w:b/>
                 <w:i w:val="0"/>
                 <w:color w:val="1D1D1B"/>
-                <w:sz w:val="18"/>
+                <w:sz w:val="22"/>
               </w:rPr>
               <w:t>€ 4.00/m²</w:t>
             </w:r>
@@ -2563,17 +3200,18 @@
         </w:tc>
         <w:tc>
           <w:tcPr>
-            <w:tcW w:type="dxa" w:w="1928"/>
-            <w:shd w:val="clear" w:color="auto" w:fill="FFFFFF"/>
-          </w:tcPr>
-          <w:p>
-            <w:r/>
-            <w:r>
-              <w:rPr>
+            <w:tcW w:type="dxa" w:w="1457"/>
+            <w:shd w:val="clear" w:color="auto" w:fill="FFFFFF"/>
+          </w:tcPr>
+          <w:p>
+            <w:r/>
+            <w:r>
+              <w:rPr>
+                <w:rFonts w:ascii="Calibri" w:hAnsi="Calibri"/>
                 <w:b w:val="0"/>
                 <w:i w:val="0"/>
                 <w:color w:val="1D1D1B"/>
-                <w:sz w:val="18"/>
+                <w:sz w:val="22"/>
               </w:rPr>
               <w:t>+ € 1.50/m²</w:t>
             </w:r>
@@ -2581,17 +3219,18 @@
         </w:tc>
         <w:tc>
           <w:tcPr>
-            <w:tcW w:type="dxa" w:w="1928"/>
-            <w:shd w:val="clear" w:color="auto" w:fill="FFFFFF"/>
-          </w:tcPr>
-          <w:p>
-            <w:r/>
-            <w:r>
-              <w:rPr>
+            <w:tcW w:type="dxa" w:w="1456"/>
+            <w:shd w:val="clear" w:color="auto" w:fill="FFFFFF"/>
+          </w:tcPr>
+          <w:p>
+            <w:r/>
+            <w:r>
+              <w:rPr>
+                <w:rFonts w:ascii="Calibri" w:hAnsi="Calibri"/>
                 <w:b w:val="0"/>
                 <w:i w:val="0"/>
                 <w:color w:val="1D1D1B"/>
-                <w:sz w:val="18"/>
+                <w:sz w:val="22"/>
               </w:rPr>
               <w:t>Rc ≥ 3,5 m²K/W</w:t>
             </w:r>
@@ -2599,19 +3238,23 @@
         </w:tc>
       </w:tr>
       <w:tr>
-        <w:tc>
-          <w:tcPr>
-            <w:tcW w:type="dxa" w:w="1928"/>
-            <w:shd w:val="clear" w:color="auto" w:fill="FFFFFF"/>
-          </w:tcPr>
-          <w:p>
-            <w:r/>
-            <w:r>
-              <w:rPr>
+        <w:trPr>
+          <w:trHeight w:val="400" w:hRule="atLeast"/>
+        </w:trPr>
+        <w:tc>
+          <w:tcPr>
+            <w:tcW w:type="dxa" w:w="3200"/>
+            <w:shd w:val="clear" w:color="auto" w:fill="FFFFFF"/>
+          </w:tcPr>
+          <w:p>
+            <w:r/>
+            <w:r>
+              <w:rPr>
+                <w:rFonts w:ascii="Calibri" w:hAnsi="Calibri"/>
                 <w:b/>
                 <w:i w:val="0"/>
                 <w:color w:val="1D1D1B"/>
-                <w:sz w:val="18"/>
+                <w:sz w:val="22"/>
               </w:rPr>
               <w:t>Spouwmuurisolatie</w:t>
             </w:r>
@@ -2619,17 +3262,18 @@
         </w:tc>
         <w:tc>
           <w:tcPr>
-            <w:tcW w:type="dxa" w:w="1928"/>
-            <w:shd w:val="clear" w:color="auto" w:fill="FFFFFF"/>
-          </w:tcPr>
-          <w:p>
-            <w:r/>
-            <w:r>
-              <w:rPr>
+            <w:tcW w:type="dxa" w:w="1456"/>
+            <w:shd w:val="clear" w:color="auto" w:fill="FFFFFF"/>
+          </w:tcPr>
+          <w:p>
+            <w:r/>
+            <w:r>
+              <w:rPr>
+                <w:rFonts w:ascii="Calibri" w:hAnsi="Calibri"/>
                 <w:b w:val="0"/>
                 <w:i w:val="0"/>
                 <w:color w:val="1D1D1B"/>
-                <w:sz w:val="18"/>
+                <w:sz w:val="22"/>
               </w:rPr>
               <w:t>€ 2.63/m²</w:t>
             </w:r>
@@ -2637,17 +3281,18 @@
         </w:tc>
         <w:tc>
           <w:tcPr>
-            <w:tcW w:type="dxa" w:w="1928"/>
-            <w:shd w:val="clear" w:color="auto" w:fill="FFFFFF"/>
-          </w:tcPr>
-          <w:p>
-            <w:r/>
-            <w:r>
-              <w:rPr>
+            <w:tcW w:type="dxa" w:w="1457"/>
+            <w:shd w:val="clear" w:color="auto" w:fill="FFFFFF"/>
+          </w:tcPr>
+          <w:p>
+            <w:r/>
+            <w:r>
+              <w:rPr>
+                <w:rFonts w:ascii="Calibri" w:hAnsi="Calibri"/>
                 <w:b/>
                 <w:i w:val="0"/>
                 <w:color w:val="1D1D1B"/>
-                <w:sz w:val="18"/>
+                <w:sz w:val="22"/>
               </w:rPr>
               <w:t>€ 5.25/m²</w:t>
             </w:r>
@@ -2655,17 +3300,18 @@
         </w:tc>
         <w:tc>
           <w:tcPr>
-            <w:tcW w:type="dxa" w:w="1928"/>
-            <w:shd w:val="clear" w:color="auto" w:fill="FFFFFF"/>
-          </w:tcPr>
-          <w:p>
-            <w:r/>
-            <w:r>
-              <w:rPr>
+            <w:tcW w:type="dxa" w:w="1457"/>
+            <w:shd w:val="clear" w:color="auto" w:fill="FFFFFF"/>
+          </w:tcPr>
+          <w:p>
+            <w:r/>
+            <w:r>
+              <w:rPr>
+                <w:rFonts w:ascii="Calibri" w:hAnsi="Calibri"/>
                 <w:b w:val="0"/>
                 <w:i w:val="0"/>
                 <w:color w:val="1D1D1B"/>
-                <w:sz w:val="18"/>
+                <w:sz w:val="22"/>
               </w:rPr>
               <w:t>+ € 1.50/m²</w:t>
             </w:r>
@@ -2673,17 +3319,18 @@
         </w:tc>
         <w:tc>
           <w:tcPr>
-            <w:tcW w:type="dxa" w:w="1928"/>
-            <w:shd w:val="clear" w:color="auto" w:fill="FFFFFF"/>
-          </w:tcPr>
-          <w:p>
-            <w:r/>
-            <w:r>
-              <w:rPr>
+            <w:tcW w:type="dxa" w:w="1456"/>
+            <w:shd w:val="clear" w:color="auto" w:fill="FFFFFF"/>
+          </w:tcPr>
+          <w:p>
+            <w:r/>
+            <w:r>
+              <w:rPr>
+                <w:rFonts w:ascii="Calibri" w:hAnsi="Calibri"/>
                 <w:b w:val="0"/>
                 <w:i w:val="0"/>
                 <w:color w:val="1D1D1B"/>
-                <w:sz w:val="18"/>
+                <w:sz w:val="22"/>
               </w:rPr>
               <w:t>Rc ≥ 1,1 m²K/W</w:t>
             </w:r>
@@ -2691,19 +3338,23 @@
         </w:tc>
       </w:tr>
       <w:tr>
-        <w:tc>
-          <w:tcPr>
-            <w:tcW w:type="dxa" w:w="1928"/>
-            <w:shd w:val="clear" w:color="auto" w:fill="FFFFFF"/>
-          </w:tcPr>
-          <w:p>
-            <w:r/>
-            <w:r>
-              <w:rPr>
+        <w:trPr>
+          <w:trHeight w:val="400" w:hRule="atLeast"/>
+        </w:trPr>
+        <w:tc>
+          <w:tcPr>
+            <w:tcW w:type="dxa" w:w="3200"/>
+            <w:shd w:val="clear" w:color="auto" w:fill="FFFFFF"/>
+          </w:tcPr>
+          <w:p>
+            <w:r/>
+            <w:r>
+              <w:rPr>
+                <w:rFonts w:ascii="Calibri" w:hAnsi="Calibri"/>
                 <w:b/>
                 <w:i w:val="0"/>
                 <w:color w:val="1D1D1B"/>
-                <w:sz w:val="18"/>
+                <w:sz w:val="22"/>
               </w:rPr>
               <w:t>Vloerisolatie</w:t>
             </w:r>
@@ -2711,17 +3362,18 @@
         </w:tc>
         <w:tc>
           <w:tcPr>
-            <w:tcW w:type="dxa" w:w="1928"/>
-            <w:shd w:val="clear" w:color="auto" w:fill="FFFFFF"/>
-          </w:tcPr>
-          <w:p>
-            <w:r/>
-            <w:r>
-              <w:rPr>
+            <w:tcW w:type="dxa" w:w="1456"/>
+            <w:shd w:val="clear" w:color="auto" w:fill="FFFFFF"/>
+          </w:tcPr>
+          <w:p>
+            <w:r/>
+            <w:r>
+              <w:rPr>
+                <w:rFonts w:ascii="Calibri" w:hAnsi="Calibri"/>
                 <w:b w:val="0"/>
                 <w:i w:val="0"/>
                 <w:color w:val="1D1D1B"/>
-                <w:sz w:val="18"/>
+                <w:sz w:val="22"/>
               </w:rPr>
               <w:t>€ 2.75/m²</w:t>
             </w:r>
@@ -2729,17 +3381,18 @@
         </w:tc>
         <w:tc>
           <w:tcPr>
-            <w:tcW w:type="dxa" w:w="1928"/>
-            <w:shd w:val="clear" w:color="auto" w:fill="FFFFFF"/>
-          </w:tcPr>
-          <w:p>
-            <w:r/>
-            <w:r>
-              <w:rPr>
+            <w:tcW w:type="dxa" w:w="1457"/>
+            <w:shd w:val="clear" w:color="auto" w:fill="FFFFFF"/>
+          </w:tcPr>
+          <w:p>
+            <w:r/>
+            <w:r>
+              <w:rPr>
+                <w:rFonts w:ascii="Calibri" w:hAnsi="Calibri"/>
                 <w:b/>
                 <w:i w:val="0"/>
                 <w:color w:val="1D1D1B"/>
-                <w:sz w:val="18"/>
+                <w:sz w:val="22"/>
               </w:rPr>
               <w:t>€ 5.50/m²</w:t>
             </w:r>
@@ -2747,17 +3400,18 @@
         </w:tc>
         <w:tc>
           <w:tcPr>
-            <w:tcW w:type="dxa" w:w="1928"/>
-            <w:shd w:val="clear" w:color="auto" w:fill="FFFFFF"/>
-          </w:tcPr>
-          <w:p>
-            <w:r/>
-            <w:r>
-              <w:rPr>
+            <w:tcW w:type="dxa" w:w="1457"/>
+            <w:shd w:val="clear" w:color="auto" w:fill="FFFFFF"/>
+          </w:tcPr>
+          <w:p>
+            <w:r/>
+            <w:r>
+              <w:rPr>
+                <w:rFonts w:ascii="Calibri" w:hAnsi="Calibri"/>
                 <w:b w:val="0"/>
                 <w:i w:val="0"/>
                 <w:color w:val="1D1D1B"/>
-                <w:sz w:val="18"/>
+                <w:sz w:val="22"/>
               </w:rPr>
               <w:t>+ € 2.00/m²</w:t>
             </w:r>
@@ -2765,17 +3419,18 @@
         </w:tc>
         <w:tc>
           <w:tcPr>
-            <w:tcW w:type="dxa" w:w="1928"/>
-            <w:shd w:val="clear" w:color="auto" w:fill="FFFFFF"/>
-          </w:tcPr>
-          <w:p>
-            <w:r/>
-            <w:r>
-              <w:rPr>
+            <w:tcW w:type="dxa" w:w="1456"/>
+            <w:shd w:val="clear" w:color="auto" w:fill="FFFFFF"/>
+          </w:tcPr>
+          <w:p>
+            <w:r/>
+            <w:r>
+              <w:rPr>
+                <w:rFonts w:ascii="Calibri" w:hAnsi="Calibri"/>
                 <w:b w:val="0"/>
                 <w:i w:val="0"/>
                 <w:color w:val="1D1D1B"/>
-                <w:sz w:val="18"/>
+                <w:sz w:val="22"/>
               </w:rPr>
               <w:t>Rc ≥ 3,5 m²K/W</w:t>
             </w:r>
@@ -2783,19 +3438,23 @@
         </w:tc>
       </w:tr>
       <w:tr>
-        <w:tc>
-          <w:tcPr>
-            <w:tcW w:type="dxa" w:w="1928"/>
-            <w:shd w:val="clear" w:color="auto" w:fill="FFFFFF"/>
-          </w:tcPr>
-          <w:p>
-            <w:r/>
-            <w:r>
-              <w:rPr>
+        <w:trPr>
+          <w:trHeight w:val="400" w:hRule="atLeast"/>
+        </w:trPr>
+        <w:tc>
+          <w:tcPr>
+            <w:tcW w:type="dxa" w:w="3200"/>
+            <w:shd w:val="clear" w:color="auto" w:fill="FFFFFF"/>
+          </w:tcPr>
+          <w:p>
+            <w:r/>
+            <w:r>
+              <w:rPr>
+                <w:rFonts w:ascii="Calibri" w:hAnsi="Calibri"/>
                 <w:b/>
                 <w:i w:val="0"/>
                 <w:color w:val="1D1D1B"/>
-                <w:sz w:val="18"/>
+                <w:sz w:val="22"/>
               </w:rPr>
               <w:t>Bodemisolatie (kruipruimte)</w:t>
             </w:r>
@@ -2803,17 +3462,18 @@
         </w:tc>
         <w:tc>
           <w:tcPr>
-            <w:tcW w:type="dxa" w:w="1928"/>
-            <w:shd w:val="clear" w:color="auto" w:fill="FFFFFF"/>
-          </w:tcPr>
-          <w:p>
-            <w:r/>
-            <w:r>
-              <w:rPr>
+            <w:tcW w:type="dxa" w:w="1456"/>
+            <w:shd w:val="clear" w:color="auto" w:fill="FFFFFF"/>
+          </w:tcPr>
+          <w:p>
+            <w:r/>
+            <w:r>
+              <w:rPr>
+                <w:rFonts w:ascii="Calibri" w:hAnsi="Calibri"/>
                 <w:b w:val="0"/>
                 <w:i w:val="0"/>
                 <w:color w:val="1D1D1B"/>
-                <w:sz w:val="18"/>
+                <w:sz w:val="22"/>
               </w:rPr>
               <w:t>€ 1.50/m²</w:t>
             </w:r>
@@ -2821,17 +3481,18 @@
         </w:tc>
         <w:tc>
           <w:tcPr>
-            <w:tcW w:type="dxa" w:w="1928"/>
-            <w:shd w:val="clear" w:color="auto" w:fill="FFFFFF"/>
-          </w:tcPr>
-          <w:p>
-            <w:r/>
-            <w:r>
-              <w:rPr>
+            <w:tcW w:type="dxa" w:w="1457"/>
+            <w:shd w:val="clear" w:color="auto" w:fill="FFFFFF"/>
+          </w:tcPr>
+          <w:p>
+            <w:r/>
+            <w:r>
+              <w:rPr>
+                <w:rFonts w:ascii="Calibri" w:hAnsi="Calibri"/>
                 <w:b/>
                 <w:i w:val="0"/>
                 <w:color w:val="1D1D1B"/>
-                <w:sz w:val="18"/>
+                <w:sz w:val="22"/>
               </w:rPr>
               <w:t>€ 3.00/m²</w:t>
             </w:r>
@@ -2839,17 +3500,18 @@
         </w:tc>
         <w:tc>
           <w:tcPr>
-            <w:tcW w:type="dxa" w:w="1928"/>
-            <w:shd w:val="clear" w:color="auto" w:fill="FFFFFF"/>
-          </w:tcPr>
-          <w:p>
-            <w:r/>
-            <w:r>
-              <w:rPr>
+            <w:tcW w:type="dxa" w:w="1457"/>
+            <w:shd w:val="clear" w:color="auto" w:fill="FFFFFF"/>
+          </w:tcPr>
+          <w:p>
+            <w:r/>
+            <w:r>
+              <w:rPr>
+                <w:rFonts w:ascii="Calibri" w:hAnsi="Calibri"/>
                 <w:b w:val="0"/>
                 <w:i w:val="0"/>
                 <w:color w:val="1D1D1B"/>
-                <w:sz w:val="18"/>
+                <w:sz w:val="22"/>
               </w:rPr>
               <w:t>+ € 1.00/m²</w:t>
             </w:r>
@@ -2857,17 +3519,18 @@
         </w:tc>
         <w:tc>
           <w:tcPr>
-            <w:tcW w:type="dxa" w:w="1928"/>
-            <w:shd w:val="clear" w:color="auto" w:fill="FFFFFF"/>
-          </w:tcPr>
-          <w:p>
-            <w:r/>
-            <w:r>
-              <w:rPr>
+            <w:tcW w:type="dxa" w:w="1456"/>
+            <w:shd w:val="clear" w:color="auto" w:fill="FFFFFF"/>
+          </w:tcPr>
+          <w:p>
+            <w:r/>
+            <w:r>
+              <w:rPr>
+                <w:rFonts w:ascii="Calibri" w:hAnsi="Calibri"/>
                 <w:b w:val="0"/>
                 <w:i w:val="0"/>
                 <w:color w:val="1D1D1B"/>
-                <w:sz w:val="18"/>
+                <w:sz w:val="22"/>
               </w:rPr>
               <w:t>Rc ≥ 1,3 m²K/W</w:t>
             </w:r>
@@ -2878,30 +3541,33 @@
     <w:p/>
     <w:tbl>
       <w:tblPr>
-        <w:tblW w:type="auto" w:w="0"/>
+        <w:tblW w:w="9026" w:type="dxa"/>
         <w:tblLook w:firstColumn="1" w:firstRow="1" w:lastColumn="0" w:lastRow="0" w:noHBand="0" w:noVBand="1" w:val="04A0"/>
       </w:tblPr>
       <w:tblGrid>
-        <w:gridCol w:w="1928"/>
-        <w:gridCol w:w="1928"/>
-        <w:gridCol w:w="1928"/>
-        <w:gridCol w:w="1928"/>
-        <w:gridCol w:w="1928"/>
+        <w:gridCol w:w="3200"/>
+        <w:gridCol w:w="1942"/>
+        <w:gridCol w:w="1942"/>
+        <w:gridCol w:w="1942"/>
       </w:tblGrid>
       <w:tr>
-        <w:tc>
-          <w:tcPr>
-            <w:tcW w:type="dxa" w:w="1928"/>
-            <w:shd w:val="clear" w:color="auto" w:fill="2F6FA3"/>
-          </w:tcPr>
-          <w:p>
-            <w:r/>
-            <w:r>
-              <w:rPr>
+        <w:trPr>
+          <w:trHeight w:val="400" w:hRule="atLeast"/>
+        </w:trPr>
+        <w:tc>
+          <w:tcPr>
+            <w:tcW w:w="3200" w:type="dxa"/>
+            <w:shd w:val="clear" w:color="auto" w:fill="5AAA00"/>
+          </w:tcPr>
+          <w:p>
+            <w:r/>
+            <w:r>
+              <w:rPr>
+                <w:rFonts w:ascii="Calibri" w:hAnsi="Calibri"/>
                 <w:b/>
                 <w:i w:val="0"/>
                 <w:color w:val="FFFFFF"/>
-                <w:sz w:val="18"/>
+                <w:sz w:val="22"/>
               </w:rPr>
               <w:t>Type glas</w:t>
             </w:r>
@@ -2909,17 +3575,18 @@
         </w:tc>
         <w:tc>
           <w:tcPr>
-            <w:tcW w:type="dxa" w:w="1928"/>
-            <w:shd w:val="clear" w:color="auto" w:fill="2F6FA3"/>
-          </w:tcPr>
-          <w:p>
-            <w:r/>
-            <w:r>
-              <w:rPr>
+            <w:tcW w:w="1942" w:type="dxa"/>
+            <w:shd w:val="clear" w:color="auto" w:fill="5AAA00"/>
+          </w:tcPr>
+          <w:p>
+            <w:r/>
+            <w:r>
+              <w:rPr>
+                <w:rFonts w:ascii="Calibri" w:hAnsi="Calibri"/>
                 <w:b/>
                 <w:i w:val="0"/>
                 <w:color w:val="FFFFFF"/>
-                <w:sz w:val="18"/>
+                <w:sz w:val="22"/>
               </w:rPr>
               <w:t>Enkelvoudig</w:t>
             </w:r>
@@ -2927,17 +3594,18 @@
         </w:tc>
         <w:tc>
           <w:tcPr>
-            <w:tcW w:type="dxa" w:w="1928"/>
-            <w:shd w:val="clear" w:color="auto" w:fill="2F6FA3"/>
-          </w:tcPr>
-          <w:p>
-            <w:r/>
-            <w:r>
-              <w:rPr>
+            <w:tcW w:w="1942" w:type="dxa"/>
+            <w:shd w:val="clear" w:color="auto" w:fill="5AAA00"/>
+          </w:tcPr>
+          <w:p>
+            <w:r/>
+            <w:r>
+              <w:rPr>
+                <w:rFonts w:ascii="Calibri" w:hAnsi="Calibri"/>
                 <w:b/>
                 <w:i w:val="0"/>
                 <w:color w:val="FFFFFF"/>
-                <w:sz w:val="18"/>
+                <w:sz w:val="22"/>
               </w:rPr>
               <w:t>Meervoudig</w:t>
             </w:r>
@@ -2945,55 +3613,42 @@
         </w:tc>
         <w:tc>
           <w:tcPr>
-            <w:tcW w:type="dxa" w:w="1928"/>
-            <w:shd w:val="clear" w:color="auto" w:fill="2F6FA3"/>
-          </w:tcPr>
-          <w:p>
-            <w:r/>
-            <w:r>
-              <w:rPr>
+            <w:tcW w:w="1942" w:type="dxa"/>
+            <w:shd w:val="clear" w:color="auto" w:fill="5AAA00"/>
+          </w:tcPr>
+          <w:p>
+            <w:r/>
+            <w:r>
+              <w:rPr>
+                <w:rFonts w:ascii="Calibri" w:hAnsi="Calibri"/>
                 <w:b/>
                 <w:i w:val="0"/>
                 <w:color w:val="FFFFFF"/>
-                <w:sz w:val="18"/>
-              </w:rPr>
-              <w:t>Monument enkv.</w:t>
-            </w:r>
-          </w:p>
-        </w:tc>
-        <w:tc>
-          <w:tcPr>
-            <w:tcW w:type="dxa" w:w="1928"/>
-            <w:shd w:val="clear" w:color="auto" w:fill="2F6FA3"/>
-          </w:tcPr>
-          <w:p>
-            <w:r/>
-            <w:r>
-              <w:rPr>
-                <w:b/>
-                <w:i w:val="0"/>
-                <w:color w:val="FFFFFF"/>
-                <w:sz w:val="18"/>
-              </w:rPr>
-              <w:t>Monument meerv.</w:t>
+                <w:sz w:val="22"/>
+              </w:rPr>
+              <w:t>Min. U-waarde</w:t>
             </w:r>
           </w:p>
         </w:tc>
       </w:tr>
       <w:tr>
-        <w:tc>
-          <w:tcPr>
-            <w:tcW w:type="dxa" w:w="1928"/>
-            <w:shd w:val="clear" w:color="auto" w:fill="FFFFFF"/>
-          </w:tcPr>
-          <w:p>
-            <w:r/>
-            <w:r>
-              <w:rPr>
+        <w:trPr>
+          <w:trHeight w:val="400" w:hRule="atLeast"/>
+        </w:trPr>
+        <w:tc>
+          <w:tcPr>
+            <w:tcW w:type="dxa" w:w="3200"/>
+            <w:shd w:val="clear" w:color="auto" w:fill="FFFFFF"/>
+          </w:tcPr>
+          <w:p>
+            <w:r/>
+            <w:r>
+              <w:rPr>
+                <w:rFonts w:ascii="Calibri" w:hAnsi="Calibri"/>
                 <w:b/>
                 <w:i w:val="0"/>
                 <w:color w:val="1D1D1B"/>
-                <w:sz w:val="18"/>
+                <w:sz w:val="22"/>
               </w:rPr>
               <w:t>HR++ glas</w:t>
             </w:r>
@@ -3001,17 +3656,18 @@
         </w:tc>
         <w:tc>
           <w:tcPr>
-            <w:tcW w:type="dxa" w:w="1928"/>
-            <w:shd w:val="clear" w:color="auto" w:fill="FFFFFF"/>
-          </w:tcPr>
-          <w:p>
-            <w:r/>
-            <w:r>
-              <w:rPr>
+            <w:tcW w:type="dxa" w:w="1942"/>
+            <w:shd w:val="clear" w:color="auto" w:fill="FFFFFF"/>
+          </w:tcPr>
+          <w:p>
+            <w:r/>
+            <w:r>
+              <w:rPr>
+                <w:rFonts w:ascii="Calibri" w:hAnsi="Calibri"/>
                 <w:b w:val="0"/>
                 <w:i w:val="0"/>
                 <w:color w:val="1D1D1B"/>
-                <w:sz w:val="18"/>
+                <w:sz w:val="22"/>
               </w:rPr>
               <w:t>€ 12.50/m²</w:t>
             </w:r>
@@ -3019,17 +3675,18 @@
         </w:tc>
         <w:tc>
           <w:tcPr>
-            <w:tcW w:type="dxa" w:w="1928"/>
-            <w:shd w:val="clear" w:color="auto" w:fill="FFFFFF"/>
-          </w:tcPr>
-          <w:p>
-            <w:r/>
-            <w:r>
-              <w:rPr>
+            <w:tcW w:type="dxa" w:w="1942"/>
+            <w:shd w:val="clear" w:color="auto" w:fill="FFFFFF"/>
+          </w:tcPr>
+          <w:p>
+            <w:r/>
+            <w:r>
+              <w:rPr>
+                <w:rFonts w:ascii="Calibri" w:hAnsi="Calibri"/>
                 <w:b/>
                 <w:i w:val="0"/>
                 <w:color w:val="1D1D1B"/>
-                <w:sz w:val="18"/>
+                <w:sz w:val="22"/>
               </w:rPr>
               <w:t>€ 25.00/m²</w:t>
             </w:r>
@@ -3037,55 +3694,42 @@
         </w:tc>
         <w:tc>
           <w:tcPr>
-            <w:tcW w:type="dxa" w:w="1928"/>
-            <w:shd w:val="clear" w:color="auto" w:fill="FFFFFF"/>
-          </w:tcPr>
-          <w:p>
-            <w:r/>
-            <w:r>
-              <w:rPr>
+            <w:tcW w:type="dxa" w:w="1942"/>
+            <w:shd w:val="clear" w:color="auto" w:fill="FFFFFF"/>
+          </w:tcPr>
+          <w:p>
+            <w:r/>
+            <w:r>
+              <w:rPr>
+                <w:rFonts w:ascii="Calibri" w:hAnsi="Calibri"/>
                 <w:b w:val="0"/>
                 <w:i w:val="0"/>
                 <w:color w:val="1D1D1B"/>
-                <w:sz w:val="18"/>
-              </w:rPr>
-              <w:t>€ 20.00/m²</w:t>
-            </w:r>
-          </w:p>
-        </w:tc>
-        <w:tc>
-          <w:tcPr>
-            <w:tcW w:type="dxa" w:w="1928"/>
-            <w:shd w:val="clear" w:color="auto" w:fill="FFFFFF"/>
-          </w:tcPr>
-          <w:p>
-            <w:r/>
-            <w:r>
-              <w:rPr>
-                <w:b w:val="0"/>
-                <w:i w:val="0"/>
-                <w:color w:val="1D1D1B"/>
-                <w:sz w:val="18"/>
-              </w:rPr>
-              <w:t>€ 40.00/m²</w:t>
+                <w:sz w:val="22"/>
+              </w:rPr>
+              <w:t>U ≤ 1,2 W/m²K</w:t>
             </w:r>
           </w:p>
         </w:tc>
       </w:tr>
       <w:tr>
-        <w:tc>
-          <w:tcPr>
-            <w:tcW w:type="dxa" w:w="1928"/>
-            <w:shd w:val="clear" w:color="auto" w:fill="FFFFFF"/>
-          </w:tcPr>
-          <w:p>
-            <w:r/>
-            <w:r>
-              <w:rPr>
+        <w:trPr>
+          <w:trHeight w:val="400" w:hRule="atLeast"/>
+        </w:trPr>
+        <w:tc>
+          <w:tcPr>
+            <w:tcW w:type="dxa" w:w="3200"/>
+            <w:shd w:val="clear" w:color="auto" w:fill="FFFFFF"/>
+          </w:tcPr>
+          <w:p>
+            <w:r/>
+            <w:r>
+              <w:rPr>
+                <w:rFonts w:ascii="Calibri" w:hAnsi="Calibri"/>
                 <w:b/>
                 <w:i w:val="0"/>
                 <w:color w:val="1D1D1B"/>
-                <w:sz w:val="18"/>
+                <w:sz w:val="22"/>
               </w:rPr>
               <w:t>Vacuümglas</w:t>
             </w:r>
@@ -3093,17 +3737,18 @@
         </w:tc>
         <w:tc>
           <w:tcPr>
-            <w:tcW w:type="dxa" w:w="1928"/>
-            <w:shd w:val="clear" w:color="auto" w:fill="FFFFFF"/>
-          </w:tcPr>
-          <w:p>
-            <w:r/>
-            <w:r>
-              <w:rPr>
+            <w:tcW w:type="dxa" w:w="1942"/>
+            <w:shd w:val="clear" w:color="auto" w:fill="FFFFFF"/>
+          </w:tcPr>
+          <w:p>
+            <w:r/>
+            <w:r>
+              <w:rPr>
+                <w:rFonts w:ascii="Calibri" w:hAnsi="Calibri"/>
                 <w:b w:val="0"/>
                 <w:i w:val="0"/>
                 <w:color w:val="1D1D1B"/>
-                <w:sz w:val="18"/>
+                <w:sz w:val="22"/>
               </w:rPr>
               <w:t>€ 12.50/m²</w:t>
             </w:r>
@@ -3111,17 +3756,18 @@
         </w:tc>
         <w:tc>
           <w:tcPr>
-            <w:tcW w:type="dxa" w:w="1928"/>
-            <w:shd w:val="clear" w:color="auto" w:fill="FFFFFF"/>
-          </w:tcPr>
-          <w:p>
-            <w:r/>
-            <w:r>
-              <w:rPr>
+            <w:tcW w:type="dxa" w:w="1942"/>
+            <w:shd w:val="clear" w:color="auto" w:fill="FFFFFF"/>
+          </w:tcPr>
+          <w:p>
+            <w:r/>
+            <w:r>
+              <w:rPr>
+                <w:rFonts w:ascii="Calibri" w:hAnsi="Calibri"/>
                 <w:b/>
                 <w:i w:val="0"/>
                 <w:color w:val="1D1D1B"/>
-                <w:sz w:val="18"/>
+                <w:sz w:val="22"/>
               </w:rPr>
               <w:t>€ 25.00/m²</w:t>
             </w:r>
@@ -3129,54 +3775,41 @@
         </w:tc>
         <w:tc>
           <w:tcPr>
-            <w:tcW w:type="dxa" w:w="1928"/>
-            <w:shd w:val="clear" w:color="auto" w:fill="FFFFFF"/>
-          </w:tcPr>
-          <w:p>
-            <w:r/>
-            <w:r>
-              <w:rPr>
+            <w:tcW w:type="dxa" w:w="1942"/>
+            <w:shd w:val="clear" w:color="auto" w:fill="FFFFFF"/>
+          </w:tcPr>
+          <w:p>
+            <w:r/>
+            <w:r>
+              <w:rPr>
+                <w:rFonts w:ascii="Calibri" w:hAnsi="Calibri"/>
                 <w:b w:val="0"/>
                 <w:i w:val="0"/>
                 <w:color w:val="1D1D1B"/>
-                <w:sz w:val="18"/>
-              </w:rPr>
-              <w:t>€ 20.00/m²</w:t>
-            </w:r>
-          </w:p>
-        </w:tc>
-        <w:tc>
-          <w:tcPr>
-            <w:tcW w:type="dxa" w:w="1928"/>
-            <w:shd w:val="clear" w:color="auto" w:fill="FFFFFF"/>
-          </w:tcPr>
-          <w:p>
-            <w:r/>
-            <w:r>
-              <w:rPr>
-                <w:b w:val="0"/>
-                <w:i w:val="0"/>
-                <w:color w:val="1D1D1B"/>
-                <w:sz w:val="18"/>
-              </w:rPr>
-              <w:t>€ 40.00/m²</w:t>
+                <w:sz w:val="22"/>
+              </w:rPr>
+              <w:t>U ≤ 0,7 W/m²K</w:t>
             </w:r>
           </w:p>
         </w:tc>
       </w:tr>
       <w:tr>
-        <w:tc>
-          <w:tcPr>
-            <w:tcW w:type="dxa" w:w="1928"/>
-          </w:tcPr>
-          <w:p>
-            <w:r/>
-            <w:r>
-              <w:rPr>
+        <w:trPr>
+          <w:trHeight w:val="400" w:hRule="atLeast"/>
+        </w:trPr>
+        <w:tc>
+          <w:tcPr>
+            <w:tcW w:type="dxa" w:w="3200"/>
+          </w:tcPr>
+          <w:p>
+            <w:r/>
+            <w:r>
+              <w:rPr>
+                <w:rFonts w:ascii="Calibri" w:hAnsi="Calibri"/>
                 <w:b w:val="0"/>
                 <w:i w:val="0"/>
                 <w:color w:val="999999"/>
-                <w:sz w:val="18"/>
+                <w:sz w:val="22"/>
               </w:rPr>
               <w:t>Triple glas</w:t>
             </w:r>
@@ -3184,16 +3817,17 @@
         </w:tc>
         <w:tc>
           <w:tcPr>
-            <w:tcW w:type="dxa" w:w="1928"/>
-          </w:tcPr>
-          <w:p>
-            <w:r/>
-            <w:r>
-              <w:rPr>
+            <w:tcW w:type="dxa" w:w="1942"/>
+          </w:tcPr>
+          <w:p>
+            <w:r/>
+            <w:r>
+              <w:rPr>
+                <w:rFonts w:ascii="Calibri" w:hAnsi="Calibri"/>
                 <w:b w:val="0"/>
                 <w:i w:val="0"/>
                 <w:color w:val="999999"/>
-                <w:sz w:val="18"/>
+                <w:sz w:val="22"/>
               </w:rPr>
               <w:t>€ 55.50/m²</w:t>
             </w:r>
@@ -3201,16 +3835,17 @@
         </w:tc>
         <w:tc>
           <w:tcPr>
-            <w:tcW w:type="dxa" w:w="1928"/>
-          </w:tcPr>
-          <w:p>
-            <w:r/>
-            <w:r>
-              <w:rPr>
+            <w:tcW w:type="dxa" w:w="1942"/>
+          </w:tcPr>
+          <w:p>
+            <w:r/>
+            <w:r>
+              <w:rPr>
+                <w:rFonts w:ascii="Calibri" w:hAnsi="Calibri"/>
                 <w:b w:val="0"/>
                 <w:i w:val="0"/>
                 <w:color w:val="999999"/>
-                <w:sz w:val="18"/>
+                <w:sz w:val="22"/>
               </w:rPr>
               <w:t>€ 111.00/m²</w:t>
             </w:r>
@@ -3218,53 +3853,41 @@
         </w:tc>
         <w:tc>
           <w:tcPr>
-            <w:tcW w:type="dxa" w:w="1928"/>
-          </w:tcPr>
-          <w:p>
-            <w:r/>
-            <w:r>
-              <w:rPr>
+            <w:tcW w:type="dxa" w:w="1942"/>
+          </w:tcPr>
+          <w:p>
+            <w:r/>
+            <w:r>
+              <w:rPr>
+                <w:rFonts w:ascii="Calibri" w:hAnsi="Calibri"/>
                 <w:b w:val="0"/>
                 <w:i w:val="0"/>
                 <w:color w:val="999999"/>
-                <w:sz w:val="18"/>
-              </w:rPr>
-              <w:t>€ 20.00/m²</w:t>
-            </w:r>
-          </w:p>
-        </w:tc>
-        <w:tc>
-          <w:tcPr>
-            <w:tcW w:type="dxa" w:w="1928"/>
-          </w:tcPr>
-          <w:p>
-            <w:r/>
-            <w:r>
-              <w:rPr>
-                <w:b w:val="0"/>
-                <w:i w:val="0"/>
-                <w:color w:val="999999"/>
-                <w:sz w:val="18"/>
-              </w:rPr>
-              <w:t>€ 40.00/m²</w:t>
+                <w:sz w:val="22"/>
+              </w:rPr>
+              <w:t>U ≤ 0,7 W/m²K</w:t>
             </w:r>
           </w:p>
         </w:tc>
       </w:tr>
       <w:tr>
-        <w:tc>
-          <w:tcPr>
-            <w:tcW w:type="dxa" w:w="1928"/>
-            <w:shd w:val="clear" w:color="auto" w:fill="FFFFFF"/>
-          </w:tcPr>
-          <w:p>
-            <w:r/>
-            <w:r>
-              <w:rPr>
+        <w:trPr>
+          <w:trHeight w:val="400" w:hRule="atLeast"/>
+        </w:trPr>
+        <w:tc>
+          <w:tcPr>
+            <w:tcW w:type="dxa" w:w="3200"/>
+            <w:shd w:val="clear" w:color="auto" w:fill="FFFFFF"/>
+          </w:tcPr>
+          <w:p>
+            <w:r/>
+            <w:r>
+              <w:rPr>
+                <w:rFonts w:ascii="Calibri" w:hAnsi="Calibri"/>
                 <w:b/>
                 <w:i w:val="0"/>
                 <w:color w:val="1D1D1B"/>
-                <w:sz w:val="18"/>
+                <w:sz w:val="22"/>
               </w:rPr>
               <w:t>Isolerende deuren</w:t>
             </w:r>
@@ -3272,17 +3895,18 @@
         </w:tc>
         <w:tc>
           <w:tcPr>
-            <w:tcW w:type="dxa" w:w="1928"/>
-            <w:shd w:val="clear" w:color="auto" w:fill="FFFFFF"/>
-          </w:tcPr>
-          <w:p>
-            <w:r/>
-            <w:r>
-              <w:rPr>
+            <w:tcW w:type="dxa" w:w="1942"/>
+            <w:shd w:val="clear" w:color="auto" w:fill="FFFFFF"/>
+          </w:tcPr>
+          <w:p>
+            <w:r/>
+            <w:r>
+              <w:rPr>
+                <w:rFonts w:ascii="Calibri" w:hAnsi="Calibri"/>
                 <w:b w:val="0"/>
                 <w:i w:val="0"/>
                 <w:color w:val="1D1D1B"/>
-                <w:sz w:val="18"/>
+                <w:sz w:val="22"/>
               </w:rPr>
               <w:t>€ 55.50/m²</w:t>
             </w:r>
@@ -3290,17 +3914,18 @@
         </w:tc>
         <w:tc>
           <w:tcPr>
-            <w:tcW w:type="dxa" w:w="1928"/>
-            <w:shd w:val="clear" w:color="auto" w:fill="FFFFFF"/>
-          </w:tcPr>
-          <w:p>
-            <w:r/>
-            <w:r>
-              <w:rPr>
+            <w:tcW w:type="dxa" w:w="1942"/>
+            <w:shd w:val="clear" w:color="auto" w:fill="FFFFFF"/>
+          </w:tcPr>
+          <w:p>
+            <w:r/>
+            <w:r>
+              <w:rPr>
+                <w:rFonts w:ascii="Calibri" w:hAnsi="Calibri"/>
                 <w:b/>
                 <w:i w:val="0"/>
                 <w:color w:val="1D1D1B"/>
-                <w:sz w:val="18"/>
+                <w:sz w:val="22"/>
               </w:rPr>
               <w:t>€ 111.00/m²</w:t>
             </w:r>
@@ -3308,37 +3933,20 @@
         </w:tc>
         <w:tc>
           <w:tcPr>
-            <w:tcW w:type="dxa" w:w="1928"/>
-            <w:shd w:val="clear" w:color="auto" w:fill="FFFFFF"/>
-          </w:tcPr>
-          <w:p>
-            <w:r/>
-            <w:r>
-              <w:rPr>
+            <w:tcW w:type="dxa" w:w="1942"/>
+            <w:shd w:val="clear" w:color="auto" w:fill="FFFFFF"/>
+          </w:tcPr>
+          <w:p>
+            <w:r/>
+            <w:r>
+              <w:rPr>
+                <w:rFonts w:ascii="Calibri" w:hAnsi="Calibri"/>
                 <w:b w:val="0"/>
                 <w:i w:val="0"/>
                 <w:color w:val="1D1D1B"/>
-                <w:sz w:val="18"/>
-              </w:rPr>
-              <w:t>€ 20.00/m²</w:t>
-            </w:r>
-          </w:p>
-        </w:tc>
-        <w:tc>
-          <w:tcPr>
-            <w:tcW w:type="dxa" w:w="1928"/>
-            <w:shd w:val="clear" w:color="auto" w:fill="FFFFFF"/>
-          </w:tcPr>
-          <w:p>
-            <w:r/>
-            <w:r>
-              <w:rPr>
-                <w:b w:val="0"/>
-                <w:i w:val="0"/>
-                <w:color w:val="1D1D1B"/>
-                <w:sz w:val="18"/>
-              </w:rPr>
-              <w:t>€ 40.00/m²</w:t>
+                <w:sz w:val="22"/>
+              </w:rPr>
+              <w:t>U ≤ 1,0 W/m²K</w:t>
             </w:r>
           </w:p>
         </w:tc>
@@ -3347,29 +3955,33 @@
     <w:p/>
     <w:tbl>
       <w:tblPr>
-        <w:tblW w:type="auto" w:w="0"/>
+        <w:tblW w:w="9026" w:type="dxa"/>
         <w:tblLook w:firstColumn="1" w:firstRow="1" w:lastColumn="0" w:lastRow="0" w:noHBand="0" w:noVBand="1" w:val="04A0"/>
       </w:tblPr>
       <w:tblGrid>
-        <w:gridCol w:w="2409"/>
-        <w:gridCol w:w="2409"/>
-        <w:gridCol w:w="2409"/>
-        <w:gridCol w:w="2409"/>
+        <w:gridCol w:w="3200"/>
+        <w:gridCol w:w="1942"/>
+        <w:gridCol w:w="1942"/>
+        <w:gridCol w:w="1942"/>
       </w:tblGrid>
       <w:tr>
-        <w:tc>
-          <w:tcPr>
-            <w:tcW w:type="dxa" w:w="2409"/>
-            <w:shd w:val="clear" w:color="auto" w:fill="2F6FA3"/>
-          </w:tcPr>
-          <w:p>
-            <w:r/>
-            <w:r>
-              <w:rPr>
+        <w:trPr>
+          <w:trHeight w:val="400" w:hRule="atLeast"/>
+        </w:trPr>
+        <w:tc>
+          <w:tcPr>
+            <w:tcW w:w="3200" w:type="dxa"/>
+            <w:shd w:val="clear" w:color="auto" w:fill="5AAA00"/>
+          </w:tcPr>
+          <w:p>
+            <w:r/>
+            <w:r>
+              <w:rPr>
+                <w:rFonts w:ascii="Calibri" w:hAnsi="Calibri"/>
                 <w:b/>
                 <w:i w:val="0"/>
                 <w:color w:val="FFFFFF"/>
-                <w:sz w:val="18"/>
+                <w:sz w:val="22"/>
               </w:rPr>
               <w:t>Combinatie</w:t>
             </w:r>
@@ -3377,17 +3989,18 @@
         </w:tc>
         <w:tc>
           <w:tcPr>
-            <w:tcW w:type="dxa" w:w="2409"/>
-            <w:shd w:val="clear" w:color="auto" w:fill="2F6FA3"/>
-          </w:tcPr>
-          <w:p>
-            <w:r/>
-            <w:r>
-              <w:rPr>
+            <w:tcW w:w="1942" w:type="dxa"/>
+            <w:shd w:val="clear" w:color="auto" w:fill="5AAA00"/>
+          </w:tcPr>
+          <w:p>
+            <w:r/>
+            <w:r>
+              <w:rPr>
+                <w:rFonts w:ascii="Calibri" w:hAnsi="Calibri"/>
                 <w:b/>
                 <w:i w:val="0"/>
                 <w:color w:val="FFFFFF"/>
-                <w:sz w:val="18"/>
+                <w:sz w:val="22"/>
               </w:rPr>
               <w:t>Startbedrag</w:t>
             </w:r>
@@ -3395,17 +4008,18 @@
         </w:tc>
         <w:tc>
           <w:tcPr>
-            <w:tcW w:type="dxa" w:w="2409"/>
-            <w:shd w:val="clear" w:color="auto" w:fill="2F6FA3"/>
-          </w:tcPr>
-          <w:p>
-            <w:r/>
-            <w:r>
-              <w:rPr>
+            <w:tcW w:w="1942" w:type="dxa"/>
+            <w:shd w:val="clear" w:color="auto" w:fill="5AAA00"/>
+          </w:tcPr>
+          <w:p>
+            <w:r/>
+            <w:r>
+              <w:rPr>
+                <w:rFonts w:ascii="Calibri" w:hAnsi="Calibri"/>
                 <w:b/>
                 <w:i w:val="0"/>
                 <w:color w:val="FFFFFF"/>
-                <w:sz w:val="18"/>
+                <w:sz w:val="22"/>
               </w:rPr>
               <w:t>Per kW vermogen</w:t>
             </w:r>
@@ -3413,17 +4027,18 @@
         </w:tc>
         <w:tc>
           <w:tcPr>
-            <w:tcW w:type="dxa" w:w="2409"/>
-            <w:shd w:val="clear" w:color="auto" w:fill="2F6FA3"/>
-          </w:tcPr>
-          <w:p>
-            <w:r/>
-            <w:r>
-              <w:rPr>
+            <w:tcW w:w="1942" w:type="dxa"/>
+            <w:shd w:val="clear" w:color="auto" w:fill="5AAA00"/>
+          </w:tcPr>
+          <w:p>
+            <w:r/>
+            <w:r>
+              <w:rPr>
+                <w:rFonts w:ascii="Calibri" w:hAnsi="Calibri"/>
                 <w:b/>
                 <w:i w:val="0"/>
                 <w:color w:val="FFFFFF"/>
-                <w:sz w:val="18"/>
+                <w:sz w:val="22"/>
               </w:rPr>
               <w:t>A+++ bonus</w:t>
             </w:r>
@@ -3431,19 +4046,23 @@
         </w:tc>
       </w:tr>
       <w:tr>
-        <w:tc>
-          <w:tcPr>
-            <w:tcW w:type="dxa" w:w="2409"/>
-            <w:shd w:val="clear" w:color="auto" w:fill="FFFFFF"/>
-          </w:tcPr>
-          <w:p>
-            <w:r/>
-            <w:r>
-              <w:rPr>
+        <w:trPr>
+          <w:trHeight w:val="400" w:hRule="atLeast"/>
+        </w:trPr>
+        <w:tc>
+          <w:tcPr>
+            <w:tcW w:w="3200" w:type="dxa"/>
+            <w:shd w:val="clear" w:color="auto" w:fill="FFFFFF"/>
+          </w:tcPr>
+          <w:p>
+            <w:r/>
+            <w:r>
+              <w:rPr>
+                <w:rFonts w:ascii="Calibri" w:hAnsi="Calibri"/>
                 <w:b/>
                 <w:i w:val="0"/>
                 <w:color w:val="2E7D32"/>
-                <w:sz w:val="18"/>
+                <w:sz w:val="22"/>
               </w:rPr>
               <w:t>Isolatie + warmtepomp</w:t>
             </w:r>
@@ -3451,17 +4070,18 @@
         </w:tc>
         <w:tc>
           <w:tcPr>
-            <w:tcW w:type="dxa" w:w="2409"/>
-            <w:shd w:val="clear" w:color="auto" w:fill="FFFFFF"/>
-          </w:tcPr>
-          <w:p>
-            <w:r/>
-            <w:r>
-              <w:rPr>
+            <w:tcW w:w="1942" w:type="dxa"/>
+            <w:shd w:val="clear" w:color="auto" w:fill="FFFFFF"/>
+          </w:tcPr>
+          <w:p>
+            <w:r/>
+            <w:r>
+              <w:rPr>
+                <w:rFonts w:ascii="Calibri" w:hAnsi="Calibri"/>
                 <w:b w:val="0"/>
                 <w:i w:val="0"/>
                 <w:color w:val="2E7D32"/>
-                <w:sz w:val="18"/>
+                <w:sz w:val="22"/>
               </w:rPr>
               <w:t>€ 1,025</w:t>
             </w:r>
@@ -3469,17 +4089,18 @@
         </w:tc>
         <w:tc>
           <w:tcPr>
-            <w:tcW w:type="dxa" w:w="2409"/>
-            <w:shd w:val="clear" w:color="auto" w:fill="FFFFFF"/>
-          </w:tcPr>
-          <w:p>
-            <w:r/>
-            <w:r>
-              <w:rPr>
+            <w:tcW w:w="1942" w:type="dxa"/>
+            <w:shd w:val="clear" w:color="auto" w:fill="FFFFFF"/>
+          </w:tcPr>
+          <w:p>
+            <w:r/>
+            <w:r>
+              <w:rPr>
+                <w:rFonts w:ascii="Calibri" w:hAnsi="Calibri"/>
                 <w:b w:val="0"/>
                 <w:i w:val="0"/>
                 <w:color w:val="2E7D32"/>
-                <w:sz w:val="18"/>
+                <w:sz w:val="22"/>
               </w:rPr>
               <w:t>+ € 225 per kW</w:t>
             </w:r>
@@ -3487,17 +4108,18 @@
         </w:tc>
         <w:tc>
           <w:tcPr>
-            <w:tcW w:type="dxa" w:w="2409"/>
-            <w:shd w:val="clear" w:color="auto" w:fill="FFFFFF"/>
-          </w:tcPr>
-          <w:p>
-            <w:r/>
-            <w:r>
-              <w:rPr>
+            <w:tcW w:w="1942" w:type="dxa"/>
+            <w:shd w:val="clear" w:color="auto" w:fill="FFFFFF"/>
+          </w:tcPr>
+          <w:p>
+            <w:r/>
+            <w:r>
+              <w:rPr>
+                <w:rFonts w:ascii="Calibri" w:hAnsi="Calibri"/>
                 <w:b w:val="0"/>
                 <w:i w:val="0"/>
                 <w:color w:val="2E7D32"/>
-                <w:sz w:val="18"/>
+                <w:sz w:val="22"/>
               </w:rPr>
               <w:t>+ € 200</w:t>
             </w:r>
@@ -3507,7 +4129,7 @@
       <w:tr>
         <w:tc>
           <w:tcPr>
-            <w:tcW w:type="dxa" w:w="9636"/>
+            <w:tcW w:w="9026" w:type="dxa"/>
             <w:gridSpan w:val="4"/>
             <w:shd w:val="clear" w:color="auto" w:fill="FFFFFF"/>
           </w:tcPr>
@@ -3515,10 +4137,11 @@
             <w:r/>
             <w:r>
               <w:rPr>
+                <w:rFonts w:ascii="Calibri" w:hAnsi="Calibri"/>
                 <w:b w:val="0"/>
                 <w:i/>
                 <w:color w:val="2E7D32"/>
-                <w:sz w:val="16"/>
+                <w:sz w:val="22"/>
               </w:rPr>
               <w:t>Door isolatie te combineren met een warmtepomp verdubbelt het isolatiesubsidie automatisch naar het meervoudige tarief.</w:t>
             </w:r>
@@ -3545,9 +4168,10 @@
             <w:r/>
             <w:r>
               <w:rPr>
+                <w:rFonts w:ascii="Calibri" w:hAnsi="Calibri"/>
                 <w:b w:val="0"/>
                 <w:i/>
-                <w:sz w:val="16"/>
+                <w:sz w:val="22"/>
               </w:rPr>
               <w:t>Let op: Massieve muren (vóór ~1930) komen niet in aanmerking voor spouwmuursubsidie. Gevelisolatie (binnen of buiten) is dan de aangewezen route.</w:t>
             </w:r>
@@ -3564,9 +4188,10 @@
             <w:r/>
             <w:r>
               <w:rPr>
+                <w:rFonts w:ascii="Calibri" w:hAnsi="Calibri"/>
                 <w:b w:val="0"/>
                 <w:i w:val="0"/>
-                <w:sz w:val="16"/>
+                <w:sz w:val="22"/>
               </w:rPr>
               <w:t>• Verdubbeling: de genoemde m²-bedragen gelden bij twee of meer maatregelen (of één isolatiemaatregel gecombineerd met een warmtepomp). Bij slechts één maatregel wordt het bedrag gehalveerd.</w:t>
             </w:r>
@@ -3583,9 +4208,10 @@
             <w:r/>
             <w:r>
               <w:rPr>
+                <w:rFonts w:ascii="Calibri" w:hAnsi="Calibri"/>
                 <w:b w:val="0"/>
                 <w:i w:val="0"/>
-                <w:sz w:val="16"/>
+                <w:sz w:val="22"/>
               </w:rPr>
               <w:t>• Beperkingen: u ontvangt slechts subsidie voor één type vloerisolatie (bodem óf vloer) en één type dakisolatie (dak óf zoldervloer).</w:t>
             </w:r>
@@ -3602,9 +4228,10 @@
             <w:r/>
             <w:r>
               <w:rPr>
+                <w:rFonts w:ascii="Calibri" w:hAnsi="Calibri"/>
                 <w:b w:val="0"/>
                 <w:i w:val="0"/>
-                <w:sz w:val="16"/>
+                <w:sz w:val="22"/>
               </w:rPr>
               <w:t>• Oppervlaktes: let op de minimale oppervlakte-eisen (bijv. minimaal 10 m² voor gevel en 20 m² voor dak/vloer).</w:t>
             </w:r>
@@ -3627,12 +4254,12 @@
           <w:bottom w:val="single" w:sz="4" w:space="4" w:color="2E6BE6"/>
         </w:pBdr>
         <w:rPr>
-          <w:color w:val="2E6BE6"/>
-        </w:rPr>
-      </w:pPr>
-      <w:r>
-        <w:rPr>
-          <w:color w:val="2E6BE6"/>
+          <w:color w:val="5AAA00"/>
+        </w:rPr>
+      </w:pPr>
+      <w:r>
+        <w:rPr>
+          <w:color w:val="5AAA00"/>
         </w:rPr>
         <w:t>Vervolgstappen</w:t>
       </w:r>
@@ -3645,10 +4272,13 @@
           <w:numId w:val="2"/>
         </w:numPr>
         <w:spacing w:before="60" w:after="60"/>
-      </w:pPr>
-      <w:r>
-        <w:rPr>
-          <w:color w:val="1A2340"/>
+        <w:rPr>
+          <w:color w:val="FF0000"/>
+        </w:rPr>
+      </w:pPr>
+      <w:r>
+        <w:rPr>
+          <w:color w:val="FF0000"/>
         </w:rPr>
         <w:t>Upload foto’s van dak, gevel, glas, installaties en kruipruimte</w:t>
       </w:r>
@@ -3661,10 +4291,13 @@
           <w:numId w:val="2"/>
         </w:numPr>
         <w:spacing w:before="60" w:after="60"/>
-      </w:pPr>
-      <w:r>
-        <w:rPr>
-          <w:color w:val="1A2340"/>
+        <w:rPr>
+          <w:color w:val="FF0000"/>
+        </w:rPr>
+      </w:pPr>
+      <w:r>
+        <w:rPr>
+          <w:color w:val="FF0000"/>
         </w:rPr>
         <w:t>Bevestig woningtype en eventuele renovatiejaren</w:t>
       </w:r>
@@ -3677,10 +4310,13 @@
           <w:numId w:val="2"/>
         </w:numPr>
         <w:spacing w:before="60" w:after="60"/>
-      </w:pPr>
-      <w:r>
-        <w:rPr>
-          <w:color w:val="1A2340"/>
+        <w:rPr>
+          <w:color w:val="FF0000"/>
+        </w:rPr>
+      </w:pPr>
+      <w:r>
+        <w:rPr>
+          <w:color w:val="FF0000"/>
         </w:rPr>
         <w:t>Gebruik dit rapport als basis voor offerte- of adviesgesprekken</w:t>
       </w:r>
@@ -3692,113 +4328,338 @@
     </w:p>
     <w:p>
       <w:pPr>
-        <w:spacing w:before="320" w:after="80"/>
-      </w:pPr>
-      <w:proofErr w:type="spellStart"/>
+        <w:spacing w:before="0" w:after="0"/>
+      </w:pPr>
+      <w:r>
+        <w:br w:type="page"/>
+      </w:r>
+    </w:p>
+    <w:tbl>
+      <w:tblPr>
+        <w:tblW w:w="5000" w:type="pct"/>
+        <w:tblBorders>
+          <w:top w:val="none"/>
+          <w:left w:val="none"/>
+          <w:bottom w:val="none"/>
+          <w:right w:val="none"/>
+          <w:insideH w:val="none"/>
+          <w:insideV w:val="none"/>
+        </w:tblBorders>
+      </w:tblPr>
+      <w:tblGrid>
+        <w:gridCol w:w="9026"/>
+      </w:tblGrid>
+      <w:tr>
+        <w:trPr>
+          <w:trHeight w:val="1100" w:hRule="atLeast"/>
+        </w:trPr>
+        <w:tc>
+          <w:tcPr>
+            <w:tcW w:w="5000" w:type="pct"/>
+            <w:shd w:val="clear" w:color="auto" w:fill="1A1A1A"/>
+            <w:tcMar>
+              <w:top w:w="220" w:type="dxa"/>
+              <w:left w:w="320" w:type="dxa"/>
+              <w:bottom w:w="220" w:type="dxa"/>
+              <w:right w:w="320" w:type="dxa"/>
+            </w:tcMar>
+          </w:tcPr>
+          <w:p>
+            <w:pPr>
+              <w:spacing w:before="0" w:after="60"/>
+              <w:shd w:val="clear" w:color="auto" w:fill="1A1A1A"/>
+            </w:pPr>
+            <w:r>
+              <w:rPr>
+                <w:b/>
+                <w:rFonts w:ascii="Calibri" w:hAnsi="Calibri" w:cs="Calibri"/>
+                <w:sz w:val="44"/>
+                <w:szCs w:val="44"/>
+                <w:color w:val="FFFFFF"/>
+              </w:rPr>
+              <w:t xml:space="preserve">Pand</w:t>
+            </w:r>
+            <w:r>
+              <w:rPr>
+                <w:b/>
+                <w:rFonts w:ascii="Calibri" w:hAnsi="Calibri" w:cs="Calibri"/>
+                <w:sz w:val="44"/>
+                <w:szCs w:val="44"/>
+                <w:color w:val="5AAA00"/>
+              </w:rPr>
+              <w:t xml:space="preserve">IQ</w:t>
+            </w:r>
+          </w:p>
+          <w:p>
+            <w:pPr>
+              <w:spacing w:before="0" w:after="0"/>
+              <w:shd w:val="clear" w:color="auto" w:fill="1A1A1A"/>
+            </w:pPr>
+            <w:r>
+              <w:rPr>
+                <w:b/>
+                <w:rFonts w:ascii="Calibri" w:hAnsi="Calibri" w:cs="Calibri"/>
+                <w:sz w:val="16"/>
+                <w:szCs w:val="16"/>
+                <w:color w:val="5AAA00"/>
+              </w:rPr>
+              <w:t xml:space="preserve">WONEN</w:t>
+            </w:r>
+          </w:p>
+        </w:tc>
+      </w:tr>
+    </w:tbl>
+    <w:tbl>
+      <w:tblPr>
+        <w:tblW w:w="5000" w:type="pct"/>
+        <w:tblBorders>
+          <w:top w:val="none"/>
+          <w:left w:val="none"/>
+          <w:bottom w:val="none"/>
+          <w:right w:val="none"/>
+          <w:insideH w:val="none"/>
+          <w:insideV w:val="none"/>
+        </w:tblBorders>
+      </w:tblPr>
+      <w:tblGrid>
+        <w:gridCol w:w="9026"/>
+      </w:tblGrid>
+      <w:tr>
+        <w:trPr>
+          <w:trHeight w:val="80" w:hRule="atLeast"/>
+        </w:trPr>
+        <w:tc>
+          <w:tcPr>
+            <w:tcW w:w="5000" w:type="pct"/>
+            <w:shd w:val="clear" w:color="auto" w:fill="D4E832"/>
+            <w:tcMar>
+              <w:top w:w="220" w:type="dxa"/>
+              <w:left w:w="320" w:type="dxa"/>
+              <w:bottom w:w="220" w:type="dxa"/>
+              <w:right w:w="320" w:type="dxa"/>
+            </w:tcMar>
+          </w:tcPr>
+          <w:p>
+            <w:pPr>
+              <w:spacing w:before="0" w:after="160"/>
+              <w:shd w:val="clear" w:color="auto" w:fill="D4E832"/>
+            </w:pPr>
+          </w:p>
+        </w:tc>
+      </w:tr>
+    </w:tbl>
+    <w:p>
+      <w:pPr>
+        <w:spacing w:before="400" w:after="0"/>
+      </w:pPr>
+    </w:p>
+    <w:p>
+      <w:pPr>
+        <w:spacing w:before="0" w:after="100"/>
+      </w:pPr>
       <w:r>
         <w:rPr>
           <w:b/>
-          <w:bCs/>
-        </w:rPr>
-        <w:t>PandIQ</w:t>
-      </w:r>
-      <w:proofErr w:type="spellEnd"/>
+          <w:rFonts w:ascii="Calibri" w:hAnsi="Calibri" w:cs="Calibri"/>
+          <w:sz w:val="44"/>
+          <w:szCs w:val="44"/>
+          <w:color w:val="1A1A1A"/>
+        </w:rPr>
+        <w:t xml:space="preserve">Uw regisseur in verduurzaming</w:t>
+      </w:r>
+    </w:p>
+    <w:p>
+      <w:pPr>
+        <w:spacing w:before="0" w:after="200"/>
+      </w:pPr>
+      <w:r>
+        <w:rPr>
+          <w:rFonts w:ascii="Calibri" w:hAnsi="Calibri" w:cs="Calibri"/>
+          <w:sz w:val="22"/>
+          <w:szCs w:val="22"/>
+          <w:color w:val="333333"/>
+        </w:rPr>
+        <w:t xml:space="preserve">Met de juiste keuzes haalt u meer uit uw woning en uw budget. Door maatregelen slim te combineren kan uw subsidie zelfs verdubbelen.</w:t>
+      </w:r>
+    </w:p>
+    <w:tbl>
+      <w:tblPr>
+        <w:tblW w:w="5000" w:type="pct"/>
+        <w:tblBorders>
+          <w:top w:val="none"/>
+          <w:left w:val="none"/>
+          <w:bottom w:val="none"/>
+          <w:right w:val="none"/>
+          <w:insideH w:val="none"/>
+          <w:insideV w:val="none"/>
+        </w:tblBorders>
+      </w:tblPr>
+      <w:tblGrid>
+        <w:gridCol w:w="9026"/>
+      </w:tblGrid>
+      <w:tr>
+        <w:trPr>
+          <w:trHeight w:val="400" w:hRule="atLeast"/>
+        </w:trPr>
+        <w:tc>
+          <w:tcPr>
+            <w:tcW w:w="5000" w:type="pct"/>
+            <w:shd w:val="clear" w:color="auto" w:fill="EEF6E0"/>
+            <w:tcMar>
+              <w:top w:w="220" w:type="dxa"/>
+              <w:left w:w="320" w:type="dxa"/>
+              <w:bottom w:w="220" w:type="dxa"/>
+              <w:right w:w="320" w:type="dxa"/>
+            </w:tcMar>
+          </w:tcPr>
+          <w:p>
+            <w:pPr>
+              <w:spacing w:before="0" w:after="0"/>
+              <w:shd w:val="clear" w:color="auto" w:fill="EEF6E0"/>
+            </w:pPr>
+            <w:r>
+              <w:rPr>
+                <w:rFonts w:ascii="Calibri" w:hAnsi="Calibri" w:cs="Calibri"/>
+                <w:sz w:val="22"/>
+                <w:szCs w:val="22"/>
+                <w:color w:val="1A4A00"/>
+              </w:rPr>
+              <w:t xml:space="preserve">PandIQ geeft u overzicht en helpt u met het inschatten van bouwkosten, het aanvragen van offertes, subsidieaanvragen en andere besparingen — alles in één dashboard.</w:t>
+            </w:r>
+          </w:p>
+        </w:tc>
+      </w:tr>
+    </w:tbl>
+    <w:p>
+      <w:pPr>
+        <w:spacing w:before="200" w:after="0"/>
+      </w:pPr>
+    </w:p>
+    <w:p>
+      <w:pPr>
+        <w:spacing w:before="0" w:after="160"/>
+      </w:pPr>
+      <w:r>
+        <w:rPr>
+          <w:rFonts w:ascii="Calibri" w:hAnsi="Calibri" w:cs="Calibri"/>
+          <w:sz w:val="22"/>
+          <w:szCs w:val="22"/>
+          <w:color w:val="333333"/>
+        </w:rPr>
+        <w:t xml:space="preserve">Maak een account aan en ontdek wat er mogelijk is. Het kost weinig moeite en levert vaak direct voordeel op.</w:t>
+      </w:r>
+    </w:p>
+    <w:p>
+      <w:pPr>
+        <w:spacing w:before="80" w:after="280"/>
+      </w:pPr>
       <w:r>
         <w:rPr>
           <w:b/>
-          <w:bCs/>
-        </w:rPr>
-        <w:t>: Uw regisseur in verduurzaming</w:t>
-      </w:r>
-    </w:p>
-    <w:p>
-      <w:pPr>
-        <w:spacing w:before="320" w:after="80"/>
-      </w:pPr>
-      <w:r>
-        <w:t xml:space="preserve">Het optimaal combineren van maatregelen kan leiden tot een </w:t>
-      </w:r>
-      <w:r>
-        <w:rPr>
-          <w:b/>
-          <w:bCs/>
-        </w:rPr>
-        <w:t>verdubbeling van het subsidiebedrag per m²</w:t>
-      </w:r>
-      <w:r>
-        <w:t xml:space="preserve">. </w:t>
-      </w:r>
-      <w:proofErr w:type="spellStart"/>
-      <w:r>
-        <w:rPr>
-          <w:b/>
-          <w:bCs/>
-        </w:rPr>
-        <w:t>PandIQ</w:t>
-      </w:r>
-      <w:proofErr w:type="spellEnd"/>
-      <w:r>
-        <w:rPr>
-          <w:b/>
-          <w:bCs/>
-        </w:rPr>
-        <w:t xml:space="preserve"> voert een volledige subsidiecheck uit en verzorgt de aanvraag, zodat u geen euro laat liggen.</w:t>
-      </w:r>
-      <w:r>
-        <w:t xml:space="preserve"> Alle technische rapporten, offertes en de status van uw uitbetaling vindt u terug in uw </w:t>
-      </w:r>
-      <w:r>
-        <w:rPr>
-          <w:b/>
-          <w:bCs/>
-        </w:rPr>
-        <w:t>persoonlijk dashboard</w:t>
-      </w:r>
-      <w:r>
-        <w:t>.</w:t>
-      </w:r>
-    </w:p>
-    <w:p>
-      <w:pPr>
-        <w:spacing w:before="320" w:after="80"/>
-      </w:pPr>
-    </w:p>
-    <w:p>
-      <w:pPr>
-        <w:spacing w:before="320" w:after="80"/>
-      </w:pPr>
-    </w:p>
-    <w:p>
-      <w:pPr>
-        <w:spacing w:before="320" w:after="80"/>
-      </w:pPr>
-    </w:p>
-    <w:p>
-      <w:pPr>
-        <w:pBdr>
-          <w:left w:val="single" w:sz="12" w:space="4" w:color="2E6BE6"/>
-        </w:pBdr>
-        <w:shd w:val="clear" w:color="auto" w:fill="F4F6FA"/>
-        <w:spacing w:before="80"/>
-        <w:ind w:left="200"/>
+          <w:rFonts w:ascii="Calibri" w:hAnsi="Calibri" w:cs="Calibri"/>
+          <w:sz w:val="26"/>
+          <w:szCs w:val="26"/>
+          <w:color w:val="5AAA00"/>
+        </w:rPr>
+        <w:t xml:space="preserve">Word geen slapende betaler, maar wees slim en bespaar.</w:t>
+      </w:r>
+    </w:p>
+    <w:tbl>
+      <w:tblPr>
+        <w:tblW w:w="5000" w:type="pct"/>
+        <w:tblBorders>
+          <w:top w:val="none"/>
+          <w:left w:val="none"/>
+          <w:bottom w:val="none"/>
+          <w:right w:val="none"/>
+          <w:insideH w:val="none"/>
+          <w:insideV w:val="none"/>
+        </w:tblBorders>
+      </w:tblPr>
+      <w:tblGrid>
+        <w:gridCol w:w="9026"/>
+      </w:tblGrid>
+      <w:tr>
+        <w:trPr>
+          <w:trHeight w:val="480" w:hRule="atLeast"/>
+        </w:trPr>
+        <w:tc>
+          <w:tcPr>
+            <w:tcW w:w="5000" w:type="pct"/>
+            <w:shd w:val="clear" w:color="auto" w:fill="D4E832"/>
+            <w:tcMar>
+              <w:top w:w="180" w:type="dxa"/>
+              <w:left w:w="320" w:type="dxa"/>
+              <w:bottom w:w="180" w:type="dxa"/>
+              <w:right w:w="320" w:type="dxa"/>
+            </w:tcMar>
+          </w:tcPr>
+          <w:p>
+            <w:pPr>
+              <w:spacing w:before="0" w:after="0"/>
+              <w:shd w:val="clear" w:color="auto" w:fill="D4E832"/>
+            </w:pPr>
+            <w:r>
+              <w:rPr>
+                <w:rFonts w:ascii="Calibri" w:hAnsi="Calibri" w:cs="Calibri"/>
+                <w:sz w:val="22"/>
+                <w:szCs w:val="22"/>
+                <w:color w:val="1A1A1A"/>
+              </w:rPr>
+              <w:t xml:space="preserve">Bekijk uw mogelijkheden op </w:t>
+            </w:r>
+            <w:r>
+              <w:rPr>
+                <w:b/>
+                <w:rFonts w:ascii="Calibri" w:hAnsi="Calibri" w:cs="Calibri"/>
+                <w:sz w:val="22"/>
+                <w:szCs w:val="22"/>
+                <w:color w:val="1A1A1A"/>
+              </w:rPr>
+              <w:t xml:space="preserve">pandiq.nl/dashboard</w:t>
+            </w:r>
+            <w:r>
+              <w:rPr>
+                <w:b/>
+                <w:rFonts w:ascii="Calibri" w:hAnsi="Calibri" w:cs="Calibri"/>
+                <w:sz w:val="24"/>
+                <w:szCs w:val="24"/>
+                <w:color w:val="1A1A1A"/>
+              </w:rPr>
+              <w:t xml:space="preserve">  →</w:t>
+            </w:r>
+          </w:p>
+        </w:tc>
+      </w:tr>
+    </w:tbl>
+    <w:p>
+      <w:pPr>
+        <w:spacing w:before="480" w:after="0"/>
+      </w:pPr>
+    </w:p>
+    <w:p>
+      <w:pPr>
+        <w:spacing w:before="0" w:after="0"/>
       </w:pPr>
       <w:r>
         <w:rPr>
           <w:i/>
-          <w:iCs/>
-          <w:color w:val="5A6A85"/>
+          <w:rFonts w:ascii="Calibri" w:hAnsi="Calibri" w:cs="Calibri"/>
           <w:sz w:val="18"/>
           <w:szCs w:val="18"/>
-        </w:rPr>
-        <w:t>Disclaimer: dit rapport is indicatief en gebaseerd op registraties en aannames. Aan dit document kunnen geen rechten worden ontleend. Uitvoering vereist altijd verificatie op locatie en controle van actuele regelgeving.</w:t>
+          <w:color w:val="999999"/>
+        </w:rPr>
+        <w:t xml:space="preserve">Disclaimer: dit rapport is indicatief en gebaseerd op registraties en aannames. Aan dit document kunnen geen rechten worden ontleend. Uitvoering vereist altijd verificatie op locatie en controle van actuele regelgeving.</w:t>
       </w:r>
     </w:p>
     <w:sectPr>
-      <w:headerReference w:type="default" r:id="rId7"/>
-      <w:footerReference w:type="default" r:id="rId8"/>
+      <w:headerReference w:type="default" r:id="rId10"/>
+      <w:footerReference w:type="default" r:id="rId11"/>
+      <w:headerReference w:type="first" r:id="rId14"/>
       <w:pgSz w:w="11906" w:h="16838"/>
       <w:pgMar w:top="1134" w:right="1134" w:bottom="1134" w:left="1134" w:header="708" w:footer="708" w:gutter="0"/>
       <w:cols w:space="708"/>
+      <w:titlePg/>
       <w:docGrid w:linePitch="360"/>
     </w:sectPr>
   </w:body>
@@ -3902,16 +4763,15 @@
       <w:tblBorders>
         <w:top w:val="none" w:sz="0" w:space="0" w:color="FFFFFF"/>
         <w:left w:val="none" w:sz="0" w:space="0" w:color="FFFFFF"/>
-        <w:bottom w:val="single" w:sz="4" w:space="0" w:color="2E6BE6"/>
         <w:right w:val="none" w:sz="0" w:space="0" w:color="FFFFFF"/>
-        <w:insideH w:val="single" w:sz="4" w:space="0" w:color="auto"/>
-        <w:insideV w:val="single" w:sz="4" w:space="0" w:color="auto"/>
+        <w:insideH w:val="none" w:sz="0" w:space="0" w:color="FFFFFF"/>
+        <w:insideV w:val="none" w:sz="0" w:space="0" w:color="FFFFFF"/>
+        <w:bottom w:val="single" w:sz="6" w:space="0" w:color="D4E832"/>
       </w:tblBorders>
       <w:tblCellMar>
         <w:left w:w="10" w:type="dxa"/>
         <w:right w:w="10" w:type="dxa"/>
       </w:tblCellMar>
-      <w:tblLook w:val="0000" w:firstRow="0" w:lastRow="0" w:firstColumn="0" w:lastColumn="0" w:noHBand="0" w:noVBand="0"/>
     </w:tblPr>
     <w:tblGrid>
       <w:gridCol w:w="4513"/>
@@ -3930,30 +4790,38 @@
           <w:vAlign w:val="center"/>
         </w:tcPr>
         <w:p>
-          <w:proofErr w:type="spellStart"/>
+          <w:pPr>
+            <w:spacing w:before="0" w:after="0"/>
+          </w:pPr>
           <w:r>
             <w:rPr>
-              <w:rFonts w:ascii="Georgia" w:eastAsia="Georgia" w:hAnsi="Georgia" w:cs="Georgia"/>
               <w:b/>
-              <w:bCs/>
-              <w:color w:val="0B1F3A"/>
+              <w:rFonts w:ascii="Calibri" w:hAnsi="Calibri" w:cs="Calibri"/>
               <w:sz w:val="28"/>
               <w:szCs w:val="28"/>
+              <w:color w:val="1A1A1A"/>
             </w:rPr>
-            <w:t>Pand</w:t>
+            <w:t xml:space="preserve">Pand</w:t>
           </w:r>
           <w:r>
             <w:rPr>
-              <w:rFonts w:ascii="Georgia" w:eastAsia="Georgia" w:hAnsi="Georgia" w:cs="Georgia"/>
               <w:b/>
-              <w:bCs/>
-              <w:color w:val="3DBDBD"/>
+              <w:rFonts w:ascii="Calibri" w:hAnsi="Calibri" w:cs="Calibri"/>
               <w:sz w:val="28"/>
               <w:szCs w:val="28"/>
+              <w:color w:val="5AAA00"/>
             </w:rPr>
-            <w:t>IQ</w:t>
+            <w:t xml:space="preserve">IQ</w:t>
           </w:r>
-          <w:proofErr w:type="spellEnd"/>
+          <w:r>
+            <w:rPr>
+              <w:rFonts w:ascii="Calibri" w:hAnsi="Calibri" w:cs="Calibri"/>
+              <w:sz w:val="18"/>
+              <w:szCs w:val="18"/>
+              <w:color w:val="5AAA00"/>
+            </w:rPr>
+            <w:t xml:space="preserve"> Wonen</w:t>
+          </w:r>
         </w:p>
       </w:tc>
       <w:tc>
@@ -3969,26 +4837,18 @@
         </w:tcPr>
         <w:p>
           <w:pPr>
+            <w:spacing w:before="0" w:after="0"/>
             <w:jc w:val="right"/>
           </w:pPr>
           <w:r>
             <w:rPr>
-              <w:color w:val="5A6A85"/>
+              <w:rFonts w:ascii="Calibri" w:hAnsi="Calibri" w:cs="Calibri"/>
               <w:sz w:val="18"/>
               <w:szCs w:val="18"/>
+              <w:color w:val="666666"/>
             </w:rPr>
-            <w:t xml:space="preserve">Isolatie </w:t>
+            <w:t xml:space="preserve">Isolatie Quickscan</w:t>
           </w:r>
-          <w:proofErr w:type="spellStart"/>
-          <w:r>
-            <w:rPr>
-              <w:color w:val="5A6A85"/>
-              <w:sz w:val="18"/>
-              <w:szCs w:val="18"/>
-            </w:rPr>
-            <w:t>Quickscan</w:t>
-          </w:r>
-          <w:proofErr w:type="spellEnd"/>
         </w:p>
       </w:tc>
     </w:tr>
@@ -3996,6 +4856,16 @@
   <w:p>
     <w:pPr>
       <w:spacing w:before="60" w:after="60"/>
+    </w:pPr>
+  </w:p>
+</w:hdr>
+</file>
+
+<file path=word/header2.xml><?xml version="1.0" encoding="utf-8"?>
+<w:hdr xmlns:m="http://schemas.openxmlformats.org/officeDocument/2006/math" xmlns:mc="http://schemas.openxmlformats.org/markup-compatibility/2006" xmlns:mo="http://schemas.microsoft.com/office/mac/office/2008/main" xmlns:mv="urn:schemas-microsoft-com:mac:vml" xmlns:o="urn:schemas-microsoft-com:office:office" xmlns:r="http://schemas.openxmlformats.org/officeDocument/2006/relationships" xmlns:v="urn:schemas-microsoft-com:vml" xmlns:w10="urn:schemas-microsoft-com:office:word" xmlns:w14="http://schemas.microsoft.com/office/word/2010/wordml" xmlns:w="http://schemas.openxmlformats.org/wordprocessingml/2006/main" xmlns:wne="http://schemas.microsoft.com/office/word/2006/wordml" xmlns:wp14="http://schemas.microsoft.com/office/word/2010/wordprocessingDrawing" xmlns:wp="http://schemas.openxmlformats.org/drawingml/2006/wordprocessingDrawing" xmlns:wpc="http://schemas.microsoft.com/office/word/2010/wordprocessingCanvas" xmlns:wpg="http://schemas.microsoft.com/office/word/2010/wordprocessingGroup" xmlns:wpi="http://schemas.microsoft.com/office/word/2010/wordprocessingInk" xmlns:wps="http://schemas.microsoft.com/office/word/2010/wordprocessingShape" mc:Ignorable="w14 wp14">
+  <w:p>
+    <w:pPr>
+      <w:spacing w:before="0" w:after="0"/>
     </w:pPr>
   </w:p>
 </w:hdr>
@@ -4058,6 +4928,92 @@
     </w:lvl>
   </w:abstractNum>
   <w:abstractNum w:abstractNumId="1" w15:restartNumberingAfterBreak="0">
+    <w:nsid w:val="0A1E623C"/>
+    <w:multiLevelType w:val="hybridMultilevel"/>
+    <w:tmpl w:val="A9300544"/>
+    <w:lvl w:ilvl="0" w:tplc="0413000F">
+      <w:start w:val="1"/>
+      <w:numFmt w:val="decimal"/>
+      <w:lvlText w:val="%1."/>
+      <w:lvlJc w:val="left"/>
+      <w:pPr>
+        <w:ind w:left="720" w:hanging="360"/>
+      </w:pPr>
+    </w:lvl>
+    <w:lvl w:ilvl="1" w:tplc="04130019" w:tentative="1">
+      <w:start w:val="1"/>
+      <w:numFmt w:val="lowerLetter"/>
+      <w:lvlText w:val="%2."/>
+      <w:lvlJc w:val="left"/>
+      <w:pPr>
+        <w:ind w:left="1440" w:hanging="360"/>
+      </w:pPr>
+    </w:lvl>
+    <w:lvl w:ilvl="2" w:tplc="0413001B" w:tentative="1">
+      <w:start w:val="1"/>
+      <w:numFmt w:val="lowerRoman"/>
+      <w:lvlText w:val="%3."/>
+      <w:lvlJc w:val="right"/>
+      <w:pPr>
+        <w:ind w:left="2160" w:hanging="180"/>
+      </w:pPr>
+    </w:lvl>
+    <w:lvl w:ilvl="3" w:tplc="0413000F" w:tentative="1">
+      <w:start w:val="1"/>
+      <w:numFmt w:val="decimal"/>
+      <w:lvlText w:val="%4."/>
+      <w:lvlJc w:val="left"/>
+      <w:pPr>
+        <w:ind w:left="2880" w:hanging="360"/>
+      </w:pPr>
+    </w:lvl>
+    <w:lvl w:ilvl="4" w:tplc="04130019" w:tentative="1">
+      <w:start w:val="1"/>
+      <w:numFmt w:val="lowerLetter"/>
+      <w:lvlText w:val="%5."/>
+      <w:lvlJc w:val="left"/>
+      <w:pPr>
+        <w:ind w:left="3600" w:hanging="360"/>
+      </w:pPr>
+    </w:lvl>
+    <w:lvl w:ilvl="5" w:tplc="0413001B" w:tentative="1">
+      <w:start w:val="1"/>
+      <w:numFmt w:val="lowerRoman"/>
+      <w:lvlText w:val="%6."/>
+      <w:lvlJc w:val="right"/>
+      <w:pPr>
+        <w:ind w:left="4320" w:hanging="180"/>
+      </w:pPr>
+    </w:lvl>
+    <w:lvl w:ilvl="6" w:tplc="0413000F" w:tentative="1">
+      <w:start w:val="1"/>
+      <w:numFmt w:val="decimal"/>
+      <w:lvlText w:val="%7."/>
+      <w:lvlJc w:val="left"/>
+      <w:pPr>
+        <w:ind w:left="5040" w:hanging="360"/>
+      </w:pPr>
+    </w:lvl>
+    <w:lvl w:ilvl="7" w:tplc="04130019" w:tentative="1">
+      <w:start w:val="1"/>
+      <w:numFmt w:val="lowerLetter"/>
+      <w:lvlText w:val="%8."/>
+      <w:lvlJc w:val="left"/>
+      <w:pPr>
+        <w:ind w:left="5760" w:hanging="360"/>
+      </w:pPr>
+    </w:lvl>
+    <w:lvl w:ilvl="8" w:tplc="0413001B" w:tentative="1">
+      <w:start w:val="1"/>
+      <w:numFmt w:val="lowerRoman"/>
+      <w:lvlText w:val="%9."/>
+      <w:lvlJc w:val="right"/>
+      <w:pPr>
+        <w:ind w:left="6480" w:hanging="180"/>
+      </w:pPr>
+    </w:lvl>
+  </w:abstractNum>
+  <w:abstractNum w:abstractNumId="2" w15:restartNumberingAfterBreak="0">
     <w:nsid w:val="4FD55F3A"/>
     <w:multiLevelType w:val="hybridMultilevel"/>
     <w:tmpl w:val="1C36CA24"/>
@@ -4143,7 +5099,7 @@
       </w:pPr>
     </w:lvl>
   </w:abstractNum>
-  <w:abstractNum w:abstractNumId="2" w15:restartNumberingAfterBreak="0">
+  <w:abstractNum w:abstractNumId="3" w15:restartNumberingAfterBreak="0">
     <w:nsid w:val="72964827"/>
     <w:multiLevelType w:val="multilevel"/>
     <w:tmpl w:val="75189EAE"/>
@@ -4293,7 +5249,7 @@
     </w:lvl>
   </w:abstractNum>
   <w:num w:numId="1" w16cid:durableId="1737582796">
-    <w:abstractNumId w:val="1"/>
+    <w:abstractNumId w:val="2"/>
     <w:lvlOverride w:ilvl="0">
       <w:startOverride w:val="1"/>
     </w:lvlOverride>
@@ -4305,7 +5261,10 @@
     </w:lvlOverride>
   </w:num>
   <w:num w:numId="3" w16cid:durableId="2021732530">
-    <w:abstractNumId w:val="2"/>
+    <w:abstractNumId w:val="3"/>
+  </w:num>
+  <w:num w:numId="4" w16cid:durableId="1974408977">
+    <w:abstractNumId w:val="1"/>
   </w:num>
 </w:numbering>
 </file>

</xml_diff>

<commit_message>
FASE 5: rapportage uitbreidingen — aanname huidige situatie per bouwdeel + diverse verbeteringen
- Voeg 'Aanname huidige situatie' toe per bouwdeel (dak/vloer/spouw/gevel/glas) in MD en DOCX
- Vereenvoudig subsidietabel: enkel/meer → enkel bedrag + meervoudig disclaimer
- Verwijder onnodige hoofdstuktitels (Aanbevolen maatregelen, Bouwfysische analyse, Aandachtspunten)
- Voeg TVT > 20 jaar opmerking toe: enkel interessant bij groot onderhoud of verbouw
- Toon score+label dikgedrukt per bouwdeel; verwijder score-tabel uit Word
- ISDE-check per element: toon aanname-situatie ook als Rc al voldoet
- Voeg totaaloverzicht toe onderaan bouwfysische analyse (enkelvoudig vs meervoudig tarief)
- Streefwaarde Rc toegevoegd naast huidige Rc per bouwdeel
- Verwijder welstand-waarschuwing (Check 7) en dubbele ISDE-check (Check 1)
- Nieuwe modules: oppervlaktes.py, waarschuwingen.py, aannames.py

Co-Authored-By: Claude Sonnet 4.6 <noreply@anthropic.com>
</commit_message>
<xml_diff>
--- a/output/quickscan_8501BR_25.docx
+++ b/output/quickscan_8501BR_25.docx
@@ -182,7 +182,7 @@
           <w:szCs w:val="22"/>
           <w:color w:val="666666"/>
         </w:rPr>
-        <w:t xml:space="preserve">6 april 2026</w:t>
+        <w:t xml:space="preserve">30 april 2026</w:t>
       </w:r>
     </w:p>
     <w:p>
@@ -257,21 +257,29 @@
         <w:rPr>
           <w:color w:val="1A2340"/>
         </w:rPr>
+        <w:t xml:space="preserve">Let op: voor uw woning is geen actueel energielabel gevonden in EP-Online. De onderstaande scores zijn indicatief op basis van bouwjaar 1876 en vergelijkbare woningen uit dezelfde periode. Uw woning uit 1876 heeft op alle vier onderdelen een significant verbeterpotentieel. Uw indicatieve ISDE-subsidie voor de relevante maatregelen samen: tot €1,871. Bereken uw persoonlijke subsidie en vraag een vrijblijvend adviesgesprek aan via www.pandiq.nl/subsidie.</w:t>
+      </w:r>
+    </w:p>
+    <w:p>
+      <w:pPr>
+        <w:spacing w:before="120" w:after="120"/>
+        <w:rPr>
+          <w:color w:val="1A2340"/>
+        </w:rPr>
+      </w:pPr>
+    </w:p>
+    <w:p>
+      <w:pPr>
+        <w:spacing w:before="60" w:after="160"/>
+        <w:rPr>
+          <w:color w:val="1A2340"/>
+        </w:rPr>
+      </w:pPr>
+      <w:r>
+        <w:rPr>
+          <w:color w:val="1A2340"/>
+        </w:rPr>
         <w:t xml:space="preserve">Dit rapport is opgesteld op basis van openbare registraties (BAG en EP-Online) voor Visstraat 25, 8501BR Joure. De woning is gebouwd in 1876.</w:t>
-      </w:r>
-      <w:proofErr w:type="spellStart"/>
-      <w:r>
-        <w:rPr>
-          <w:color w:val="1A2340"/>
-        </w:rPr>
-        <w:t/>
-      </w:r>
-      <w:proofErr w:type="spellEnd"/>
-      <w:r>
-        <w:rPr>
-          <w:color w:val="1A2340"/>
-        </w:rPr>
-        <w:t/>
       </w:r>
     </w:p>
     <w:p>
@@ -442,20 +450,6 @@
         </w:rPr>
         <w:t/>
       </w:r>
-      <w:proofErr w:type="spellStart"/>
-      <w:r>
-        <w:rPr>
-          <w:color w:val="1A2340"/>
-        </w:rPr>
-        <w:t/>
-      </w:r>
-      <w:proofErr w:type="spellEnd"/>
-      <w:r>
-        <w:rPr>
-          <w:color w:val="1A2340"/>
-        </w:rPr>
-        <w:t/>
-      </w:r>
     </w:p>
     <w:p>
       <w:pPr>
@@ -508,6 +502,20 @@
         <w:rPr>
           <w:color w:val="1A2340"/>
         </w:rPr>
+        <w:t>Financiële indicaties zijn schattingen op basis van bouwjaar en gemiddelde woningkenmerken. Definitieve bedragen hangen af van de werkelijke situatie ter plaatse.</w:t>
+      </w:r>
+    </w:p>
+    <w:p>
+      <w:pPr>
+        <w:spacing w:before="60" w:after="160"/>
+        <w:rPr>
+          <w:color w:val="1A2340"/>
+        </w:rPr>
+      </w:pPr>
+      <w:r>
+        <w:rPr>
+          <w:color w:val="1A2340"/>
+        </w:rPr>
         <w:t>De informatie is bedoeld als eerste inzicht en kan afwijken van de werkelijke situatie. Wij adviseren om v</w:t>
       </w:r>
       <w:r>
@@ -546,21 +554,7 @@
         <w:rPr>
           <w:color w:val="1A2340"/>
         </w:rPr>
-        <w:t xml:space="preserve"> de gegevens kunnen onvolledig of onjuist zijn en </w:t>
-      </w:r>
-      <w:proofErr w:type="spellStart"/>
-      <w:r>
-        <w:rPr>
-          <w:color w:val="1A2340"/>
-        </w:rPr>
-        <w:t>PandIQ</w:t>
-      </w:r>
-      <w:proofErr w:type="spellEnd"/>
-      <w:r>
-        <w:rPr>
-          <w:color w:val="1A2340"/>
-        </w:rPr>
-        <w:t xml:space="preserve"> is niet aansprakelijk voor eventuele fouten of gevolgen van gebruik.</w:t>
+        <w:t xml:space="preserve"> de gegevens kunnen onvolledig of onjuist zijn en PandIQ is niet aansprakelijk voor eventuele fouten of gevolgen van gebruik.</w:t>
       </w:r>
     </w:p>
     <w:p>
@@ -782,7 +776,7 @@
                 <w:color w:val="1F2937"/>
                 <w:sz w:val="22"/>
               </w:rPr>
-              <w:t xml:space="preserve">6 april 2026</w:t>
+              <w:t xml:space="preserve">30 april 2026</w:t>
             </w:r>
           </w:p>
         </w:tc>
@@ -1156,26 +1150,6 @@
               </w:rPr>
               <w:t xml:space="preserve">—</w:t>
             </w:r>
-            <w:proofErr w:type="spellStart"/>
-            <w:r>
-              <w:rPr>
-                <w:rFonts w:ascii="Calibri" w:hAnsi="Calibri"/>
-                <w:b w:val="0"/>
-                <w:color w:val="1F2937"/>
-                <w:sz w:val="22"/>
-              </w:rPr>
-              <w:t/>
-            </w:r>
-            <w:proofErr w:type="spellEnd"/>
-            <w:r>
-              <w:rPr>
-                <w:rFonts w:ascii="Calibri" w:hAnsi="Calibri"/>
-                <w:b w:val="0"/>
-                <w:color w:val="1F2937"/>
-                <w:sz w:val="22"/>
-              </w:rPr>
-              <w:t/>
-            </w:r>
           </w:p>
         </w:tc>
       </w:tr>
@@ -1415,20 +1389,6 @@
         </w:rPr>
         <w:t xml:space="preserve">Uw woning stamt uit een periode waarin energieverbruik nog geen rol speelde bij het ontwerp. Kenmerkend zijn de houten begane grondvloeren en gevels die tot circa 1930 massief (steens) werden uitgevoerd of daarna voorzien zijn van een zeer beperkte, ongeïsoleerde luchtspouw. Isolatie ontbrak oorspronkelijk volledig, waardoor woningen uit deze periode tot de meest energie-intensieve van Nederland behoren — maar ook tot de categorie met de grootste besparingspotentie.</w:t>
       </w:r>
-      <w:proofErr w:type="spellStart"/>
-      <w:r>
-        <w:rPr>
-          <w:color w:val="1A2340"/>
-        </w:rPr>
-        <w:t/>
-      </w:r>
-      <w:proofErr w:type="spellEnd"/>
-      <w:r>
-        <w:rPr>
-          <w:color w:val="1A2340"/>
-        </w:rPr>
-        <w:t/>
-      </w:r>
     </w:p>
     <w:p>
       <w:r>
@@ -1463,539 +1423,14 @@
     </w:p>
     <w:p>
       <w:pPr>
-        <w:spacing w:before="120" w:after="120"/>
-      </w:pPr>
-    </w:p>
-    <w:tbl>
-      <w:tblPr>
-        <w:tblW w:w="9026" w:type="dxa"/>
-        <w:tblBorders>
-          <w:top w:val="single" w:sz="4" w:space="0" w:color="F2F2F2" w:themeColor="background1" w:themeShade="F2"/>
-          <w:left w:val="single" w:sz="4" w:space="0" w:color="F2F2F2" w:themeColor="background1" w:themeShade="F2"/>
-          <w:bottom w:val="single" w:sz="4" w:space="0" w:color="F2F2F2" w:themeColor="background1" w:themeShade="F2"/>
-          <w:right w:val="single" w:sz="4" w:space="0" w:color="F2F2F2" w:themeColor="background1" w:themeShade="F2"/>
-          <w:insideH w:val="single" w:sz="4" w:space="0" w:color="F2F2F2" w:themeColor="background1" w:themeShade="F2"/>
-          <w:insideV w:val="single" w:sz="4" w:space="0" w:color="F2F2F2" w:themeColor="background1" w:themeShade="F2"/>
-        </w:tblBorders>
-        <w:tblCellMar>
-          <w:left w:w="10" w:type="dxa"/>
-          <w:right w:w="10" w:type="dxa"/>
-        </w:tblCellMar>
-        <w:tblLook w:val="0000" w:firstRow="0" w:lastRow="0" w:firstColumn="0" w:lastColumn="0" w:noHBand="0" w:noVBand="0"/>
-      </w:tblPr>
-      <w:tblGrid>
-        <w:gridCol w:w="2295"/>
-        <w:gridCol w:w="1759"/>
-        <w:gridCol w:w="4972"/>
-      </w:tblGrid>
-      <w:tr>
-        <w:tc>
-          <w:tcPr>
-            <w:tcW w:w="2400" w:type="dxa"/>
-            <w:shd w:val="clear" w:color="auto" w:fill="5AAA00"/>
-            <w:tcMar>
-              <w:top w:w="80" w:type="dxa"/>
-              <w:left w:w="120" w:type="dxa"/>
-              <w:bottom w:w="80" w:type="dxa"/>
-              <w:right w:w="120" w:type="dxa"/>
-            </w:tcMar>
-          </w:tcPr>
-          <w:p>
-            <w:pPr>
-              <w:rPr>
-                <w:color w:val="FFFFFF" w:themeColor="background1"/>
-              </w:rPr>
-            </w:pPr>
-            <w:r>
-              <w:rPr>
-                <w:b/>
-                <w:bCs/>
-                <w:color w:val="FFFFFF" w:themeColor="background1"/>
-                <w:sz w:val="20"/>
-                <w:szCs w:val="20"/>
-              </w:rPr>
-              <w:t>Onderdeel</w:t>
-            </w:r>
-          </w:p>
-        </w:tc>
-        <w:tc>
-          <w:tcPr>
-            <w:tcW w:w="1400" w:type="dxa"/>
-            <w:shd w:val="clear" w:color="auto" w:fill="5AAA00"/>
-            <w:tcMar>
-              <w:top w:w="80" w:type="dxa"/>
-              <w:left w:w="120" w:type="dxa"/>
-              <w:bottom w:w="80" w:type="dxa"/>
-              <w:right w:w="120" w:type="dxa"/>
-            </w:tcMar>
-          </w:tcPr>
-          <w:p>
-            <w:pPr>
-              <w:rPr>
-                <w:color w:val="FFFFFF" w:themeColor="background1"/>
-              </w:rPr>
-            </w:pPr>
-            <w:r>
-              <w:rPr>
-                <w:b/>
-                <w:bCs/>
-                <w:color w:val="FFFFFF" w:themeColor="background1"/>
-                <w:sz w:val="20"/>
-                <w:szCs w:val="20"/>
-              </w:rPr>
-              <w:t>Score</w:t>
-            </w:r>
-          </w:p>
-        </w:tc>
-        <w:tc>
-          <w:tcPr>
-            <w:tcW w:w="5226" w:type="dxa"/>
-            <w:shd w:val="clear" w:color="auto" w:fill="5AAA00"/>
-            <w:tcMar>
-              <w:top w:w="80" w:type="dxa"/>
-              <w:left w:w="120" w:type="dxa"/>
-              <w:bottom w:w="80" w:type="dxa"/>
-              <w:right w:w="120" w:type="dxa"/>
-            </w:tcMar>
-          </w:tcPr>
-          <w:p>
-            <w:pPr>
-              <w:rPr>
-                <w:color w:val="FFFFFF" w:themeColor="background1"/>
-              </w:rPr>
-            </w:pPr>
-            <w:r>
-              <w:rPr>
-                <w:b/>
-                <w:bCs/>
-                <w:color w:val="FFFFFF" w:themeColor="background1"/>
-                <w:sz w:val="20"/>
-                <w:szCs w:val="20"/>
-              </w:rPr>
-              <w:t>Beoordeling</w:t>
-            </w:r>
-          </w:p>
-        </w:tc>
-      </w:tr>
-      <w:tr>
-        <w:tc>
-          <w:tcPr>
-            <w:tcW w:w="2400" w:type="dxa"/>
-            <w:shd w:val="clear" w:color="auto" w:fill="FFFFFF"/>
-            <w:tcMar>
-              <w:top w:w="80" w:type="dxa"/>
-              <w:left w:w="120" w:type="dxa"/>
-              <w:bottom w:w="80" w:type="dxa"/>
-              <w:right w:w="120" w:type="dxa"/>
-            </w:tcMar>
-          </w:tcPr>
-          <w:p>
-            <w:r>
-              <w:rPr>
-                <w:color w:val="1A2340"/>
-                <w:sz w:val="20"/>
-                <w:szCs w:val="20"/>
-              </w:rPr>
-              <w:t>Dak</w:t>
-            </w:r>
-          </w:p>
-        </w:tc>
-        <w:tc>
-          <w:tcPr>
-            <w:tcW w:w="1400" w:type="dxa"/>
-            <w:shd w:val="clear" w:color="auto" w:fill="FFFFFF"/>
-            <w:tcMar>
-              <w:top w:w="80" w:type="dxa"/>
-              <w:left w:w="120" w:type="dxa"/>
-              <w:bottom w:w="80" w:type="dxa"/>
-              <w:right w:w="120" w:type="dxa"/>
-            </w:tcMar>
-          </w:tcPr>
-          <w:p>
-            <w:r>
-              <w:rPr>
-                <w:color w:val="1A2340"/>
-              </w:rPr>
-              <w:t xml:space="preserve">4/5</w:t>
-            </w:r>
-            <w:proofErr w:type="spellStart"/>
-            <w:r>
-              <w:rPr>
-                <w:color w:val="1A2340"/>
-              </w:rPr>
-              <w:t/>
-            </w:r>
-            <w:proofErr w:type="spellEnd"/>
-            <w:r>
-              <w:rPr>
-                <w:color w:val="1A2340"/>
-              </w:rPr>
-              <w:t/>
-            </w:r>
-            <w:r>
-              <w:rPr>
-                <w:color w:val="5A6A85"/>
-                <w:sz w:val="20"/>
-                <w:szCs w:val="20"/>
-              </w:rPr>
-              <w:t/>
-            </w:r>
-          </w:p>
-        </w:tc>
-        <w:tc>
-          <w:tcPr>
-            <w:tcW w:w="5226" w:type="dxa"/>
-            <w:shd w:val="clear" w:color="auto" w:fill="FFFFFF"/>
-            <w:tcMar>
-              <w:top w:w="80" w:type="dxa"/>
-              <w:left w:w="120" w:type="dxa"/>
-              <w:bottom w:w="80" w:type="dxa"/>
-              <w:right w:w="120" w:type="dxa"/>
-            </w:tcMar>
-          </w:tcPr>
-          <w:p>
-            <w:r>
-              <w:rPr>
-                <w:color w:val="1A2340"/>
-              </w:rPr>
-              <w:t xml:space="preserve">Slecht</w:t>
-            </w:r>
-            <w:proofErr w:type="spellStart"/>
-            <w:r>
-              <w:rPr>
-                <w:color w:val="1A2340"/>
-              </w:rPr>
-              <w:t/>
-            </w:r>
-            <w:proofErr w:type="spellEnd"/>
-            <w:r>
-              <w:rPr>
-                <w:color w:val="1A2340"/>
-              </w:rPr>
-              <w:t/>
-            </w:r>
-          </w:p>
-        </w:tc>
-      </w:tr>
-      <w:tr>
-        <w:tc>
-          <w:tcPr>
-            <w:tcW w:w="2400" w:type="dxa"/>
-            <w:shd w:val="clear" w:color="auto" w:fill="FFFFFF"/>
-            <w:tcMar>
-              <w:top w:w="80" w:type="dxa"/>
-              <w:left w:w="120" w:type="dxa"/>
-              <w:bottom w:w="80" w:type="dxa"/>
-              <w:right w:w="120" w:type="dxa"/>
-            </w:tcMar>
-          </w:tcPr>
-          <w:p>
-            <w:r>
-              <w:rPr>
-                <w:color w:val="1A2340"/>
-                <w:sz w:val="20"/>
-                <w:szCs w:val="20"/>
-              </w:rPr>
-              <w:t>Gevel</w:t>
-            </w:r>
-          </w:p>
-        </w:tc>
-        <w:tc>
-          <w:tcPr>
-            <w:tcW w:w="1400" w:type="dxa"/>
-            <w:shd w:val="clear" w:color="auto" w:fill="FFFFFF"/>
-            <w:tcMar>
-              <w:top w:w="80" w:type="dxa"/>
-              <w:left w:w="120" w:type="dxa"/>
-              <w:bottom w:w="80" w:type="dxa"/>
-              <w:right w:w="120" w:type="dxa"/>
-            </w:tcMar>
-          </w:tcPr>
-          <w:p>
-            <w:r>
-              <w:rPr>
-                <w:color w:val="1A2340"/>
-              </w:rPr>
-              <w:t xml:space="preserve">4/5</w:t>
-            </w:r>
-            <w:proofErr w:type="spellStart"/>
-            <w:r>
-              <w:rPr>
-                <w:color w:val="1A2340"/>
-              </w:rPr>
-              <w:t/>
-            </w:r>
-            <w:proofErr w:type="spellEnd"/>
-            <w:r>
-              <w:rPr>
-                <w:color w:val="1A2340"/>
-              </w:rPr>
-              <w:t/>
-            </w:r>
-            <w:r>
-              <w:rPr>
-                <w:color w:val="5A6A85"/>
-                <w:sz w:val="20"/>
-                <w:szCs w:val="20"/>
-              </w:rPr>
-              <w:t/>
-            </w:r>
-          </w:p>
-        </w:tc>
-        <w:tc>
-          <w:tcPr>
-            <w:tcW w:w="5226" w:type="dxa"/>
-            <w:shd w:val="clear" w:color="auto" w:fill="FFFFFF"/>
-            <w:tcMar>
-              <w:top w:w="80" w:type="dxa"/>
-              <w:left w:w="120" w:type="dxa"/>
-              <w:bottom w:w="80" w:type="dxa"/>
-              <w:right w:w="120" w:type="dxa"/>
-            </w:tcMar>
-          </w:tcPr>
-          <w:p>
-            <w:r>
-              <w:rPr>
-                <w:color w:val="1A2340"/>
-              </w:rPr>
-              <w:t xml:space="preserve">Slecht</w:t>
-            </w:r>
-            <w:proofErr w:type="spellStart"/>
-            <w:r>
-              <w:rPr>
-                <w:color w:val="1A2340"/>
-              </w:rPr>
-              <w:t/>
-            </w:r>
-            <w:proofErr w:type="spellEnd"/>
-            <w:r>
-              <w:rPr>
-                <w:color w:val="1A2340"/>
-              </w:rPr>
-              <w:t/>
-            </w:r>
-          </w:p>
-        </w:tc>
-      </w:tr>
-      <w:tr>
-        <w:tc>
-          <w:tcPr>
-            <w:tcW w:w="2400" w:type="dxa"/>
-            <w:shd w:val="clear" w:color="auto" w:fill="FFFFFF"/>
-            <w:tcMar>
-              <w:top w:w="80" w:type="dxa"/>
-              <w:left w:w="120" w:type="dxa"/>
-              <w:bottom w:w="80" w:type="dxa"/>
-              <w:right w:w="120" w:type="dxa"/>
-            </w:tcMar>
-          </w:tcPr>
-          <w:p>
-            <w:r>
-              <w:rPr>
-                <w:color w:val="1A2340"/>
-                <w:sz w:val="20"/>
-                <w:szCs w:val="20"/>
-              </w:rPr>
-              <w:t>Vloer</w:t>
-            </w:r>
-          </w:p>
-        </w:tc>
-        <w:tc>
-          <w:tcPr>
-            <w:tcW w:w="1400" w:type="dxa"/>
-            <w:shd w:val="clear" w:color="auto" w:fill="FFFFFF"/>
-            <w:tcMar>
-              <w:top w:w="80" w:type="dxa"/>
-              <w:left w:w="120" w:type="dxa"/>
-              <w:bottom w:w="80" w:type="dxa"/>
-              <w:right w:w="120" w:type="dxa"/>
-            </w:tcMar>
-          </w:tcPr>
-          <w:p>
-            <w:r>
-              <w:rPr>
-                <w:color w:val="1A2340"/>
-              </w:rPr>
-              <w:t xml:space="preserve">4/5</w:t>
-            </w:r>
-            <w:proofErr w:type="spellStart"/>
-            <w:r>
-              <w:rPr>
-                <w:color w:val="1A2340"/>
-              </w:rPr>
-              <w:t/>
-            </w:r>
-            <w:proofErr w:type="spellEnd"/>
-            <w:r>
-              <w:rPr>
-                <w:color w:val="1A2340"/>
-              </w:rPr>
-              <w:t/>
-            </w:r>
-            <w:r>
-              <w:rPr>
-                <w:color w:val="5A6A85"/>
-                <w:sz w:val="20"/>
-                <w:szCs w:val="20"/>
-              </w:rPr>
-              <w:t/>
-            </w:r>
-          </w:p>
-        </w:tc>
-        <w:tc>
-          <w:tcPr>
-            <w:tcW w:w="5226" w:type="dxa"/>
-            <w:shd w:val="clear" w:color="auto" w:fill="FFFFFF"/>
-            <w:tcMar>
-              <w:top w:w="80" w:type="dxa"/>
-              <w:left w:w="120" w:type="dxa"/>
-              <w:bottom w:w="80" w:type="dxa"/>
-              <w:right w:w="120" w:type="dxa"/>
-            </w:tcMar>
-          </w:tcPr>
-          <w:p>
-            <w:r>
-              <w:rPr>
-                <w:color w:val="1A2340"/>
-              </w:rPr>
-              <w:t xml:space="preserve">Slecht</w:t>
-            </w:r>
-            <w:proofErr w:type="spellStart"/>
-            <w:r>
-              <w:rPr>
-                <w:color w:val="1A2340"/>
-              </w:rPr>
-              <w:t/>
-            </w:r>
-            <w:proofErr w:type="spellEnd"/>
-            <w:r>
-              <w:rPr>
-                <w:color w:val="1A2340"/>
-              </w:rPr>
-              <w:t/>
-            </w:r>
-          </w:p>
-        </w:tc>
-      </w:tr>
-      <w:tr>
-        <w:tc>
-          <w:tcPr>
-            <w:tcW w:w="2400" w:type="dxa"/>
-            <w:shd w:val="clear" w:color="auto" w:fill="FFFFFF"/>
-            <w:tcMar>
-              <w:top w:w="80" w:type="dxa"/>
-              <w:left w:w="120" w:type="dxa"/>
-              <w:bottom w:w="80" w:type="dxa"/>
-              <w:right w:w="120" w:type="dxa"/>
-            </w:tcMar>
-          </w:tcPr>
-          <w:p>
-            <w:r>
-              <w:rPr>
-                <w:color w:val="1A2340"/>
-                <w:sz w:val="20"/>
-                <w:szCs w:val="20"/>
-              </w:rPr>
-              <w:t>Glas</w:t>
-            </w:r>
-          </w:p>
-        </w:tc>
-        <w:tc>
-          <w:tcPr>
-            <w:tcW w:w="1400" w:type="dxa"/>
-            <w:shd w:val="clear" w:color="auto" w:fill="FFFFFF"/>
-            <w:tcMar>
-              <w:top w:w="80" w:type="dxa"/>
-              <w:left w:w="120" w:type="dxa"/>
-              <w:bottom w:w="80" w:type="dxa"/>
-              <w:right w:w="120" w:type="dxa"/>
-            </w:tcMar>
-          </w:tcPr>
-          <w:p>
-            <w:r>
-              <w:rPr>
-                <w:color w:val="1A2340"/>
-              </w:rPr>
-              <w:t xml:space="preserve">4/5</w:t>
-            </w:r>
-            <w:proofErr w:type="spellStart"/>
-            <w:r>
-              <w:rPr>
-                <w:color w:val="1A2340"/>
-              </w:rPr>
-              <w:t/>
-            </w:r>
-            <w:proofErr w:type="spellEnd"/>
-            <w:r>
-              <w:rPr>
-                <w:color w:val="1A2340"/>
-              </w:rPr>
-              <w:t/>
-            </w:r>
-            <w:r>
-              <w:rPr>
-                <w:color w:val="5A6A85"/>
-                <w:sz w:val="20"/>
-                <w:szCs w:val="20"/>
-              </w:rPr>
-              <w:t/>
-            </w:r>
-          </w:p>
-        </w:tc>
-        <w:tc>
-          <w:tcPr>
-            <w:tcW w:w="5226" w:type="dxa"/>
-            <w:shd w:val="clear" w:color="auto" w:fill="FFFFFF"/>
-            <w:tcMar>
-              <w:top w:w="80" w:type="dxa"/>
-              <w:left w:w="120" w:type="dxa"/>
-              <w:bottom w:w="80" w:type="dxa"/>
-              <w:right w:w="120" w:type="dxa"/>
-            </w:tcMar>
-          </w:tcPr>
-          <w:p>
-            <w:r>
-              <w:rPr>
-                <w:color w:val="1A2340"/>
-              </w:rPr>
-              <w:t xml:space="preserve">Slecht</w:t>
-            </w:r>
-            <w:proofErr w:type="spellStart"/>
-            <w:r>
-              <w:rPr>
-                <w:color w:val="1A2340"/>
-              </w:rPr>
-              <w:t/>
-            </w:r>
-            <w:proofErr w:type="spellEnd"/>
-            <w:r>
-              <w:rPr>
-                <w:color w:val="1A2340"/>
-              </w:rPr>
-              <w:t/>
-            </w:r>
-          </w:p>
-        </w:tc>
-      </w:tr>
-    </w:tbl>
-    <w:p>
-      <w:pPr>
-        <w:pStyle w:val="Normal"/>
-        <w:spacing w:before="0" w:after="160"/>
-      </w:pPr>
-      <w:r>
-        <w:rPr>
-          <w:rFonts w:ascii="Calibri" w:hAnsi="Calibri" w:cs="Calibri"/>
-          <w:sz w:val="22"/>
-          <w:szCs w:val="22"/>
-        </w:rPr>
-        <w:t xml:space="preserve"/>
-      </w:r>
-    </w:p>
-    <w:p>
-      <w:pPr>
-        <w:pStyle w:val="Normal"/>
-        <w:spacing w:before="0" w:after="160"/>
+        <w:pStyle w:val="Normal"/>
+        <w:spacing w:before="0" w:after="200"/>
+      </w:pPr>
+    </w:p>
+    <w:p>
+      <w:pPr>
+        <w:pStyle w:val="Normal"/>
+        <w:spacing w:before="0" w:after="60"/>
       </w:pPr>
       <w:r>
         <w:rPr>
@@ -2005,55 +1440,103 @@
           <w:szCs w:val="22"/>
           <w:color w:val="5AAA00"/>
         </w:rPr>
-        <w:t xml:space="preserve">Dak — score 4/5 (Slecht)</w:t>
-      </w:r>
-    </w:p>
-    <w:p>
-      <w:pPr>
-        <w:pStyle w:val="Normal"/>
-        <w:spacing w:before="0" w:after="160"/>
+        <w:t xml:space="preserve">1. Gevel  —  score 4/5  —  Hoge urgentie</w:t>
+      </w:r>
+    </w:p>
+    <w:p>
+      <w:pPr>
+        <w:pStyle w:val="Normal"/>
+        <w:spacing w:before="0" w:after="60"/>
       </w:pPr>
       <w:r>
         <w:rPr>
           <w:rFonts w:ascii="Calibri" w:hAnsi="Calibri" w:cs="Calibri"/>
           <w:sz w:val="22"/>
           <w:szCs w:val="22"/>
-        </w:rPr>
-        <w:t xml:space="preserve">Dakisolatie houdt opstijgende warme lucht binnen de woning vast en is daarmee een van de meest effectieve energiemaatregelen. Een slecht geïsoleerd dak is verantwoordelijk voor een groot deel van het totale warmteverlies. Uw woning lijkt te voldoen aan de standaard waardoor u op dit onderdeel weinig winst kan behalen.</w:t>
-      </w:r>
-    </w:p>
-    <w:p>
-      <w:pPr>
-        <w:pStyle w:val="Normal"/>
-        <w:spacing w:before="0" w:after="160"/>
+          <w:color w:val="1D1D1B"/>
+        </w:rPr>
+        <w:t xml:space="preserve">Aanbevolen maatregel: Gevelisolatie</w:t>
+      </w:r>
+    </w:p>
+    <w:p>
+      <w:pPr>
+        <w:pStyle w:val="Normal"/>
+        <w:spacing w:before="0" w:after="60"/>
       </w:pPr>
       <w:r>
         <w:rPr>
           <w:rFonts w:ascii="Calibri" w:hAnsi="Calibri" w:cs="Calibri"/>
           <w:sz w:val="22"/>
           <w:szCs w:val="22"/>
-        </w:rPr>
-        <w:t xml:space="preserve">Uw dak is niet of gering geïsoleerd, maar onvoldoende dik voor de huidige normen. Er is nog aanzienlijk warmteverlies via de kap. Opschalen naar een hogere Rc-waarde verbetert het binnenklimaat op de bovenverdieping en verlaagt de stookkosten.</w:t>
-      </w:r>
-    </w:p>
-    <w:p>
-      <w:pPr>
-        <w:pStyle w:val="Normal"/>
-        <w:spacing w:before="0" w:after="160"/>
+          <w:color w:val="666666"/>
+        </w:rPr>
+        <w:t xml:space="preserve">Geschatte oppervlakte: ca. 41 m²</w:t>
+      </w:r>
+    </w:p>
+    <w:p>
+      <w:pPr>
+        <w:pStyle w:val="Normal"/>
+        <w:spacing w:before="0" w:after="60"/>
       </w:pPr>
       <w:r>
         <w:rPr>
           <w:rFonts w:ascii="Calibri" w:hAnsi="Calibri" w:cs="Calibri"/>
           <w:sz w:val="22"/>
           <w:szCs w:val="22"/>
-        </w:rPr>
-        <w:t xml:space="preserve"/>
-      </w:r>
-    </w:p>
-    <w:p>
-      <w:pPr>
-        <w:pStyle w:val="Normal"/>
-        <w:spacing w:before="0" w:after="160"/>
+          <w:color w:val="1D1D1B"/>
+        </w:rPr>
+        <w:t xml:space="preserve">Indicatieve besparing: €367–€497 per jaar</w:t>
+      </w:r>
+    </w:p>
+    <w:p>
+      <w:pPr>
+        <w:pStyle w:val="Normal"/>
+        <w:spacing w:before="0" w:after="60"/>
+      </w:pPr>
+      <w:r>
+        <w:rPr>
+          <w:rFonts w:ascii="Calibri" w:hAnsi="Calibri" w:cs="Calibri"/>
+          <w:sz w:val="22"/>
+          <w:szCs w:val="22"/>
+          <w:color w:val="1D1D1B"/>
+        </w:rPr>
+        <w:t xml:space="preserve">Indicatieve investering: €7,175–€9,430</w:t>
+      </w:r>
+    </w:p>
+    <w:p>
+      <w:pPr>
+        <w:pStyle w:val="Normal"/>
+        <w:spacing w:before="0" w:after="60"/>
+      </w:pPr>
+      <w:r>
+        <w:rPr>
+          <w:rFonts w:ascii="Calibri" w:hAnsi="Calibri" w:cs="Calibri"/>
+          <w:sz w:val="22"/>
+          <w:szCs w:val="22"/>
+          <w:color w:val="2E7D32"/>
+        </w:rPr>
+        <w:t xml:space="preserve">ISDE-subsidie indicatie: tot €830</w:t>
+      </w:r>
+    </w:p>
+    <w:p>
+      <w:pPr>
+        <w:pStyle w:val="Normal"/>
+        <w:spacing w:before="0" w:after="200"/>
+      </w:pPr>
+      <w:r>
+        <w:rPr>
+          <w:rFonts w:ascii="Calibri" w:hAnsi="Calibri" w:cs="Calibri"/>
+          <w:sz w:val="22"/>
+          <w:szCs w:val="22"/>
+          <w:color w:val="1D1D1B"/>
+        </w:rPr>
+        <w:t xml:space="preserve">Terugverdientijd na subsidie: ca. 13–23 jaar</w:t>
+      </w:r>
+    </w:p>
+    <w:p>
+      <w:pPr>
+        <w:pStyle w:val="Normal"/>
+        <w:spacing w:before="0" w:after="60"/>
       </w:pPr>
       <w:r>
         <w:rPr>
@@ -2063,55 +1546,103 @@
           <w:szCs w:val="22"/>
           <w:color w:val="5AAA00"/>
         </w:rPr>
-        <w:t xml:space="preserve">Gevel — score 4/5 (Slecht)</w:t>
-      </w:r>
-    </w:p>
-    <w:p>
-      <w:pPr>
-        <w:pStyle w:val="Normal"/>
-        <w:spacing w:before="0" w:after="160"/>
+        <w:t xml:space="preserve">2. Dak  —  score 4/5  —  Hoge urgentie</w:t>
+      </w:r>
+    </w:p>
+    <w:p>
+      <w:pPr>
+        <w:pStyle w:val="Normal"/>
+        <w:spacing w:before="0" w:after="60"/>
       </w:pPr>
       <w:r>
         <w:rPr>
           <w:rFonts w:ascii="Calibri" w:hAnsi="Calibri" w:cs="Calibri"/>
           <w:sz w:val="22"/>
           <w:szCs w:val="22"/>
-        </w:rPr>
-        <w:t xml:space="preserve">Gevelisolatie brengt een thermische laag aan in de spouw of tegen de muren om warmteverlies te beperken. Zonder isolatie ontsnapt warmte via het metselwerk en koelen binnenmuren af.</w:t>
-      </w:r>
-    </w:p>
-    <w:p>
-      <w:pPr>
-        <w:pStyle w:val="Normal"/>
-        <w:spacing w:before="0" w:after="160"/>
+          <w:color w:val="1D1D1B"/>
+        </w:rPr>
+        <w:t xml:space="preserve">Aanbevolen maatregel: Dakisolatie</w:t>
+      </w:r>
+    </w:p>
+    <w:p>
+      <w:pPr>
+        <w:pStyle w:val="Normal"/>
+        <w:spacing w:before="0" w:after="60"/>
       </w:pPr>
       <w:r>
         <w:rPr>
           <w:rFonts w:ascii="Calibri" w:hAnsi="Calibri" w:cs="Calibri"/>
           <w:sz w:val="22"/>
           <w:szCs w:val="22"/>
-        </w:rPr>
-        <w:t xml:space="preserve">De huidige gevelisolatie is er niet of onvoldoende waardoor de verwarmingsinstallatie harder werkt dan nodig is. Bijzetten naar een hogere Rc-waardezorgt voor minder energieverlies, een lagere warmtevraag en verbetert binnenklimaat.</w:t>
-      </w:r>
-    </w:p>
-    <w:p>
-      <w:pPr>
-        <w:pStyle w:val="Normal"/>
-        <w:spacing w:before="0" w:after="160"/>
+          <w:color w:val="666666"/>
+        </w:rPr>
+        <w:t xml:space="preserve">Geschatte oppervlakte: ca. 45 m²</w:t>
+      </w:r>
+    </w:p>
+    <w:p>
+      <w:pPr>
+        <w:pStyle w:val="Normal"/>
+        <w:spacing w:before="0" w:after="60"/>
       </w:pPr>
       <w:r>
         <w:rPr>
           <w:rFonts w:ascii="Calibri" w:hAnsi="Calibri" w:cs="Calibri"/>
           <w:sz w:val="22"/>
           <w:szCs w:val="22"/>
-        </w:rPr>
-        <w:t xml:space="preserve"/>
-      </w:r>
-    </w:p>
-    <w:p>
-      <w:pPr>
-        <w:pStyle w:val="Normal"/>
-        <w:spacing w:before="0" w:after="160"/>
+          <w:color w:val="1D1D1B"/>
+        </w:rPr>
+        <w:t xml:space="preserve">Indicatieve besparing: €262–€355 per jaar</w:t>
+      </w:r>
+    </w:p>
+    <w:p>
+      <w:pPr>
+        <w:pStyle w:val="Normal"/>
+        <w:spacing w:before="0" w:after="60"/>
+      </w:pPr>
+      <w:r>
+        <w:rPr>
+          <w:rFonts w:ascii="Calibri" w:hAnsi="Calibri" w:cs="Calibri"/>
+          <w:sz w:val="22"/>
+          <w:szCs w:val="22"/>
+          <w:color w:val="1D1D1B"/>
+        </w:rPr>
+        <w:t xml:space="preserve">Indicatieve investering: €4,510–€6,765</w:t>
+      </w:r>
+    </w:p>
+    <w:p>
+      <w:pPr>
+        <w:pStyle w:val="Normal"/>
+        <w:spacing w:before="0" w:after="60"/>
+      </w:pPr>
+      <w:r>
+        <w:rPr>
+          <w:rFonts w:ascii="Calibri" w:hAnsi="Calibri" w:cs="Calibri"/>
+          <w:sz w:val="22"/>
+          <w:szCs w:val="22"/>
+          <w:color w:val="2E7D32"/>
+        </w:rPr>
+        <w:t xml:space="preserve">ISDE-subsidie indicatie: tot €733</w:t>
+      </w:r>
+    </w:p>
+    <w:p>
+      <w:pPr>
+        <w:pStyle w:val="Normal"/>
+        <w:spacing w:before="0" w:after="200"/>
+      </w:pPr>
+      <w:r>
+        <w:rPr>
+          <w:rFonts w:ascii="Calibri" w:hAnsi="Calibri" w:cs="Calibri"/>
+          <w:sz w:val="22"/>
+          <w:szCs w:val="22"/>
+          <w:color w:val="1D1D1B"/>
+        </w:rPr>
+        <w:t xml:space="preserve">Terugverdientijd na subsidie: ca. 11–23 jaar</w:t>
+      </w:r>
+    </w:p>
+    <w:p>
+      <w:pPr>
+        <w:pStyle w:val="Normal"/>
+        <w:spacing w:before="0" w:after="60"/>
       </w:pPr>
       <w:r>
         <w:rPr>
@@ -2121,55 +1652,103 @@
           <w:szCs w:val="22"/>
           <w:color w:val="5AAA00"/>
         </w:rPr>
-        <w:t xml:space="preserve">Vloer — score 4/5 (Slecht)</w:t>
-      </w:r>
-    </w:p>
-    <w:p>
-      <w:pPr>
-        <w:pStyle w:val="Normal"/>
-        <w:spacing w:before="0" w:after="160"/>
+        <w:t xml:space="preserve">3. Glas  —  score 4/5  —  Hoge urgentie</w:t>
+      </w:r>
+    </w:p>
+    <w:p>
+      <w:pPr>
+        <w:pStyle w:val="Normal"/>
+        <w:spacing w:before="0" w:after="60"/>
       </w:pPr>
       <w:r>
         <w:rPr>
           <w:rFonts w:ascii="Calibri" w:hAnsi="Calibri" w:cs="Calibri"/>
           <w:sz w:val="22"/>
           <w:szCs w:val="22"/>
-        </w:rPr>
-        <w:t xml:space="preserve">Vloerisolatie vormt een barrière tussen de warme leefruimte en de koude grond of kruipruimte. Het stopt warmteverlies via de onderzijde en gaat optrekkend vocht uit de kruipruimte tegen.Uw woning lijkt goed geïsoleerd waardoor u op dit onderdeel weinig winst kan behalen.</w:t>
-      </w:r>
-    </w:p>
-    <w:p>
-      <w:pPr>
-        <w:pStyle w:val="Normal"/>
-        <w:spacing w:before="0" w:after="160"/>
+          <w:color w:val="1D1D1B"/>
+        </w:rPr>
+        <w:t xml:space="preserve">Aanbevolen maatregel: HR++ dubbelglas</w:t>
+      </w:r>
+    </w:p>
+    <w:p>
+      <w:pPr>
+        <w:pStyle w:val="Normal"/>
+        <w:spacing w:before="0" w:after="60"/>
       </w:pPr>
       <w:r>
         <w:rPr>
           <w:rFonts w:ascii="Calibri" w:hAnsi="Calibri" w:cs="Calibri"/>
           <w:sz w:val="22"/>
           <w:szCs w:val="22"/>
-        </w:rPr>
-        <w:t xml:space="preserve">De huidige vloerisolatie is onvoldoende, waardoor er nog warmteverlies via de onderkant optreedt en de kruipruimte invloed heeft op het binnenklimaat. Vervangen van de isolatie naar een hogere Rc verlaagd het verlies en verhoogt het wooncomfort.</w:t>
-      </w:r>
-    </w:p>
-    <w:p>
-      <w:pPr>
-        <w:pStyle w:val="Normal"/>
-        <w:spacing w:before="0" w:after="160"/>
+          <w:color w:val="666666"/>
+        </w:rPr>
+        <w:t xml:space="preserve">Geschatte oppervlakte: ca. 7 m²</w:t>
+      </w:r>
+    </w:p>
+    <w:p>
+      <w:pPr>
+        <w:pStyle w:val="Normal"/>
+        <w:spacing w:before="0" w:after="60"/>
       </w:pPr>
       <w:r>
         <w:rPr>
           <w:rFonts w:ascii="Calibri" w:hAnsi="Calibri" w:cs="Calibri"/>
           <w:sz w:val="22"/>
           <w:szCs w:val="22"/>
-        </w:rPr>
-        <w:t xml:space="preserve"/>
-      </w:r>
-    </w:p>
-    <w:p>
-      <w:pPr>
-        <w:pStyle w:val="Normal"/>
-        <w:spacing w:before="0" w:after="160"/>
+          <w:color w:val="1D1D1B"/>
+        </w:rPr>
+        <w:t xml:space="preserve">Indicatieve besparing: €210–€284 per jaar</w:t>
+      </w:r>
+    </w:p>
+    <w:p>
+      <w:pPr>
+        <w:pStyle w:val="Normal"/>
+        <w:spacing w:before="0" w:after="60"/>
+      </w:pPr>
+      <w:r>
+        <w:rPr>
+          <w:rFonts w:ascii="Calibri" w:hAnsi="Calibri" w:cs="Calibri"/>
+          <w:sz w:val="22"/>
+          <w:szCs w:val="22"/>
+          <w:color w:val="1D1D1B"/>
+        </w:rPr>
+        <w:t xml:space="preserve">Indicatieve investering: €528–€990</w:t>
+      </w:r>
+    </w:p>
+    <w:p>
+      <w:pPr>
+        <w:pStyle w:val="Normal"/>
+        <w:spacing w:before="0" w:after="60"/>
+      </w:pPr>
+      <w:r>
+        <w:rPr>
+          <w:rFonts w:ascii="Calibri" w:hAnsi="Calibri" w:cs="Calibri"/>
+          <w:sz w:val="22"/>
+          <w:szCs w:val="22"/>
+          <w:color w:val="2E7D32"/>
+        </w:rPr>
+        <w:t xml:space="preserve">ISDE-subsidie indicatie: tot €82</w:t>
+      </w:r>
+    </w:p>
+    <w:p>
+      <w:pPr>
+        <w:pStyle w:val="Normal"/>
+        <w:spacing w:before="0" w:after="200"/>
+      </w:pPr>
+      <w:r>
+        <w:rPr>
+          <w:rFonts w:ascii="Calibri" w:hAnsi="Calibri" w:cs="Calibri"/>
+          <w:sz w:val="22"/>
+          <w:szCs w:val="22"/>
+          <w:color w:val="1D1D1B"/>
+        </w:rPr>
+        <w:t xml:space="preserve">Terugverdientijd na subsidie: ca. 2–4 jaar</w:t>
+      </w:r>
+    </w:p>
+    <w:p>
+      <w:pPr>
+        <w:pStyle w:val="Normal"/>
+        <w:spacing w:before="0" w:after="60"/>
       </w:pPr>
       <w:r>
         <w:rPr>
@@ -2179,77 +1758,82 @@
           <w:szCs w:val="22"/>
           <w:color w:val="5AAA00"/>
         </w:rPr>
-        <w:t xml:space="preserve">Glas — score 4/5 (Slecht)</w:t>
-      </w:r>
-    </w:p>
-    <w:p>
-      <w:pPr>
-        <w:pStyle w:val="Normal"/>
-        <w:spacing w:before="0" w:after="160"/>
+        <w:t xml:space="preserve">4. Vloer  —  score 4/5  —  Hoge urgentie</w:t>
+      </w:r>
+    </w:p>
+    <w:p>
+      <w:pPr>
+        <w:pStyle w:val="Normal"/>
+        <w:spacing w:before="0" w:after="60"/>
       </w:pPr>
       <w:r>
         <w:rPr>
           <w:rFonts w:ascii="Calibri" w:hAnsi="Calibri" w:cs="Calibri"/>
           <w:sz w:val="22"/>
           <w:szCs w:val="22"/>
-        </w:rPr>
-        <w:t xml:space="preserve">Isolerend glas vervangt enkel of verouderd dubbel glas door ruiten met een warmtereflecterende coating die warmte binnenhoudt en koudeval bij de ramen voorkomt. Ramen zijn de zwakste plekken in de isolatieschil van een woning.</w:t>
-      </w:r>
-    </w:p>
-    <w:p>
-      <w:pPr>
-        <w:pStyle w:val="Normal"/>
-        <w:spacing w:before="0" w:after="160"/>
+          <w:color w:val="1D1D1B"/>
+        </w:rPr>
+        <w:t xml:space="preserve">Aanbevolen maatregel: Vloerisolatie</w:t>
+      </w:r>
+    </w:p>
+    <w:p>
+      <w:pPr>
+        <w:pStyle w:val="Normal"/>
+        <w:spacing w:before="0" w:after="60"/>
       </w:pPr>
       <w:r>
         <w:rPr>
           <w:rFonts w:ascii="Calibri" w:hAnsi="Calibri" w:cs="Calibri"/>
           <w:sz w:val="22"/>
           <w:szCs w:val="22"/>
-        </w:rPr>
-        <w:t xml:space="preserve">Het aanwezige enkel of oud dubbel glas is verouderd of lek en presteert  niet meer als bij aanleg. Vervangen door nieuwe HR++ ruiten verbetert het binnenklimaat direct en elimineert koude luchtstromen langs de ramen.</w:t>
-      </w:r>
-    </w:p>
-    <w:p>
-      <w:pPr>
-        <w:pStyle w:val="Normal"/>
-        <w:spacing w:before="0" w:after="160"/>
+          <w:color w:val="666666"/>
+        </w:rPr>
+        <w:t xml:space="preserve">Geschatte oppervlakte: ca. 41 m²</w:t>
+      </w:r>
+    </w:p>
+    <w:p>
+      <w:pPr>
+        <w:pStyle w:val="Normal"/>
+        <w:spacing w:before="0" w:after="60"/>
       </w:pPr>
       <w:r>
         <w:rPr>
           <w:rFonts w:ascii="Calibri" w:hAnsi="Calibri" w:cs="Calibri"/>
           <w:sz w:val="22"/>
           <w:szCs w:val="22"/>
-        </w:rPr>
-        <w:t xml:space="preserve"/>
-      </w:r>
-    </w:p>
-    <w:p>
-      <w:pPr>
-        <w:pStyle w:val="Normal"/>
-        <w:spacing w:before="0" w:after="160"/>
+          <w:color w:val="1D1D1B"/>
+        </w:rPr>
+        <w:t xml:space="preserve">Indicatieve besparing: €157–€213 per jaar</w:t>
+      </w:r>
+    </w:p>
+    <w:p>
+      <w:pPr>
+        <w:pStyle w:val="Normal"/>
+        <w:spacing w:before="0" w:after="60"/>
       </w:pPr>
       <w:r>
         <w:rPr>
           <w:rFonts w:ascii="Calibri" w:hAnsi="Calibri" w:cs="Calibri"/>
           <w:sz w:val="22"/>
           <w:szCs w:val="22"/>
-        </w:rPr>
-        <w:t xml:space="preserve">Heeft u al verbeteringen uitgevoerd of wilt u dit aanpakken en nog een stap verder gaan, dan kunt u zich richten op het optimaliseren van installaties en het verder verlagen van uw energieverbruik.</w:t>
-      </w:r>
-    </w:p>
-    <w:p>
-      <w:pPr>
-        <w:pStyle w:val="Normal"/>
-        <w:spacing w:before="0" w:after="160"/>
+          <w:color w:val="1D1D1B"/>
+        </w:rPr>
+        <w:t xml:space="preserve">Indicatieve investering: €902–€1,230</w:t>
+      </w:r>
+    </w:p>
+    <w:p>
+      <w:pPr>
+        <w:pStyle w:val="Normal"/>
+        <w:spacing w:before="0" w:after="60"/>
       </w:pPr>
       <w:r>
         <w:rPr>
           <w:rFonts w:ascii="Calibri" w:hAnsi="Calibri" w:cs="Calibri"/>
           <w:sz w:val="22"/>
           <w:szCs w:val="22"/>
-        </w:rPr>
-        <w:t xml:space="preserve">Denk aan het toepassen van zonnepanelen, het overstappen naar een (hybride) warmtepomp en het verbeteren van uw verwarmingssysteem. In combinatie met goede ventilatie zorgt dit voor een comfortabel en gezond binnenklimaat. Ook batterijopslag kan interessant zijn om energie tijdelijk op te slaan.</w:t>
+          <w:color w:val="2E7D32"/>
+        </w:rPr>
+        <w:t xml:space="preserve">ISDE-subsidie indicatie: tot €226</w:t>
       </w:r>
     </w:p>
     <w:p>
@@ -2262,450 +1846,716 @@
           <w:rFonts w:ascii="Calibri" w:hAnsi="Calibri" w:cs="Calibri"/>
           <w:sz w:val="22"/>
           <w:szCs w:val="22"/>
-        </w:rPr>
-        <w:t xml:space="preserve">Door isolatie en installaties slim te combineren, werkt u stap voor stap toe naar een woning die klaar is voor een toekomst met minder of geen aardgas.</w:t>
-      </w:r>
-    </w:p>
-    <w:p>
-      <w:pPr>
-        <w:spacing w:before="240"/>
-      </w:pPr>
-    </w:p>
-    <w:p>
-      <w:pPr>
-        <w:spacing w:before="240"/>
-      </w:pPr>
-    </w:p>
-    <w:p>
-      <w:pPr>
-        <w:pBdr>
-          <w:bottom w:val="single" w:sz="2" w:space="1" w:color="D0D8EC"/>
-        </w:pBdr>
-        <w:spacing w:before="160" w:after="160"/>
-      </w:pPr>
-    </w:p>
-    <w:p>
-      <w:pPr>
+          <w:color w:val="1D1D1B"/>
+        </w:rPr>
+        <w:t xml:space="preserve">Terugverdientijd na subsidie: ca. 3–6 jaar</w:t>
+      </w:r>
+    </w:p>
+    <w:p>
+      <w:pPr>
+        <w:pStyle w:val="Normal"/>
+        <w:spacing w:before="0" w:after="80"/>
+      </w:pPr>
+      <w:r>
         <w:rPr>
           <w:b/>
-          <w:bCs/>
-          <w:color w:val="2E6BE6"/>
-        </w:rPr>
+          <w:rFonts w:ascii="Calibri" w:hAnsi="Calibri" w:cs="Calibri"/>
+          <w:sz w:val="24"/>
+          <w:szCs w:val="24"/>
+          <w:color w:val="1D1D1B"/>
+        </w:rPr>
+        <w:t xml:space="preserve">Basis totstandkoming van dit rapport</w:t>
+      </w:r>
+    </w:p>
+    <w:p>
+      <w:pPr>
+        <w:pStyle w:val="Normal"/>
+        <w:spacing w:before="0" w:after="60"/>
+      </w:pPr>
+      <w:r>
+        <w:rPr>
+          <w:rFonts w:ascii="Calibri" w:hAnsi="Calibri" w:cs="Calibri"/>
+          <w:sz w:val="20"/>
+          <w:szCs w:val="20"/>
+          <w:color w:val="555555"/>
+        </w:rPr>
+        <w:t xml:space="preserve">Financiële indicaties zijn schattingen op basis van bouwjaar en gemiddelde woningkenmerken. Definitieve bedragen hangen af van de werkelijke situatie ter plaatse.</w:t>
+      </w:r>
+    </w:p>
+    <w:p>
+      <w:pPr>
+        <w:pStyle w:val="Normal"/>
+        <w:spacing w:before="0" w:after="200"/>
+      </w:pPr>
+    </w:p>
+    <w:p>
+      <w:pPr>
+        <w:pStyle w:val="Normal"/>
+        <w:spacing w:before="0" w:after="200"/>
+      </w:pPr>
+      <w:r>
+        <w:rPr>
+          <w:i/>
+          <w:rFonts w:ascii="Calibri" w:hAnsi="Calibri" w:cs="Calibri"/>
+          <w:sz w:val="20"/>
+          <w:szCs w:val="20"/>
+          <w:color w:val="666666"/>
+        </w:rPr>
+        <w:t xml:space="preserve">Berekend op basis van woningtype, bouwjaar en isolatiewaarden per bouwperiode (ISSO 82.1, NEN 1068). Alle bedragen zijn indicatief.</w:t>
+      </w:r>
+    </w:p>
+    <w:p>
+      <w:pPr>
+        <w:pStyle w:val="Normal"/>
+        <w:spacing w:before="0" w:after="60"/>
       </w:pPr>
       <w:r>
         <w:rPr>
           <w:b/>
-          <w:bCs/>
-          <w:color w:val="2E6BE6"/>
-        </w:rPr>
-        <w:br w:type="page"/>
-      </w:r>
-    </w:p>
-    <w:p>
-      <w:pPr>
-        <w:spacing w:before="160" w:after="80"/>
+          <w:rFonts w:ascii="Calibri" w:hAnsi="Calibri" w:cs="Calibri"/>
+          <w:sz w:val="22"/>
+          <w:szCs w:val="22"/>
+          <w:color w:val="5AAA00"/>
+        </w:rPr>
+        <w:t xml:space="preserve">Dak</w:t>
+      </w:r>
+    </w:p>
+    <w:p>
+      <w:pPr>
+        <w:pStyle w:val="Normal"/>
+        <w:spacing w:before="0" w:after="40"/>
+      </w:pPr>
+      <w:r>
+        <w:rPr>
+          <w:i/>
+          <w:rFonts w:ascii="Calibri" w:hAnsi="Calibri" w:cs="Calibri"/>
+          <w:sz w:val="20"/>
+          <w:szCs w:val="20"/>
+          <w:color w:val="888888"/>
+        </w:rPr>
+        <w:t xml:space="preserve">Hellend dak, footprint 50 m² × factor 1.25</w:t>
+      </w:r>
+    </w:p>
+    <w:p>
+      <w:pPr>
+        <w:pStyle w:val="Normal"/>
+        <w:spacing w:before="0" w:after="20"/>
+      </w:pPr>
+      <w:r>
+        <w:rPr>
+          <w:rFonts w:ascii="Calibri" w:hAnsi="Calibri" w:cs="Calibri"/>
+          <w:sz w:val="20"/>
+          <w:szCs w:val="20"/>
+          <w:color w:val="555555"/>
+        </w:rPr>
+        <w:t xml:space="preserve">Huidige Rc: 0.3 m²K/W  —  Houten gordingenkap zonder isolatielaag</w:t>
+      </w:r>
+    </w:p>
+    <w:p>
+      <w:pPr>
+        <w:pStyle w:val="Normal"/>
+        <w:spacing w:before="0" w:after="60"/>
+      </w:pPr>
+      <w:r>
+        <w:rPr>
+          <w:rFonts w:ascii="Calibri" w:hAnsi="Calibri" w:cs="Calibri"/>
+          <w:sz w:val="20"/>
+          <w:szCs w:val="20"/>
+          <w:color w:val="555555"/>
+        </w:rPr>
+        <w:t xml:space="preserve">Streefwaarde Rc: 3.5 m²K/W (ISDE-minimumeis)</w:t>
+      </w:r>
+    </w:p>
+    <w:p>
+      <w:pPr>
+        <w:pStyle w:val="Normal"/>
+        <w:spacing w:before="0" w:after="60"/>
+      </w:pPr>
+      <w:r>
+        <w:rPr>
+          <w:rFonts w:ascii="Calibri" w:hAnsi="Calibri" w:cs="Calibri"/>
+          <w:sz w:val="20"/>
+          <w:szCs w:val="20"/>
+          <w:color w:val="1D1D1B"/>
+        </w:rPr>
+        <w:t xml:space="preserve">Besparing:    10,476 kWh/jr  |  1,375 m³ gas/jr  |  €1,993 per jaar</w:t>
+      </w:r>
+    </w:p>
+    <w:p>
+      <w:pPr>
+        <w:pStyle w:val="Normal"/>
+        <w:spacing w:before="0" w:after="60"/>
+      </w:pPr>
+      <w:r>
+        <w:rPr>
+          <w:rFonts w:ascii="Calibri" w:hAnsi="Calibri" w:cs="Calibri"/>
+          <w:sz w:val="20"/>
+          <w:szCs w:val="20"/>
+          <w:color w:val="1D1D1B"/>
+        </w:rPr>
+        <w:t xml:space="preserve">Investering:  €6,250–€9,375  |  ISDE-subsidie: tot €1,016  |  Netto: €6,796</w:t>
+      </w:r>
+    </w:p>
+    <w:p>
+      <w:pPr>
+        <w:pStyle w:val="Normal"/>
+        <w:spacing w:before="0" w:after="60"/>
+      </w:pPr>
+      <w:r>
+        <w:rPr>
+          <w:rFonts w:ascii="Calibri" w:hAnsi="Calibri" w:cs="Calibri"/>
+          <w:sz w:val="20"/>
+          <w:szCs w:val="20"/>
+          <w:color w:val="1D1D1B"/>
+        </w:rPr>
+        <w:t xml:space="preserve">Terugverdientijd: 3.3 jaar  |  Na 10 jr: €22,851  |  Na 20 jr: €53,561 cumulatief bespaard</w:t>
+      </w:r>
+    </w:p>
+    <w:p>
+      <w:pPr>
+        <w:pStyle w:val="Normal"/>
+        <w:spacing w:before="0" w:after="160"/>
+      </w:pPr>
+    </w:p>
+    <w:p>
+      <w:pPr>
+        <w:pStyle w:val="Normal"/>
+        <w:spacing w:before="0" w:after="60"/>
+      </w:pPr>
+      <w:r>
         <w:rPr>
           <w:b/>
-          <w:bCs/>
+          <w:rFonts w:ascii="Calibri" w:hAnsi="Calibri" w:cs="Calibri"/>
+          <w:sz w:val="22"/>
+          <w:szCs w:val="22"/>
           <w:color w:val="5AAA00"/>
         </w:rPr>
-      </w:pPr>
-      <w:r>
-        <w:rPr>
-          <w:noProof/>
+        <w:t xml:space="preserve">Vloer</w:t>
+      </w:r>
+    </w:p>
+    <w:p>
+      <w:pPr>
+        <w:pStyle w:val="Normal"/>
+        <w:spacing w:before="0" w:after="40"/>
+      </w:pPr>
+      <w:r>
+        <w:rPr>
+          <w:i/>
+          <w:rFonts w:ascii="Calibri" w:hAnsi="Calibri" w:cs="Calibri"/>
+          <w:sz w:val="20"/>
+          <w:szCs w:val="20"/>
+          <w:color w:val="888888"/>
+        </w:rPr>
+        <w:t xml:space="preserve">Vloer = footprint 50 m²</w:t>
+      </w:r>
+    </w:p>
+    <w:p>
+      <w:pPr>
+        <w:pStyle w:val="Normal"/>
+        <w:spacing w:before="0" w:after="20"/>
+      </w:pPr>
+      <w:r>
+        <w:rPr>
+          <w:rFonts w:ascii="Calibri" w:hAnsi="Calibri" w:cs="Calibri"/>
+          <w:sz w:val="20"/>
+          <w:szCs w:val="20"/>
+          <w:color w:val="555555"/>
+        </w:rPr>
+        <w:t xml:space="preserve">Huidige Rc: 0.2 m²K/W  —  Houten balkenvloer op kruipruimte, geen isolatie</w:t>
+      </w:r>
+    </w:p>
+    <w:p>
+      <w:pPr>
+        <w:pStyle w:val="Normal"/>
+        <w:spacing w:before="0" w:after="60"/>
+      </w:pPr>
+      <w:r>
+        <w:rPr>
+          <w:rFonts w:ascii="Calibri" w:hAnsi="Calibri" w:cs="Calibri"/>
+          <w:sz w:val="20"/>
+          <w:szCs w:val="20"/>
+          <w:color w:val="555555"/>
+        </w:rPr>
+        <w:t xml:space="preserve">Streefwaarde Rc: 3.5 m²K/W (ISDE-minimumeis)</w:t>
+      </w:r>
+    </w:p>
+    <w:p>
+      <w:pPr>
+        <w:pStyle w:val="Normal"/>
+        <w:spacing w:before="0" w:after="60"/>
+      </w:pPr>
+      <w:r>
+        <w:rPr>
+          <w:rFonts w:ascii="Calibri" w:hAnsi="Calibri" w:cs="Calibri"/>
+          <w:sz w:val="20"/>
+          <w:szCs w:val="20"/>
+          <w:color w:val="1D1D1B"/>
+        </w:rPr>
+        <w:t xml:space="preserve">Besparing:    12,964 kWh/jr  |  1,701 m³ gas/jr  |  €2,467 per jaar</w:t>
+      </w:r>
+    </w:p>
+    <w:p>
+      <w:pPr>
+        <w:pStyle w:val="Normal"/>
+        <w:spacing w:before="0" w:after="60"/>
+      </w:pPr>
+      <w:r>
+        <w:rPr>
+          <w:rFonts w:ascii="Calibri" w:hAnsi="Calibri" w:cs="Calibri"/>
+          <w:sz w:val="20"/>
+          <w:szCs w:val="20"/>
+          <w:color w:val="1D1D1B"/>
+        </w:rPr>
+        <w:t xml:space="preserve">Investering:  €1,100–€1,500  |  ISDE-subsidie: tot €275  |  Netto: €1,025</w:t>
+      </w:r>
+    </w:p>
+    <w:p>
+      <w:pPr>
+        <w:pStyle w:val="Normal"/>
+        <w:spacing w:before="0" w:after="60"/>
+      </w:pPr>
+      <w:r>
+        <w:rPr>
+          <w:rFonts w:ascii="Calibri" w:hAnsi="Calibri" w:cs="Calibri"/>
+          <w:sz w:val="20"/>
+          <w:szCs w:val="20"/>
+          <w:color w:val="1D1D1B"/>
+        </w:rPr>
+        <w:t xml:space="preserve">Terugverdientijd: 0.4 jaar  |  Na 10 jr: €28,278  |  Na 20 jr: €66,282 cumulatief bespaard</w:t>
+      </w:r>
+    </w:p>
+    <w:p>
+      <w:pPr>
+        <w:pStyle w:val="Normal"/>
+        <w:spacing w:before="0" w:after="160"/>
+      </w:pPr>
+    </w:p>
+    <w:p>
+      <w:pPr>
+        <w:pStyle w:val="Normal"/>
+        <w:spacing w:before="0" w:after="60"/>
+      </w:pPr>
+      <w:r>
+        <w:rPr>
+          <w:b/>
+          <w:rFonts w:ascii="Calibri" w:hAnsi="Calibri" w:cs="Calibri"/>
+          <w:sz w:val="22"/>
+          <w:szCs w:val="22"/>
           <w:color w:val="5AAA00"/>
         </w:rPr>
-        <w:lastRenderedPageBreak/>
-        <w:drawing>
-          <wp:anchor distT="0" distB="0" distL="114300" distR="114300" simplePos="0" relativeHeight="251658240" behindDoc="0" locked="0" layoutInCell="1" allowOverlap="1" wp14:anchorId="3BE3A933" wp14:editId="47C5FB0D">
-            <wp:simplePos x="0" y="0"/>
-            <wp:positionH relativeFrom="column">
-              <wp:posOffset>3532401</wp:posOffset>
-            </wp:positionH>
-            <wp:positionV relativeFrom="paragraph">
-              <wp:posOffset>517</wp:posOffset>
-            </wp:positionV>
-            <wp:extent cx="1807735" cy="1818167"/>
-            <wp:effectExtent l="0" t="0" r="2540" b="0"/>
-            <wp:wrapSquare wrapText="bothSides"/>
-            <wp:docPr id="704646831" name="Afbeelding 2"/>
-            <wp:cNvGraphicFramePr>
-              <a:graphicFrameLocks xmlns:a="http://schemas.openxmlformats.org/drawingml/2006/main" noChangeAspect="1"/>
-            </wp:cNvGraphicFramePr>
-            <a:graphic xmlns:a="http://schemas.openxmlformats.org/drawingml/2006/main">
-              <a:graphicData uri="http://schemas.openxmlformats.org/drawingml/2006/picture">
-                <pic:pic xmlns:pic="http://schemas.openxmlformats.org/drawingml/2006/picture">
-                  <pic:nvPicPr>
-                    <pic:cNvPr id="704646831" name="Afbeelding 704646831"/>
-                    <pic:cNvPicPr/>
-                  </pic:nvPicPr>
-                  <pic:blipFill rotWithShape="1">
-                    <a:blip r:embed="rId7" cstate="print">
-                      <a:extLst>
-                        <a:ext uri="{28A0092B-C50C-407E-A947-70E740481C1C}">
-                          <a14:useLocalDpi xmlns:a14="http://schemas.microsoft.com/office/drawing/2010/main" val="0"/>
-                        </a:ext>
-                      </a:extLst>
-                    </a:blip>
-                    <a:srcRect l="16187" r="17559"/>
-                    <a:stretch>
-                      <a:fillRect/>
-                    </a:stretch>
-                  </pic:blipFill>
-                  <pic:spPr bwMode="auto">
-                    <a:xfrm>
-                      <a:off x="0" y="0"/>
-                      <a:ext cx="1807735" cy="1818167"/>
-                    </a:xfrm>
-                    <a:prstGeom prst="rect">
-                      <a:avLst/>
-                    </a:prstGeom>
-                    <a:ln>
-                      <a:noFill/>
-                    </a:ln>
-                    <a:extLst>
-                      <a:ext uri="{53640926-AAD7-44D8-BBD7-CCE9431645EC}">
-                        <a14:shadowObscured xmlns:a14="http://schemas.microsoft.com/office/drawing/2010/main"/>
-                      </a:ext>
-                    </a:extLst>
-                  </pic:spPr>
-                </pic:pic>
-              </a:graphicData>
-            </a:graphic>
-            <wp14:sizeRelH relativeFrom="margin">
-              <wp14:pctWidth>0</wp14:pctWidth>
-            </wp14:sizeRelH>
-            <wp14:sizeRelV relativeFrom="margin">
-              <wp14:pctHeight>0</wp14:pctHeight>
-            </wp14:sizeRelV>
-          </wp:anchor>
-        </w:drawing>
-      </w:r>
+        <w:t xml:space="preserve">Spouwmuurisolatie</w:t>
+      </w:r>
+    </w:p>
+    <w:p>
+      <w:pPr>
+        <w:pStyle w:val="Normal"/>
+        <w:spacing w:before="0" w:after="160"/>
+      </w:pPr>
+      <w:r>
+        <w:rPr>
+          <w:i/>
+          <w:rFonts w:ascii="Calibri" w:hAnsi="Calibri" w:cs="Calibri"/>
+          <w:sz w:val="20"/>
+          <w:szCs w:val="20"/>
+          <w:color w:val="888888"/>
+        </w:rPr>
+        <w:t xml:space="preserve">Niet van toepassing voor dit woningtype.</w:t>
+      </w:r>
+    </w:p>
+    <w:p>
+      <w:pPr>
+        <w:pStyle w:val="Normal"/>
+        <w:spacing w:before="0" w:after="60"/>
+      </w:pPr>
       <w:r>
         <w:rPr>
           <w:b/>
-          <w:bCs/>
+          <w:rFonts w:ascii="Calibri" w:hAnsi="Calibri" w:cs="Calibri"/>
+          <w:sz w:val="22"/>
+          <w:szCs w:val="22"/>
           <w:color w:val="5AAA00"/>
         </w:rPr>
-        <w:t>Mogelijke a</w:t>
-      </w:r>
+        <w:t xml:space="preserve">Gevelisolatie (buiten/binnen)</w:t>
+      </w:r>
+    </w:p>
+    <w:p>
+      <w:pPr>
+        <w:pStyle w:val="Normal"/>
+        <w:spacing w:before="0" w:after="40"/>
+      </w:pPr>
+      <w:r>
+        <w:rPr>
+          <w:i/>
+          <w:rFonts w:ascii="Calibri" w:hAnsi="Calibri" w:cs="Calibri"/>
+          <w:sz w:val="20"/>
+          <w:szCs w:val="20"/>
+          <w:color w:val="888888"/>
+        </w:rPr>
+        <w:t xml:space="preserve">Netto gevel (excl. glas), tussenwoning; bruto 68 m² − glas 15 m²</w:t>
+      </w:r>
+    </w:p>
+    <w:p>
+      <w:pPr>
+        <w:pStyle w:val="Normal"/>
+        <w:spacing w:before="0" w:after="20"/>
+      </w:pPr>
+      <w:r>
+        <w:rPr>
+          <w:rFonts w:ascii="Calibri" w:hAnsi="Calibri" w:cs="Calibri"/>
+          <w:sz w:val="20"/>
+          <w:szCs w:val="20"/>
+          <w:color w:val="555555"/>
+        </w:rPr>
+        <w:t xml:space="preserve">Huidige Rc: 0.3 m²K/W  —  Massief metselwerk 30–45 cm, geen spouw</w:t>
+      </w:r>
+    </w:p>
+    <w:p>
+      <w:pPr>
+        <w:pStyle w:val="Normal"/>
+        <w:spacing w:before="0" w:after="60"/>
+      </w:pPr>
+      <w:r>
+        <w:rPr>
+          <w:rFonts w:ascii="Calibri" w:hAnsi="Calibri" w:cs="Calibri"/>
+          <w:sz w:val="20"/>
+          <w:szCs w:val="20"/>
+          <w:color w:val="555555"/>
+        </w:rPr>
+        <w:t xml:space="preserve">Streefwaarde Rc: 3.5 m²K/W (ISDE-minimumeis)</w:t>
+      </w:r>
+    </w:p>
+    <w:p>
+      <w:pPr>
+        <w:pStyle w:val="Normal"/>
+        <w:spacing w:before="0" w:after="60"/>
+      </w:pPr>
+      <w:r>
+        <w:rPr>
+          <w:rFonts w:ascii="Calibri" w:hAnsi="Calibri" w:cs="Calibri"/>
+          <w:sz w:val="20"/>
+          <w:szCs w:val="20"/>
+          <w:color w:val="1D1D1B"/>
+        </w:rPr>
+        <w:t xml:space="preserve">Besparing:    8,884 kWh/jr  |  1,166 m³ gas/jr  |  €1,690 per jaar</w:t>
+      </w:r>
+    </w:p>
+    <w:p>
+      <w:pPr>
+        <w:pStyle w:val="Normal"/>
+        <w:spacing w:before="0" w:after="60"/>
+      </w:pPr>
+      <w:r>
+        <w:rPr>
+          <w:rFonts w:ascii="Calibri" w:hAnsi="Calibri" w:cs="Calibri"/>
+          <w:sz w:val="20"/>
+          <w:szCs w:val="20"/>
+          <w:color w:val="1D1D1B"/>
+        </w:rPr>
+        <w:t xml:space="preserve">Investering:  €9,275–€12,190  |  ISDE-subsidie: tot €1,073  |  Netto: €9,660</w:t>
+      </w:r>
+    </w:p>
+    <w:p>
+      <w:pPr>
+        <w:pStyle w:val="Normal"/>
+        <w:spacing w:before="0" w:after="60"/>
+      </w:pPr>
+      <w:r>
+        <w:rPr>
+          <w:rFonts w:ascii="Calibri" w:hAnsi="Calibri" w:cs="Calibri"/>
+          <w:sz w:val="20"/>
+          <w:szCs w:val="20"/>
+          <w:color w:val="1D1D1B"/>
+        </w:rPr>
+        <w:t xml:space="preserve">Terugverdientijd: 5.3 jaar  |  Na 10 jr: €19,379  |  Na 20 jr: €45,422 cumulatief bespaard</w:t>
+      </w:r>
+    </w:p>
+    <w:p>
+      <w:pPr>
+        <w:pStyle w:val="Normal"/>
+        <w:spacing w:before="0" w:after="160"/>
+      </w:pPr>
+    </w:p>
+    <w:p>
+      <w:pPr>
+        <w:pStyle w:val="Normal"/>
+        <w:spacing w:before="0" w:after="60"/>
+      </w:pPr>
       <w:r>
         <w:rPr>
           <w:b/>
-          <w:bCs/>
+          <w:rFonts w:ascii="Calibri" w:hAnsi="Calibri" w:cs="Calibri"/>
+          <w:sz w:val="22"/>
+          <w:szCs w:val="22"/>
           <w:color w:val="5AAA00"/>
         </w:rPr>
-        <w:t>anpak</w:t>
-      </w:r>
-    </w:p>
-    <w:p>
-      <w:pPr>
-        <w:spacing w:before="160" w:after="80"/>
-      </w:pPr>
-      <w:r>
-        <w:t>Een logische aanpak volgt de isola</w:t>
-      </w:r>
-      <w:r>
-        <w:t>tietrias:</w:t>
-      </w:r>
-    </w:p>
-    <w:p>
-      <w:pPr>
-        <w:pStyle w:val="Lijstalinea"/>
-        <w:numPr>
-          <w:ilvl w:val="0"/>
-          <w:numId w:val="4"/>
-        </w:numPr>
-        <w:spacing w:before="160" w:after="80"/>
-      </w:pPr>
-      <w:r>
-        <w:t>Beperk warmteverlies door te isoleren;</w:t>
-      </w:r>
-    </w:p>
-    <w:p>
-      <w:pPr>
-        <w:pStyle w:val="Lijstalinea"/>
-        <w:numPr>
-          <w:ilvl w:val="0"/>
-          <w:numId w:val="4"/>
-        </w:numPr>
-        <w:spacing w:before="160" w:after="80"/>
-      </w:pPr>
-      <w:r>
-        <w:t>Optimaliseer het afgiftesysteem</w:t>
-      </w:r>
-      <w:r>
-        <w:t>;</w:t>
-      </w:r>
-    </w:p>
-    <w:p>
-      <w:pPr>
-        <w:pStyle w:val="Lijstalinea"/>
-        <w:numPr>
-          <w:ilvl w:val="0"/>
-          <w:numId w:val="4"/>
-        </w:numPr>
-        <w:spacing w:before="160" w:after="80"/>
-      </w:pPr>
-      <w:r>
-        <w:t>Verduurzaam de opwek door bijvoorbeeld een warmtepomp of zonnepanelen</w:t>
-      </w:r>
-      <w:r>
-        <w:t>;</w:t>
-      </w:r>
-    </w:p>
-    <w:p>
-      <w:pPr>
-        <w:spacing w:before="160" w:after="80"/>
-      </w:pPr>
-    </w:p>
-    <w:p>
-      <w:pPr>
-        <w:spacing w:before="160" w:after="80"/>
-      </w:pPr>
-      <w:r>
-        <w:rPr>
-          <w:noProof/>
-        </w:rPr>
-        <w:drawing>
-          <wp:anchor distT="0" distB="0" distL="114300" distR="114300" simplePos="0" relativeHeight="251659264" behindDoc="0" locked="0" layoutInCell="1" allowOverlap="1" wp14:anchorId="28DDBF24" wp14:editId="4190CC40">
-            <wp:simplePos x="0" y="0"/>
-            <wp:positionH relativeFrom="column">
-              <wp:posOffset>1703705</wp:posOffset>
-            </wp:positionH>
-            <wp:positionV relativeFrom="paragraph">
-              <wp:posOffset>271706</wp:posOffset>
-            </wp:positionV>
-            <wp:extent cx="2891790" cy="2397760"/>
-            <wp:effectExtent l="0" t="0" r="3810" b="2540"/>
-            <wp:wrapSquare wrapText="bothSides"/>
-            <wp:docPr id="638879154" name="Afbeelding 1"/>
-            <wp:cNvGraphicFramePr>
-              <a:graphicFrameLocks xmlns:a="http://schemas.openxmlformats.org/drawingml/2006/main" noChangeAspect="1"/>
-            </wp:cNvGraphicFramePr>
-            <a:graphic xmlns:a="http://schemas.openxmlformats.org/drawingml/2006/main">
-              <a:graphicData uri="http://schemas.openxmlformats.org/drawingml/2006/picture">
-                <pic:pic xmlns:pic="http://schemas.openxmlformats.org/drawingml/2006/picture">
-                  <pic:nvPicPr>
-                    <pic:cNvPr id="638879154" name="Afbeelding 638879154"/>
-                    <pic:cNvPicPr/>
-                  </pic:nvPicPr>
-                  <pic:blipFill rotWithShape="1">
-                    <a:blip r:embed="rId8" cstate="print">
-                      <a:extLst>
-                        <a:ext uri="{28A0092B-C50C-407E-A947-70E740481C1C}">
-                          <a14:useLocalDpi xmlns:a14="http://schemas.microsoft.com/office/drawing/2010/main" val="0"/>
-                        </a:ext>
-                      </a:extLst>
-                    </a:blip>
-                    <a:srcRect l="19600"/>
-                    <a:stretch>
-                      <a:fillRect/>
-                    </a:stretch>
-                  </pic:blipFill>
-                  <pic:spPr bwMode="auto">
-                    <a:xfrm>
-                      <a:off x="0" y="0"/>
-                      <a:ext cx="2891790" cy="2397760"/>
-                    </a:xfrm>
-                    <a:prstGeom prst="rect">
-                      <a:avLst/>
-                    </a:prstGeom>
-                    <a:ln>
-                      <a:noFill/>
-                    </a:ln>
-                    <a:extLst>
-                      <a:ext uri="{53640926-AAD7-44D8-BBD7-CCE9431645EC}">
-                        <a14:shadowObscured xmlns:a14="http://schemas.microsoft.com/office/drawing/2010/main"/>
-                      </a:ext>
-                    </a:extLst>
-                  </pic:spPr>
-                </pic:pic>
-              </a:graphicData>
-            </a:graphic>
-            <wp14:sizeRelH relativeFrom="margin">
-              <wp14:pctWidth>0</wp14:pctWidth>
-            </wp14:sizeRelH>
-            <wp14:sizeRelV relativeFrom="margin">
-              <wp14:pctHeight>0</wp14:pctHeight>
-            </wp14:sizeRelV>
-          </wp:anchor>
-        </w:drawing>
-      </w:r>
-    </w:p>
-    <w:p>
-      <w:pPr>
-        <w:spacing w:before="160" w:after="80"/>
-      </w:pPr>
-    </w:p>
-    <w:p>
-      <w:pPr>
-        <w:spacing w:before="160" w:after="80"/>
-      </w:pPr>
-    </w:p>
-    <w:p>
-      <w:pPr>
-        <w:spacing w:before="160" w:after="80"/>
-      </w:pPr>
-    </w:p>
-    <w:p>
-      <w:pPr>
-        <w:spacing w:before="160" w:after="80"/>
-      </w:pPr>
-    </w:p>
-    <w:p>
-      <w:pPr>
-        <w:spacing w:before="160" w:after="80"/>
-      </w:pPr>
-    </w:p>
-    <w:p>
-      <w:pPr>
-        <w:spacing w:before="160" w:after="80"/>
-      </w:pPr>
-    </w:p>
-    <w:p>
-      <w:pPr>
-        <w:spacing w:before="160" w:after="80"/>
-      </w:pPr>
-    </w:p>
-    <w:p>
-      <w:pPr>
-        <w:spacing w:before="160" w:after="80"/>
-      </w:pPr>
-    </w:p>
-    <w:p>
-      <w:pPr>
-        <w:spacing w:before="160" w:after="80"/>
-      </w:pPr>
-    </w:p>
-    <w:p>
-      <w:pPr>
-        <w:spacing w:before="160" w:after="80"/>
-      </w:pPr>
-    </w:p>
-    <w:p>
-      <w:pPr>
-        <w:spacing w:before="160" w:after="80"/>
-      </w:pPr>
-    </w:p>
-    <w:p>
-      <w:pPr>
-        <w:spacing w:before="60" w:after="160"/>
-      </w:pPr>
-      <w:r>
-        <w:rPr>
-          <w:color w:val="1A2340"/>
-        </w:rPr>
-        <w:t xml:space="preserve">Aanbevolen maatregelen voor deze bouwperiode:</w:t>
-      </w:r>
-      <w:proofErr w:type="spellStart"/>
-      <w:r>
-        <w:rPr>
-          <w:color w:val="1A2340"/>
-        </w:rPr>
-        <w:t/>
-      </w:r>
-      <w:proofErr w:type="spellEnd"/>
-      <w:r>
-        <w:rPr>
-          <w:color w:val="1A2340"/>
-        </w:rPr>
-        <w:t/>
-      </w:r>
-    </w:p>
-    <w:p>
-      <w:pPr>
-        <w:spacing w:before="60" w:after="160"/>
-      </w:pPr>
-      <w:r>
-        <w:rPr>
-          <w:color w:val="1A2340"/>
-        </w:rPr>
-        <w:t xml:space="preserve">- Gevel: isoleer de binnenzijde of buitenzijde bij massieve muren, of na-isoleer de spouw indien deze aanwezig en schoon is.</w:t>
-      </w:r>
-    </w:p>
-    <w:p>
-      <w:pPr>
-        <w:spacing w:before="60" w:after="160"/>
-      </w:pPr>
-      <w:r>
-        <w:rPr>
-          <w:color w:val="1A2340"/>
-        </w:rPr>
-        <w:t xml:space="preserve">- Dak: breng volledige isolatie aan, aangezien de oorspronkelijke waarde nagenoeg nul is.</w:t>
-      </w:r>
-    </w:p>
-    <w:p>
-      <w:pPr>
-        <w:spacing w:before="60" w:after="160"/>
-      </w:pPr>
-      <w:r>
-        <w:rPr>
-          <w:color w:val="1A2340"/>
-        </w:rPr>
-        <w:t xml:space="preserve">- Vloer: isoleer de houten vloer of de bodem van de kruipruimte om optrekkend vocht en kou tegen te gaan.</w:t>
-      </w:r>
-    </w:p>
-    <w:p>
-      <w:pPr>
-        <w:spacing w:before="60" w:after="160"/>
-      </w:pPr>
-      <w:r>
-        <w:rPr>
-          <w:color w:val="1A2340"/>
-        </w:rPr>
-        <w:t xml:space="preserve">- Ramen: vervang enkel glas door HR++ of vacuümglas.</w:t>
-      </w:r>
-    </w:p>
-    <w:p>
-      <w:pPr>
-        <w:spacing w:before="60" w:after="160"/>
-      </w:pPr>
-      <w:r>
-        <w:rPr>
-          <w:color w:val="1A2340"/>
-        </w:rPr>
-        <w:t xml:space="preserve">- Ventilatie: breng gecontroleerde ventilatie aan (zoals decentrale WTW) om de verhoogde luchtvochtigheid na kierdichting te beheersen.</w:t>
-      </w:r>
-    </w:p>
-    <w:p>
-      <w:pPr>
-        <w:spacing w:before="120" w:after="120"/>
-      </w:pPr>
-    </w:p>
-    <w:p>
-      <w:pPr>
-        <w:spacing w:before="60" w:after="160"/>
-      </w:pPr>
-      <w:r>
-        <w:rPr>
-          <w:color w:val="1A2340"/>
-        </w:rPr>
-        <w:t xml:space="preserve">Laat een schil-scan uitvoeren om te bepalen welke isolatiemaatregel het meest rendabel is voor uw specifieke situatie.</w:t>
-      </w:r>
-    </w:p>
-    <w:p>
-      <w:pPr>
-        <w:spacing w:before="120" w:after="120"/>
-      </w:pPr>
-    </w:p>
-    <w:p>
-      <w:pPr>
-        <w:spacing w:before="60" w:after="160"/>
-      </w:pPr>
-      <w:r>
-        <w:rPr>
-          <w:color w:val="1A2340"/>
-        </w:rPr>
-        <w:t xml:space="preserve">De bovenstaande aanbevelingen zijn indicatief op basis van registratiedata. Maatwerkadvies door erkende bedrijven is altijd aan te raden.</w:t>
-      </w:r>
-    </w:p>
-    <w:p>
-      <w:pPr>
-        <w:spacing w:before="240"/>
-      </w:pPr>
-      <w:r>
-        <w:br w:type="page"/>
+        <w:t xml:space="preserve">Glas</w:t>
+      </w:r>
+    </w:p>
+    <w:p>
+      <w:pPr>
+        <w:pStyle w:val="Normal"/>
+        <w:spacing w:before="0" w:after="200"/>
+      </w:pPr>
+      <w:r>
+        <w:rPr>
+          <w:i/>
+          <w:rFonts w:ascii="Calibri" w:hAnsi="Calibri" w:cs="Calibri"/>
+          <w:sz w:val="20"/>
+          <w:szCs w:val="20"/>
+          <w:color w:val="888888"/>
+        </w:rPr>
+        <w:t xml:space="preserve">Glasoppervlak o.b.v. hoeveelheden glas per gevelzijde, tussenwoning</w:t>
+      </w:r>
+    </w:p>
+    <w:p>
+      <w:pPr>
+        <w:pStyle w:val="Normal"/>
+        <w:spacing w:before="0" w:after="120"/>
+      </w:pPr>
+    </w:p>
+    <w:p>
+      <w:pPr>
+        <w:pStyle w:val="Normal"/>
+        <w:spacing w:before="0" w:after="100"/>
+      </w:pPr>
+      <w:r>
+        <w:rPr>
+          <w:b/>
+          <w:rFonts w:ascii="Calibri" w:hAnsi="Calibri" w:cs="Calibri"/>
+          <w:sz w:val="24"/>
+          <w:szCs w:val="24"/>
+          <w:color w:val="1D1D1B"/>
+        </w:rPr>
+        <w:t xml:space="preserve">Totaaloverzicht bij uitvoering van alle maatregelen</w:t>
+      </w:r>
+    </w:p>
+    <w:p>
+      <w:pPr>
+        <w:pStyle w:val="Normal"/>
+        <w:spacing w:before="0" w:after="120"/>
+      </w:pPr>
+      <w:r>
+        <w:rPr>
+          <w:rFonts w:ascii="Calibri" w:hAnsi="Calibri" w:cs="Calibri"/>
+          <w:sz w:val="20"/>
+          <w:szCs w:val="20"/>
+          <w:color w:val="1D1D1B"/>
+        </w:rPr>
+        <w:t xml:space="preserve">Wanneer u meerdere isolatiemaatregelen combineert — of een isolatiemaatregel koppelt aan een warmtepomp — verdubbelt de ISDE-subsidie automatisch. Uw subsidie komt dan niet uit op €2,364 maar op €4,728.</w:t>
+      </w:r>
+    </w:p>
+    <w:p>
+      <w:pPr>
+        <w:pStyle w:val="Normal"/>
+        <w:spacing w:before="0" w:after="40"/>
+      </w:pPr>
+      <w:r>
+        <w:rPr>
+          <w:rFonts w:ascii="Calibri" w:hAnsi="Calibri" w:cs="Calibri"/>
+          <w:sz w:val="20"/>
+          <w:szCs w:val="20"/>
+          <w:color w:val="1D1D1B"/>
+        </w:rPr>
+        <w:t xml:space="preserve">Totale investering:  €16,625 – €23,065</w:t>
+      </w:r>
+    </w:p>
+    <w:p>
+      <w:pPr>
+        <w:pStyle w:val="Normal"/>
+        <w:spacing w:before="0" w:after="40"/>
+      </w:pPr>
+      <w:r>
+        <w:rPr>
+          <w:rFonts w:ascii="Calibri" w:hAnsi="Calibri" w:cs="Calibri"/>
+          <w:sz w:val="20"/>
+          <w:szCs w:val="20"/>
+          <w:color w:val="1D1D1B"/>
+        </w:rPr>
+        <w:t xml:space="preserve">Subsidie (enkelvoudig tarief):  €2,364</w:t>
+      </w:r>
+    </w:p>
+    <w:p>
+      <w:pPr>
+        <w:pStyle w:val="Normal"/>
+        <w:spacing w:before="0" w:after="40"/>
+      </w:pPr>
+      <w:r>
+        <w:rPr>
+          <w:b/>
+          <w:rFonts w:ascii="Calibri" w:hAnsi="Calibri" w:cs="Calibri"/>
+          <w:sz w:val="20"/>
+          <w:szCs w:val="20"/>
+          <w:color w:val="2E5C00"/>
+        </w:rPr>
+        <w:t xml:space="preserve">Subsidie (meervoudig, combinatie):  €4,728</w:t>
+      </w:r>
+    </w:p>
+    <w:p>
+      <w:pPr>
+        <w:pStyle w:val="Normal"/>
+        <w:spacing w:before="0" w:after="40"/>
+      </w:pPr>
+      <w:r>
+        <w:rPr>
+          <w:rFonts w:ascii="Calibri" w:hAnsi="Calibri" w:cs="Calibri"/>
+          <w:sz w:val="20"/>
+          <w:szCs w:val="20"/>
+          <w:color w:val="1D1D1B"/>
+        </w:rPr>
+        <w:t xml:space="preserve">Netto investering (enkelvoudig):  €17,481</w:t>
+      </w:r>
+    </w:p>
+    <w:p>
+      <w:pPr>
+        <w:pStyle w:val="Normal"/>
+        <w:spacing w:before="0" w:after="40"/>
+      </w:pPr>
+      <w:r>
+        <w:rPr>
+          <w:b/>
+          <w:rFonts w:ascii="Calibri" w:hAnsi="Calibri" w:cs="Calibri"/>
+          <w:sz w:val="20"/>
+          <w:szCs w:val="20"/>
+          <w:color w:val="2E5C00"/>
+        </w:rPr>
+        <w:t xml:space="preserve">Netto investering (meervoudig):  €15,117</w:t>
+      </w:r>
+    </w:p>
+    <w:p>
+      <w:pPr>
+        <w:pStyle w:val="Normal"/>
+        <w:spacing w:before="0" w:after="40"/>
+      </w:pPr>
+      <w:r>
+        <w:rPr>
+          <w:rFonts w:ascii="Calibri" w:hAnsi="Calibri" w:cs="Calibri"/>
+          <w:sz w:val="20"/>
+          <w:szCs w:val="20"/>
+          <w:color w:val="1D1D1B"/>
+        </w:rPr>
+        <w:t xml:space="preserve">Jaarlijkse energiebesparing:  €6,150/jr</w:t>
+      </w:r>
+    </w:p>
+    <w:p>
+      <w:pPr>
+        <w:pStyle w:val="Normal"/>
+        <w:spacing w:before="0" w:after="40"/>
+      </w:pPr>
+      <w:r>
+        <w:rPr>
+          <w:rFonts w:ascii="Calibri" w:hAnsi="Calibri" w:cs="Calibri"/>
+          <w:sz w:val="20"/>
+          <w:szCs w:val="20"/>
+          <w:color w:val="1D1D1B"/>
+        </w:rPr>
+        <w:t xml:space="preserve">Terugverdientijd (enkelvoudig):  2.8 jaar</w:t>
+      </w:r>
+    </w:p>
+    <w:p>
+      <w:pPr>
+        <w:pStyle w:val="Normal"/>
+        <w:spacing w:before="0" w:after="40"/>
+      </w:pPr>
+      <w:r>
+        <w:rPr>
+          <w:b/>
+          <w:rFonts w:ascii="Calibri" w:hAnsi="Calibri" w:cs="Calibri"/>
+          <w:sz w:val="20"/>
+          <w:szCs w:val="20"/>
+          <w:color w:val="2E5C00"/>
+        </w:rPr>
+        <w:t xml:space="preserve">Terugverdientijd (meervoudig):  2.4 jaar</w:t>
+      </w:r>
+    </w:p>
+    <w:p>
+      <w:pPr>
+        <w:pStyle w:val="Normal"/>
+        <w:spacing w:before="0" w:after="160"/>
+      </w:pPr>
+    </w:p>
+    <w:p>
+      <w:pPr>
+        <w:pStyle w:val="Normal"/>
+        <w:spacing w:before="0" w:after="160"/>
+      </w:pPr>
+    </w:p>
+    <w:p>
+      <w:pPr>
+        <w:pStyle w:val="Normal"/>
+        <w:spacing w:before="0" w:after="60"/>
+      </w:pPr>
+      <w:r>
+        <w:rPr>
+          <w:b/>
+          <w:rFonts w:ascii="Calibri" w:hAnsi="Calibri" w:cs="Calibri"/>
+          <w:sz w:val="20"/>
+          <w:szCs w:val="20"/>
+          <w:color w:val="B71C1C"/>
+        </w:rPr>
+        <w:t xml:space="preserve">Aandachtspunt (spouw): Bouwjaar 1876 &lt; 1930: massief metselwerk is aannemelijk, er is waarschijnlijk geen spouwmuur aanwezig.</w:t>
+      </w:r>
+    </w:p>
+    <w:p>
+      <w:pPr>
+        <w:pStyle w:val="Normal"/>
+        <w:spacing w:before="0" w:after="120"/>
+      </w:pPr>
+      <w:r>
+        <w:rPr>
+          <w:i/>
+          <w:rFonts w:ascii="Calibri" w:hAnsi="Calibri" w:cs="Calibri"/>
+          <w:sz w:val="20"/>
+          <w:szCs w:val="20"/>
+          <w:color w:val="555555"/>
+        </w:rPr>
+        <w:t xml:space="preserve">  → Spouwmuurisolatie is technisch niet mogelijk bij massief metselwerk. Overweeg binnenisolatie of buitengevelisolatie; laat dit bouwkundig controleren.</w:t>
+      </w:r>
+    </w:p>
+    <w:p>
+      <w:pPr>
+        <w:pStyle w:val="Normal"/>
+        <w:spacing w:before="0" w:after="60"/>
+      </w:pPr>
+      <w:r>
+        <w:rPr>
+          <w:b/>
+          <w:rFonts w:ascii="Calibri" w:hAnsi="Calibri" w:cs="Calibri"/>
+          <w:sz w:val="20"/>
+          <w:szCs w:val="20"/>
+          <w:color w:val="B71C1C"/>
+        </w:rPr>
+        <w:t xml:space="preserve">Aandachtspunt (gevel): Bouwjaar 1876 &lt; 1975: bij binnenisolatie van gevels bestaat risico op condensatie en schimmelvorming ter plaatse van balkkoppen.</w:t>
+      </w:r>
+    </w:p>
+    <w:p>
+      <w:pPr>
+        <w:pStyle w:val="Normal"/>
+        <w:spacing w:before="0" w:after="120"/>
+      </w:pPr>
+      <w:r>
+        <w:rPr>
+          <w:i/>
+          <w:rFonts w:ascii="Calibri" w:hAnsi="Calibri" w:cs="Calibri"/>
+          <w:sz w:val="20"/>
+          <w:szCs w:val="20"/>
+          <w:color w:val="555555"/>
+        </w:rPr>
+        <w:t xml:space="preserve">  → Laat een bouwfysisch advies uitvoeren vóór toepassing van binnenisolatie. Let op dampopen uitvoering en detaillering van balkkoppen en aansluitingen.</w:t>
+      </w:r>
+    </w:p>
+    <w:p>
+      <w:pPr>
+        <w:pStyle w:val="Normal"/>
+        <w:spacing w:before="0" w:after="160"/>
+      </w:pPr>
+      <w:r>
+        <w:rPr>
+          <w:rFonts w:ascii="Calibri" w:hAnsi="Calibri" w:cs="Calibri"/>
+          <w:sz w:val="20"/>
+          <w:szCs w:val="20"/>
+          <w:color w:val="555555"/>
+        </w:rPr>
+        <w:t xml:space="preserve">Berekend op basis van woningtype, bouwjaar en isolatiewaarden per bouwperiode (ISSO 82.1, NEN 1068). Alle bedragen zijn indicatief.</w:t>
       </w:r>
     </w:p>
     <w:p>
@@ -2735,20 +2585,6 @@
           <w:color w:val="1A2340"/>
         </w:rPr>
         <w:t xml:space="preserve">- Vocht en houtrot: deze woningen zijn vaak 'dampopen' gebouwd zonder spouw of met een zeer smalle spouw. Bij binnenisolatie daalt de temperatuur van de oorspronkelijke muur sterk, met condensatierisico als gevolg. Gebruik vochtregulerende folies (zoals Intello) en dampopen materialen zoals houtvezel of vlas — vermijd volledig dampdichte plastics.</w:t>
-      </w:r>
-      <w:proofErr w:type="spellStart"/>
-      <w:r>
-        <w:rPr>
-          <w:color w:val="1A2340"/>
-        </w:rPr>
-        <w:t/>
-      </w:r>
-      <w:proofErr w:type="spellEnd"/>
-      <w:r>
-        <w:rPr>
-          <w:color w:val="1A2340"/>
-        </w:rPr>
-        <w:t/>
       </w:r>
     </w:p>
     <w:p>
@@ -2832,10 +2668,9 @@
       </w:tblPr>
       <w:tblGrid>
         <w:gridCol w:w="3200"/>
-        <w:gridCol w:w="1456"/>
-        <w:gridCol w:w="1457"/>
-        <w:gridCol w:w="1457"/>
-        <w:gridCol w:w="1456"/>
+        <w:gridCol w:w="1942"/>
+        <w:gridCol w:w="1942"/>
+        <w:gridCol w:w="1942"/>
       </w:tblGrid>
       <w:tr>
         <w:trPr>
@@ -2862,7 +2697,7 @@
         </w:tc>
         <w:tc>
           <w:tcPr>
-            <w:tcW w:w="1456" w:type="dxa"/>
+            <w:tcW w:w="1942" w:type="dxa"/>
             <w:shd w:val="clear" w:color="auto" w:fill="5AAA00"/>
           </w:tcPr>
           <w:p>
@@ -2875,13 +2710,13 @@
                 <w:color w:val="FFFFFF"/>
                 <w:sz w:val="22"/>
               </w:rPr>
-              <w:t>Enkelvoudig</w:t>
-            </w:r>
-          </w:p>
-        </w:tc>
-        <w:tc>
-          <w:tcPr>
-            <w:tcW w:w="1457" w:type="dxa"/>
+              <w:t>ISDE 2026 (€/m²)</w:t>
+            </w:r>
+          </w:p>
+        </w:tc>
+        <w:tc>
+          <w:tcPr>
+            <w:tcW w:w="1942" w:type="dxa"/>
             <w:shd w:val="clear" w:color="auto" w:fill="5AAA00"/>
           </w:tcPr>
           <w:p>
@@ -2894,32 +2729,13 @@
                 <w:color w:val="FFFFFF"/>
                 <w:sz w:val="22"/>
               </w:rPr>
-              <w:t>Meervoudig</w:t>
-            </w:r>
-          </w:p>
-        </w:tc>
-        <w:tc>
-          <w:tcPr>
-            <w:tcW w:w="1457" w:type="dxa"/>
-            <w:shd w:val="clear" w:color="auto" w:fill="5AAA00"/>
-          </w:tcPr>
-          <w:p>
-            <w:r/>
-            <w:r>
-              <w:rPr>
-                <w:rFonts w:ascii="Calibri" w:hAnsi="Calibri"/>
-                <w:b/>
-                <w:i w:val="0"/>
-                <w:color w:val="FFFFFF"/>
-                <w:sz w:val="22"/>
-              </w:rPr>
               <w:t>Biobased bonus</w:t>
             </w:r>
           </w:p>
         </w:tc>
         <w:tc>
           <w:tcPr>
-            <w:tcW w:w="1456" w:type="dxa"/>
+            <w:tcW w:w="1942" w:type="dxa"/>
             <w:shd w:val="clear" w:color="auto" w:fill="5AAA00"/>
           </w:tcPr>
           <w:p>
@@ -2962,7 +2778,26 @@
         </w:tc>
         <w:tc>
           <w:tcPr>
-            <w:tcW w:type="dxa" w:w="1456"/>
+            <w:tcW w:type="dxa" w:w="1942"/>
+            <w:shd w:val="clear" w:color="auto" w:fill="FFFFFF"/>
+          </w:tcPr>
+          <w:p>
+            <w:r/>
+            <w:r>
+              <w:rPr>
+                <w:rFonts w:ascii="Calibri" w:hAnsi="Calibri"/>
+                <w:b/>
+                <w:i w:val="0"/>
+                <w:color w:val="1D1D1B"/>
+                <w:sz w:val="22"/>
+              </w:rPr>
+              <w:t>€ 20.25/m²</w:t>
+            </w:r>
+          </w:p>
+        </w:tc>
+        <w:tc>
+          <w:tcPr>
+            <w:tcW w:type="dxa" w:w="1942"/>
             <w:shd w:val="clear" w:color="auto" w:fill="FFFFFF"/>
           </w:tcPr>
           <w:p>
@@ -2975,51 +2810,13 @@
                 <w:color w:val="1D1D1B"/>
                 <w:sz w:val="22"/>
               </w:rPr>
-              <w:t>€ 10.13/m²</w:t>
-            </w:r>
-          </w:p>
-        </w:tc>
-        <w:tc>
-          <w:tcPr>
-            <w:tcW w:type="dxa" w:w="1457"/>
-            <w:shd w:val="clear" w:color="auto" w:fill="FFFFFF"/>
-          </w:tcPr>
-          <w:p>
-            <w:r/>
-            <w:r>
-              <w:rPr>
-                <w:rFonts w:ascii="Calibri" w:hAnsi="Calibri"/>
-                <w:b/>
-                <w:i w:val="0"/>
-                <w:color w:val="1D1D1B"/>
-                <w:sz w:val="22"/>
-              </w:rPr>
-              <w:t>€ 20.25/m²</w:t>
-            </w:r>
-          </w:p>
-        </w:tc>
-        <w:tc>
-          <w:tcPr>
-            <w:tcW w:type="dxa" w:w="1457"/>
-            <w:shd w:val="clear" w:color="auto" w:fill="FFFFFF"/>
-          </w:tcPr>
-          <w:p>
-            <w:r/>
-            <w:r>
-              <w:rPr>
-                <w:rFonts w:ascii="Calibri" w:hAnsi="Calibri"/>
-                <w:b w:val="0"/>
-                <w:i w:val="0"/>
-                <w:color w:val="1D1D1B"/>
-                <w:sz w:val="22"/>
-              </w:rPr>
               <w:t>+ € 6.00/m²</w:t>
             </w:r>
           </w:p>
         </w:tc>
         <w:tc>
           <w:tcPr>
-            <w:tcW w:type="dxa" w:w="1456"/>
+            <w:tcW w:type="dxa" w:w="1942"/>
             <w:shd w:val="clear" w:color="auto" w:fill="FFFFFF"/>
           </w:tcPr>
           <w:p>
@@ -3062,7 +2859,26 @@
         </w:tc>
         <w:tc>
           <w:tcPr>
-            <w:tcW w:type="dxa" w:w="1456"/>
+            <w:tcW w:type="dxa" w:w="1942"/>
+            <w:shd w:val="clear" w:color="auto" w:fill="FFFFFF"/>
+          </w:tcPr>
+          <w:p>
+            <w:r/>
+            <w:r>
+              <w:rPr>
+                <w:rFonts w:ascii="Calibri" w:hAnsi="Calibri"/>
+                <w:b/>
+                <w:i w:val="0"/>
+                <w:color w:val="1D1D1B"/>
+                <w:sz w:val="22"/>
+              </w:rPr>
+              <w:t>€ 16.25/m²</w:t>
+            </w:r>
+          </w:p>
+        </w:tc>
+        <w:tc>
+          <w:tcPr>
+            <w:tcW w:type="dxa" w:w="1942"/>
             <w:shd w:val="clear" w:color="auto" w:fill="FFFFFF"/>
           </w:tcPr>
           <w:p>
@@ -3075,51 +2891,13 @@
                 <w:color w:val="1D1D1B"/>
                 <w:sz w:val="22"/>
               </w:rPr>
-              <w:t>€ 8.13/m²</w:t>
-            </w:r>
-          </w:p>
-        </w:tc>
-        <w:tc>
-          <w:tcPr>
-            <w:tcW w:type="dxa" w:w="1457"/>
-            <w:shd w:val="clear" w:color="auto" w:fill="FFFFFF"/>
-          </w:tcPr>
-          <w:p>
-            <w:r/>
-            <w:r>
-              <w:rPr>
-                <w:rFonts w:ascii="Calibri" w:hAnsi="Calibri"/>
-                <w:b/>
-                <w:i w:val="0"/>
-                <w:color w:val="1D1D1B"/>
-                <w:sz w:val="22"/>
-              </w:rPr>
-              <w:t>€ 16.25/m²</w:t>
-            </w:r>
-          </w:p>
-        </w:tc>
-        <w:tc>
-          <w:tcPr>
-            <w:tcW w:type="dxa" w:w="1457"/>
-            <w:shd w:val="clear" w:color="auto" w:fill="FFFFFF"/>
-          </w:tcPr>
-          <w:p>
-            <w:r/>
-            <w:r>
-              <w:rPr>
-                <w:rFonts w:ascii="Calibri" w:hAnsi="Calibri"/>
-                <w:b w:val="0"/>
-                <w:i w:val="0"/>
-                <w:color w:val="1D1D1B"/>
-                <w:sz w:val="22"/>
-              </w:rPr>
               <w:t>+ € 5.00/m²</w:t>
             </w:r>
           </w:p>
         </w:tc>
         <w:tc>
           <w:tcPr>
-            <w:tcW w:type="dxa" w:w="1456"/>
+            <w:tcW w:type="dxa" w:w="1942"/>
             <w:shd w:val="clear" w:color="auto" w:fill="FFFFFF"/>
           </w:tcPr>
           <w:p>
@@ -3162,7 +2940,26 @@
         </w:tc>
         <w:tc>
           <w:tcPr>
-            <w:tcW w:type="dxa" w:w="1456"/>
+            <w:tcW w:type="dxa" w:w="1942"/>
+            <w:shd w:val="clear" w:color="auto" w:fill="FFFFFF"/>
+          </w:tcPr>
+          <w:p>
+            <w:r/>
+            <w:r>
+              <w:rPr>
+                <w:rFonts w:ascii="Calibri" w:hAnsi="Calibri"/>
+                <w:b/>
+                <w:i w:val="0"/>
+                <w:color w:val="1D1D1B"/>
+                <w:sz w:val="22"/>
+              </w:rPr>
+              <w:t>€ 4.00/m²</w:t>
+            </w:r>
+          </w:p>
+        </w:tc>
+        <w:tc>
+          <w:tcPr>
+            <w:tcW w:type="dxa" w:w="1942"/>
             <w:shd w:val="clear" w:color="auto" w:fill="FFFFFF"/>
           </w:tcPr>
           <w:p>
@@ -3175,51 +2972,13 @@
                 <w:color w:val="1D1D1B"/>
                 <w:sz w:val="22"/>
               </w:rPr>
-              <w:t>€ 2.00/m²</w:t>
-            </w:r>
-          </w:p>
-        </w:tc>
-        <w:tc>
-          <w:tcPr>
-            <w:tcW w:type="dxa" w:w="1457"/>
-            <w:shd w:val="clear" w:color="auto" w:fill="FFFFFF"/>
-          </w:tcPr>
-          <w:p>
-            <w:r/>
-            <w:r>
-              <w:rPr>
-                <w:rFonts w:ascii="Calibri" w:hAnsi="Calibri"/>
-                <w:b/>
-                <w:i w:val="0"/>
-                <w:color w:val="1D1D1B"/>
-                <w:sz w:val="22"/>
-              </w:rPr>
-              <w:t>€ 4.00/m²</w:t>
-            </w:r>
-          </w:p>
-        </w:tc>
-        <w:tc>
-          <w:tcPr>
-            <w:tcW w:type="dxa" w:w="1457"/>
-            <w:shd w:val="clear" w:color="auto" w:fill="FFFFFF"/>
-          </w:tcPr>
-          <w:p>
-            <w:r/>
-            <w:r>
-              <w:rPr>
-                <w:rFonts w:ascii="Calibri" w:hAnsi="Calibri"/>
-                <w:b w:val="0"/>
-                <w:i w:val="0"/>
-                <w:color w:val="1D1D1B"/>
-                <w:sz w:val="22"/>
-              </w:rPr>
               <w:t>+ € 1.50/m²</w:t>
             </w:r>
           </w:p>
         </w:tc>
         <w:tc>
           <w:tcPr>
-            <w:tcW w:type="dxa" w:w="1456"/>
+            <w:tcW w:type="dxa" w:w="1942"/>
             <w:shd w:val="clear" w:color="auto" w:fill="FFFFFF"/>
           </w:tcPr>
           <w:p>
@@ -3262,7 +3021,26 @@
         </w:tc>
         <w:tc>
           <w:tcPr>
-            <w:tcW w:type="dxa" w:w="1456"/>
+            <w:tcW w:type="dxa" w:w="1942"/>
+            <w:shd w:val="clear" w:color="auto" w:fill="FFFFFF"/>
+          </w:tcPr>
+          <w:p>
+            <w:r/>
+            <w:r>
+              <w:rPr>
+                <w:rFonts w:ascii="Calibri" w:hAnsi="Calibri"/>
+                <w:b/>
+                <w:i w:val="0"/>
+                <w:color w:val="1D1D1B"/>
+                <w:sz w:val="22"/>
+              </w:rPr>
+              <w:t>€ 5.25/m²</w:t>
+            </w:r>
+          </w:p>
+        </w:tc>
+        <w:tc>
+          <w:tcPr>
+            <w:tcW w:type="dxa" w:w="1942"/>
             <w:shd w:val="clear" w:color="auto" w:fill="FFFFFF"/>
           </w:tcPr>
           <w:p>
@@ -3275,51 +3053,13 @@
                 <w:color w:val="1D1D1B"/>
                 <w:sz w:val="22"/>
               </w:rPr>
-              <w:t>€ 2.63/m²</w:t>
-            </w:r>
-          </w:p>
-        </w:tc>
-        <w:tc>
-          <w:tcPr>
-            <w:tcW w:type="dxa" w:w="1457"/>
-            <w:shd w:val="clear" w:color="auto" w:fill="FFFFFF"/>
-          </w:tcPr>
-          <w:p>
-            <w:r/>
-            <w:r>
-              <w:rPr>
-                <w:rFonts w:ascii="Calibri" w:hAnsi="Calibri"/>
-                <w:b/>
-                <w:i w:val="0"/>
-                <w:color w:val="1D1D1B"/>
-                <w:sz w:val="22"/>
-              </w:rPr>
-              <w:t>€ 5.25/m²</w:t>
-            </w:r>
-          </w:p>
-        </w:tc>
-        <w:tc>
-          <w:tcPr>
-            <w:tcW w:type="dxa" w:w="1457"/>
-            <w:shd w:val="clear" w:color="auto" w:fill="FFFFFF"/>
-          </w:tcPr>
-          <w:p>
-            <w:r/>
-            <w:r>
-              <w:rPr>
-                <w:rFonts w:ascii="Calibri" w:hAnsi="Calibri"/>
-                <w:b w:val="0"/>
-                <w:i w:val="0"/>
-                <w:color w:val="1D1D1B"/>
-                <w:sz w:val="22"/>
-              </w:rPr>
               <w:t>+ € 1.50/m²</w:t>
             </w:r>
           </w:p>
         </w:tc>
         <w:tc>
           <w:tcPr>
-            <w:tcW w:type="dxa" w:w="1456"/>
+            <w:tcW w:type="dxa" w:w="1942"/>
             <w:shd w:val="clear" w:color="auto" w:fill="FFFFFF"/>
           </w:tcPr>
           <w:p>
@@ -3362,7 +3102,26 @@
         </w:tc>
         <w:tc>
           <w:tcPr>
-            <w:tcW w:type="dxa" w:w="1456"/>
+            <w:tcW w:type="dxa" w:w="1942"/>
+            <w:shd w:val="clear" w:color="auto" w:fill="FFFFFF"/>
+          </w:tcPr>
+          <w:p>
+            <w:r/>
+            <w:r>
+              <w:rPr>
+                <w:rFonts w:ascii="Calibri" w:hAnsi="Calibri"/>
+                <w:b/>
+                <w:i w:val="0"/>
+                <w:color w:val="1D1D1B"/>
+                <w:sz w:val="22"/>
+              </w:rPr>
+              <w:t>€ 5.50/m²</w:t>
+            </w:r>
+          </w:p>
+        </w:tc>
+        <w:tc>
+          <w:tcPr>
+            <w:tcW w:type="dxa" w:w="1942"/>
             <w:shd w:val="clear" w:color="auto" w:fill="FFFFFF"/>
           </w:tcPr>
           <w:p>
@@ -3375,51 +3134,13 @@
                 <w:color w:val="1D1D1B"/>
                 <w:sz w:val="22"/>
               </w:rPr>
-              <w:t>€ 2.75/m²</w:t>
-            </w:r>
-          </w:p>
-        </w:tc>
-        <w:tc>
-          <w:tcPr>
-            <w:tcW w:type="dxa" w:w="1457"/>
-            <w:shd w:val="clear" w:color="auto" w:fill="FFFFFF"/>
-          </w:tcPr>
-          <w:p>
-            <w:r/>
-            <w:r>
-              <w:rPr>
-                <w:rFonts w:ascii="Calibri" w:hAnsi="Calibri"/>
-                <w:b/>
-                <w:i w:val="0"/>
-                <w:color w:val="1D1D1B"/>
-                <w:sz w:val="22"/>
-              </w:rPr>
-              <w:t>€ 5.50/m²</w:t>
-            </w:r>
-          </w:p>
-        </w:tc>
-        <w:tc>
-          <w:tcPr>
-            <w:tcW w:type="dxa" w:w="1457"/>
-            <w:shd w:val="clear" w:color="auto" w:fill="FFFFFF"/>
-          </w:tcPr>
-          <w:p>
-            <w:r/>
-            <w:r>
-              <w:rPr>
-                <w:rFonts w:ascii="Calibri" w:hAnsi="Calibri"/>
-                <w:b w:val="0"/>
-                <w:i w:val="0"/>
-                <w:color w:val="1D1D1B"/>
-                <w:sz w:val="22"/>
-              </w:rPr>
               <w:t>+ € 2.00/m²</w:t>
             </w:r>
           </w:p>
         </w:tc>
         <w:tc>
           <w:tcPr>
-            <w:tcW w:type="dxa" w:w="1456"/>
+            <w:tcW w:type="dxa" w:w="1942"/>
             <w:shd w:val="clear" w:color="auto" w:fill="FFFFFF"/>
           </w:tcPr>
           <w:p>
@@ -3462,7 +3183,26 @@
         </w:tc>
         <w:tc>
           <w:tcPr>
-            <w:tcW w:type="dxa" w:w="1456"/>
+            <w:tcW w:type="dxa" w:w="1942"/>
+            <w:shd w:val="clear" w:color="auto" w:fill="FFFFFF"/>
+          </w:tcPr>
+          <w:p>
+            <w:r/>
+            <w:r>
+              <w:rPr>
+                <w:rFonts w:ascii="Calibri" w:hAnsi="Calibri"/>
+                <w:b/>
+                <w:i w:val="0"/>
+                <w:color w:val="1D1D1B"/>
+                <w:sz w:val="22"/>
+              </w:rPr>
+              <w:t>€ 3.00/m²</w:t>
+            </w:r>
+          </w:p>
+        </w:tc>
+        <w:tc>
+          <w:tcPr>
+            <w:tcW w:type="dxa" w:w="1942"/>
             <w:shd w:val="clear" w:color="auto" w:fill="FFFFFF"/>
           </w:tcPr>
           <w:p>
@@ -3475,13 +3215,111 @@
                 <w:color w:val="1D1D1B"/>
                 <w:sz w:val="22"/>
               </w:rPr>
-              <w:t>€ 1.50/m²</w:t>
-            </w:r>
-          </w:p>
-        </w:tc>
-        <w:tc>
-          <w:tcPr>
-            <w:tcW w:type="dxa" w:w="1457"/>
+              <w:t>+ € 1.00/m²</w:t>
+            </w:r>
+          </w:p>
+        </w:tc>
+        <w:tc>
+          <w:tcPr>
+            <w:tcW w:type="dxa" w:w="1942"/>
+            <w:shd w:val="clear" w:color="auto" w:fill="FFFFFF"/>
+          </w:tcPr>
+          <w:p>
+            <w:r/>
+            <w:r>
+              <w:rPr>
+                <w:rFonts w:ascii="Calibri" w:hAnsi="Calibri"/>
+                <w:b w:val="0"/>
+                <w:i w:val="0"/>
+                <w:color w:val="1D1D1B"/>
+                <w:sz w:val="22"/>
+              </w:rPr>
+              <w:t>Rc ≥ 1,3 m²K/W</w:t>
+            </w:r>
+          </w:p>
+        </w:tc>
+      </w:tr>
+    </w:tbl>
+    <w:p/>
+    <w:tbl>
+      <w:tblPr>
+        <w:tblW w:w="9026" w:type="dxa"/>
+        <w:tblLook w:firstColumn="1" w:firstRow="1" w:lastColumn="0" w:lastRow="0" w:noHBand="0" w:noVBand="1" w:val="04A0"/>
+      </w:tblPr>
+      <w:tblGrid>
+        <w:gridCol w:w="3200"/>
+        <w:gridCol w:w="2913"/>
+        <w:gridCol w:w="2913"/>
+      </w:tblGrid>
+      <w:tr>
+        <w:trPr>
+          <w:trHeight w:val="400" w:hRule="atLeast"/>
+        </w:trPr>
+        <w:tc>
+          <w:tcPr>
+            <w:tcW w:w="3200" w:type="dxa"/>
+            <w:shd w:val="clear" w:color="auto" w:fill="5AAA00"/>
+          </w:tcPr>
+          <w:p>
+            <w:r/>
+            <w:r>
+              <w:rPr>
+                <w:rFonts w:ascii="Calibri" w:hAnsi="Calibri"/>
+                <w:b/>
+                <w:i w:val="0"/>
+                <w:color w:val="FFFFFF"/>
+                <w:sz w:val="22"/>
+              </w:rPr>
+              <w:t>Type glas</w:t>
+            </w:r>
+          </w:p>
+        </w:tc>
+        <w:tc>
+          <w:tcPr>
+            <w:tcW w:w="2913" w:type="dxa"/>
+            <w:shd w:val="clear" w:color="auto" w:fill="5AAA00"/>
+          </w:tcPr>
+          <w:p>
+            <w:r/>
+            <w:r>
+              <w:rPr>
+                <w:rFonts w:ascii="Calibri" w:hAnsi="Calibri"/>
+                <w:b/>
+                <w:i w:val="0"/>
+                <w:color w:val="FFFFFF"/>
+                <w:sz w:val="22"/>
+              </w:rPr>
+              <w:t>ISDE 2026 (€/m²)</w:t>
+            </w:r>
+          </w:p>
+        </w:tc>
+        <w:tc>
+          <w:tcPr>
+            <w:tcW w:w="2913" w:type="dxa"/>
+            <w:shd w:val="clear" w:color="auto" w:fill="5AAA00"/>
+          </w:tcPr>
+          <w:p>
+            <w:r/>
+            <w:r>
+              <w:rPr>
+                <w:rFonts w:ascii="Calibri" w:hAnsi="Calibri"/>
+                <w:b/>
+                <w:i w:val="0"/>
+                <w:color w:val="FFFFFF"/>
+                <w:sz w:val="22"/>
+              </w:rPr>
+              <w:t>Min. U-waarde</w:t>
+            </w:r>
+          </w:p>
+        </w:tc>
+      </w:tr>
+      <w:tr>
+        <w:trPr>
+          <w:trHeight w:val="400" w:hRule="atLeast"/>
+        </w:trPr>
+        <w:tc>
+          <w:tcPr>
+            <w:tcW w:type="dxa" w:w="3200"/>
             <w:shd w:val="clear" w:color="auto" w:fill="FFFFFF"/>
           </w:tcPr>
           <w:p>
@@ -3494,13 +3332,32 @@
                 <w:color w:val="1D1D1B"/>
                 <w:sz w:val="22"/>
               </w:rPr>
-              <w:t>€ 3.00/m²</w:t>
-            </w:r>
-          </w:p>
-        </w:tc>
-        <w:tc>
-          <w:tcPr>
-            <w:tcW w:type="dxa" w:w="1457"/>
+              <w:t>HR++ glas</w:t>
+            </w:r>
+          </w:p>
+        </w:tc>
+        <w:tc>
+          <w:tcPr>
+            <w:tcW w:type="dxa" w:w="2913"/>
+            <w:shd w:val="clear" w:color="auto" w:fill="FFFFFF"/>
+          </w:tcPr>
+          <w:p>
+            <w:r/>
+            <w:r>
+              <w:rPr>
+                <w:rFonts w:ascii="Calibri" w:hAnsi="Calibri"/>
+                <w:b/>
+                <w:i w:val="0"/>
+                <w:color w:val="1D1D1B"/>
+                <w:sz w:val="22"/>
+              </w:rPr>
+              <w:t>€ 12.50/m²</w:t>
+            </w:r>
+          </w:p>
+        </w:tc>
+        <w:tc>
+          <w:tcPr>
+            <w:tcW w:type="dxa" w:w="2913"/>
             <w:shd w:val="clear" w:color="auto" w:fill="FFFFFF"/>
           </w:tcPr>
           <w:p>
@@ -3513,13 +3370,56 @@
                 <w:color w:val="1D1D1B"/>
                 <w:sz w:val="22"/>
               </w:rPr>
-              <w:t>+ € 1.00/m²</w:t>
-            </w:r>
-          </w:p>
-        </w:tc>
-        <w:tc>
-          <w:tcPr>
-            <w:tcW w:type="dxa" w:w="1456"/>
+              <w:t>U ≤ 1,2 W/m²K</w:t>
+            </w:r>
+          </w:p>
+        </w:tc>
+      </w:tr>
+      <w:tr>
+        <w:trPr>
+          <w:trHeight w:val="400" w:hRule="atLeast"/>
+        </w:trPr>
+        <w:tc>
+          <w:tcPr>
+            <w:tcW w:type="dxa" w:w="3200"/>
+            <w:shd w:val="clear" w:color="auto" w:fill="FFFFFF"/>
+          </w:tcPr>
+          <w:p>
+            <w:r/>
+            <w:r>
+              <w:rPr>
+                <w:rFonts w:ascii="Calibri" w:hAnsi="Calibri"/>
+                <w:b/>
+                <w:i w:val="0"/>
+                <w:color w:val="1D1D1B"/>
+                <w:sz w:val="22"/>
+              </w:rPr>
+              <w:t>Vacuümglas</w:t>
+            </w:r>
+          </w:p>
+        </w:tc>
+        <w:tc>
+          <w:tcPr>
+            <w:tcW w:type="dxa" w:w="2913"/>
+            <w:shd w:val="clear" w:color="auto" w:fill="FFFFFF"/>
+          </w:tcPr>
+          <w:p>
+            <w:r/>
+            <w:r>
+              <w:rPr>
+                <w:rFonts w:ascii="Calibri" w:hAnsi="Calibri"/>
+                <w:b/>
+                <w:i w:val="0"/>
+                <w:color w:val="1D1D1B"/>
+                <w:sz w:val="22"/>
+              </w:rPr>
+              <w:t>€ 25.00/m²</w:t>
+            </w:r>
+          </w:p>
+        </w:tc>
+        <w:tc>
+          <w:tcPr>
+            <w:tcW w:type="dxa" w:w="2913"/>
             <w:shd w:val="clear" w:color="auto" w:fill="FFFFFF"/>
           </w:tcPr>
           <w:p>
@@ -3532,7 +3432,128 @@
                 <w:color w:val="1D1D1B"/>
                 <w:sz w:val="22"/>
               </w:rPr>
-              <w:t>Rc ≥ 1,3 m²K/W</w:t>
+              <w:t>U ≤ 0,7 W/m²K</w:t>
+            </w:r>
+          </w:p>
+        </w:tc>
+      </w:tr>
+      <w:tr>
+        <w:trPr>
+          <w:trHeight w:val="400" w:hRule="atLeast"/>
+        </w:trPr>
+        <w:tc>
+          <w:tcPr>
+            <w:tcW w:type="dxa" w:w="3200"/>
+          </w:tcPr>
+          <w:p>
+            <w:r/>
+            <w:r>
+              <w:rPr>
+                <w:rFonts w:ascii="Calibri" w:hAnsi="Calibri"/>
+                <w:b w:val="0"/>
+                <w:i w:val="0"/>
+                <w:color w:val="999999"/>
+                <w:sz w:val="22"/>
+              </w:rPr>
+              <w:t>Triple glas</w:t>
+            </w:r>
+          </w:p>
+        </w:tc>
+        <w:tc>
+          <w:tcPr>
+            <w:tcW w:type="dxa" w:w="2913"/>
+          </w:tcPr>
+          <w:p>
+            <w:r/>
+            <w:r>
+              <w:rPr>
+                <w:rFonts w:ascii="Calibri" w:hAnsi="Calibri"/>
+                <w:b w:val="0"/>
+                <w:i w:val="0"/>
+                <w:color w:val="999999"/>
+                <w:sz w:val="22"/>
+              </w:rPr>
+              <w:t>€ 111.00/m²</w:t>
+            </w:r>
+          </w:p>
+        </w:tc>
+        <w:tc>
+          <w:tcPr>
+            <w:tcW w:type="dxa" w:w="2913"/>
+          </w:tcPr>
+          <w:p>
+            <w:r/>
+            <w:r>
+              <w:rPr>
+                <w:rFonts w:ascii="Calibri" w:hAnsi="Calibri"/>
+                <w:b w:val="0"/>
+                <w:i w:val="0"/>
+                <w:color w:val="999999"/>
+                <w:sz w:val="22"/>
+              </w:rPr>
+              <w:t>U ≤ 0,7 W/m²K</w:t>
+            </w:r>
+          </w:p>
+        </w:tc>
+      </w:tr>
+      <w:tr>
+        <w:trPr>
+          <w:trHeight w:val="400" w:hRule="atLeast"/>
+        </w:trPr>
+        <w:tc>
+          <w:tcPr>
+            <w:tcW w:type="dxa" w:w="3200"/>
+            <w:shd w:val="clear" w:color="auto" w:fill="FFFFFF"/>
+          </w:tcPr>
+          <w:p>
+            <w:r/>
+            <w:r>
+              <w:rPr>
+                <w:rFonts w:ascii="Calibri" w:hAnsi="Calibri"/>
+                <w:b/>
+                <w:i w:val="0"/>
+                <w:color w:val="1D1D1B"/>
+                <w:sz w:val="22"/>
+              </w:rPr>
+              <w:t>Isolerende deuren</w:t>
+            </w:r>
+          </w:p>
+        </w:tc>
+        <w:tc>
+          <w:tcPr>
+            <w:tcW w:type="dxa" w:w="2913"/>
+            <w:shd w:val="clear" w:color="auto" w:fill="FFFFFF"/>
+          </w:tcPr>
+          <w:p>
+            <w:r/>
+            <w:r>
+              <w:rPr>
+                <w:rFonts w:ascii="Calibri" w:hAnsi="Calibri"/>
+                <w:b/>
+                <w:i w:val="0"/>
+                <w:color w:val="1D1D1B"/>
+                <w:sz w:val="22"/>
+              </w:rPr>
+              <w:t>€ 111.00/m²</w:t>
+            </w:r>
+          </w:p>
+        </w:tc>
+        <w:tc>
+          <w:tcPr>
+            <w:tcW w:type="dxa" w:w="2913"/>
+            <w:shd w:val="clear" w:color="auto" w:fill="FFFFFF"/>
+          </w:tcPr>
+          <w:p>
+            <w:r/>
+            <w:r>
+              <w:rPr>
+                <w:rFonts w:ascii="Calibri" w:hAnsi="Calibri"/>
+                <w:b w:val="0"/>
+                <w:i w:val="0"/>
+                <w:color w:val="1D1D1B"/>
+                <w:sz w:val="22"/>
+              </w:rPr>
+              <w:t>U ≤ 1,0 W/m²K</w:t>
             </w:r>
           </w:p>
         </w:tc>
@@ -3569,420 +3590,6 @@
                 <w:color w:val="FFFFFF"/>
                 <w:sz w:val="22"/>
               </w:rPr>
-              <w:t>Type glas</w:t>
-            </w:r>
-          </w:p>
-        </w:tc>
-        <w:tc>
-          <w:tcPr>
-            <w:tcW w:w="1942" w:type="dxa"/>
-            <w:shd w:val="clear" w:color="auto" w:fill="5AAA00"/>
-          </w:tcPr>
-          <w:p>
-            <w:r/>
-            <w:r>
-              <w:rPr>
-                <w:rFonts w:ascii="Calibri" w:hAnsi="Calibri"/>
-                <w:b/>
-                <w:i w:val="0"/>
-                <w:color w:val="FFFFFF"/>
-                <w:sz w:val="22"/>
-              </w:rPr>
-              <w:t>Enkelvoudig</w:t>
-            </w:r>
-          </w:p>
-        </w:tc>
-        <w:tc>
-          <w:tcPr>
-            <w:tcW w:w="1942" w:type="dxa"/>
-            <w:shd w:val="clear" w:color="auto" w:fill="5AAA00"/>
-          </w:tcPr>
-          <w:p>
-            <w:r/>
-            <w:r>
-              <w:rPr>
-                <w:rFonts w:ascii="Calibri" w:hAnsi="Calibri"/>
-                <w:b/>
-                <w:i w:val="0"/>
-                <w:color w:val="FFFFFF"/>
-                <w:sz w:val="22"/>
-              </w:rPr>
-              <w:t>Meervoudig</w:t>
-            </w:r>
-          </w:p>
-        </w:tc>
-        <w:tc>
-          <w:tcPr>
-            <w:tcW w:w="1942" w:type="dxa"/>
-            <w:shd w:val="clear" w:color="auto" w:fill="5AAA00"/>
-          </w:tcPr>
-          <w:p>
-            <w:r/>
-            <w:r>
-              <w:rPr>
-                <w:rFonts w:ascii="Calibri" w:hAnsi="Calibri"/>
-                <w:b/>
-                <w:i w:val="0"/>
-                <w:color w:val="FFFFFF"/>
-                <w:sz w:val="22"/>
-              </w:rPr>
-              <w:t>Min. U-waarde</w:t>
-            </w:r>
-          </w:p>
-        </w:tc>
-      </w:tr>
-      <w:tr>
-        <w:trPr>
-          <w:trHeight w:val="400" w:hRule="atLeast"/>
-        </w:trPr>
-        <w:tc>
-          <w:tcPr>
-            <w:tcW w:type="dxa" w:w="3200"/>
-            <w:shd w:val="clear" w:color="auto" w:fill="FFFFFF"/>
-          </w:tcPr>
-          <w:p>
-            <w:r/>
-            <w:r>
-              <w:rPr>
-                <w:rFonts w:ascii="Calibri" w:hAnsi="Calibri"/>
-                <w:b/>
-                <w:i w:val="0"/>
-                <w:color w:val="1D1D1B"/>
-                <w:sz w:val="22"/>
-              </w:rPr>
-              <w:t>HR++ glas</w:t>
-            </w:r>
-          </w:p>
-        </w:tc>
-        <w:tc>
-          <w:tcPr>
-            <w:tcW w:type="dxa" w:w="1942"/>
-            <w:shd w:val="clear" w:color="auto" w:fill="FFFFFF"/>
-          </w:tcPr>
-          <w:p>
-            <w:r/>
-            <w:r>
-              <w:rPr>
-                <w:rFonts w:ascii="Calibri" w:hAnsi="Calibri"/>
-                <w:b w:val="0"/>
-                <w:i w:val="0"/>
-                <w:color w:val="1D1D1B"/>
-                <w:sz w:val="22"/>
-              </w:rPr>
-              <w:t>€ 12.50/m²</w:t>
-            </w:r>
-          </w:p>
-        </w:tc>
-        <w:tc>
-          <w:tcPr>
-            <w:tcW w:type="dxa" w:w="1942"/>
-            <w:shd w:val="clear" w:color="auto" w:fill="FFFFFF"/>
-          </w:tcPr>
-          <w:p>
-            <w:r/>
-            <w:r>
-              <w:rPr>
-                <w:rFonts w:ascii="Calibri" w:hAnsi="Calibri"/>
-                <w:b/>
-                <w:i w:val="0"/>
-                <w:color w:val="1D1D1B"/>
-                <w:sz w:val="22"/>
-              </w:rPr>
-              <w:t>€ 25.00/m²</w:t>
-            </w:r>
-          </w:p>
-        </w:tc>
-        <w:tc>
-          <w:tcPr>
-            <w:tcW w:type="dxa" w:w="1942"/>
-            <w:shd w:val="clear" w:color="auto" w:fill="FFFFFF"/>
-          </w:tcPr>
-          <w:p>
-            <w:r/>
-            <w:r>
-              <w:rPr>
-                <w:rFonts w:ascii="Calibri" w:hAnsi="Calibri"/>
-                <w:b w:val="0"/>
-                <w:i w:val="0"/>
-                <w:color w:val="1D1D1B"/>
-                <w:sz w:val="22"/>
-              </w:rPr>
-              <w:t>U ≤ 1,2 W/m²K</w:t>
-            </w:r>
-          </w:p>
-        </w:tc>
-      </w:tr>
-      <w:tr>
-        <w:trPr>
-          <w:trHeight w:val="400" w:hRule="atLeast"/>
-        </w:trPr>
-        <w:tc>
-          <w:tcPr>
-            <w:tcW w:type="dxa" w:w="3200"/>
-            <w:shd w:val="clear" w:color="auto" w:fill="FFFFFF"/>
-          </w:tcPr>
-          <w:p>
-            <w:r/>
-            <w:r>
-              <w:rPr>
-                <w:rFonts w:ascii="Calibri" w:hAnsi="Calibri"/>
-                <w:b/>
-                <w:i w:val="0"/>
-                <w:color w:val="1D1D1B"/>
-                <w:sz w:val="22"/>
-              </w:rPr>
-              <w:t>Vacuümglas</w:t>
-            </w:r>
-          </w:p>
-        </w:tc>
-        <w:tc>
-          <w:tcPr>
-            <w:tcW w:type="dxa" w:w="1942"/>
-            <w:shd w:val="clear" w:color="auto" w:fill="FFFFFF"/>
-          </w:tcPr>
-          <w:p>
-            <w:r/>
-            <w:r>
-              <w:rPr>
-                <w:rFonts w:ascii="Calibri" w:hAnsi="Calibri"/>
-                <w:b w:val="0"/>
-                <w:i w:val="0"/>
-                <w:color w:val="1D1D1B"/>
-                <w:sz w:val="22"/>
-              </w:rPr>
-              <w:t>€ 12.50/m²</w:t>
-            </w:r>
-          </w:p>
-        </w:tc>
-        <w:tc>
-          <w:tcPr>
-            <w:tcW w:type="dxa" w:w="1942"/>
-            <w:shd w:val="clear" w:color="auto" w:fill="FFFFFF"/>
-          </w:tcPr>
-          <w:p>
-            <w:r/>
-            <w:r>
-              <w:rPr>
-                <w:rFonts w:ascii="Calibri" w:hAnsi="Calibri"/>
-                <w:b/>
-                <w:i w:val="0"/>
-                <w:color w:val="1D1D1B"/>
-                <w:sz w:val="22"/>
-              </w:rPr>
-              <w:t>€ 25.00/m²</w:t>
-            </w:r>
-          </w:p>
-        </w:tc>
-        <w:tc>
-          <w:tcPr>
-            <w:tcW w:type="dxa" w:w="1942"/>
-            <w:shd w:val="clear" w:color="auto" w:fill="FFFFFF"/>
-          </w:tcPr>
-          <w:p>
-            <w:r/>
-            <w:r>
-              <w:rPr>
-                <w:rFonts w:ascii="Calibri" w:hAnsi="Calibri"/>
-                <w:b w:val="0"/>
-                <w:i w:val="0"/>
-                <w:color w:val="1D1D1B"/>
-                <w:sz w:val="22"/>
-              </w:rPr>
-              <w:t>U ≤ 0,7 W/m²K</w:t>
-            </w:r>
-          </w:p>
-        </w:tc>
-      </w:tr>
-      <w:tr>
-        <w:trPr>
-          <w:trHeight w:val="400" w:hRule="atLeast"/>
-        </w:trPr>
-        <w:tc>
-          <w:tcPr>
-            <w:tcW w:type="dxa" w:w="3200"/>
-          </w:tcPr>
-          <w:p>
-            <w:r/>
-            <w:r>
-              <w:rPr>
-                <w:rFonts w:ascii="Calibri" w:hAnsi="Calibri"/>
-                <w:b w:val="0"/>
-                <w:i w:val="0"/>
-                <w:color w:val="999999"/>
-                <w:sz w:val="22"/>
-              </w:rPr>
-              <w:t>Triple glas</w:t>
-            </w:r>
-          </w:p>
-        </w:tc>
-        <w:tc>
-          <w:tcPr>
-            <w:tcW w:type="dxa" w:w="1942"/>
-          </w:tcPr>
-          <w:p>
-            <w:r/>
-            <w:r>
-              <w:rPr>
-                <w:rFonts w:ascii="Calibri" w:hAnsi="Calibri"/>
-                <w:b w:val="0"/>
-                <w:i w:val="0"/>
-                <w:color w:val="999999"/>
-                <w:sz w:val="22"/>
-              </w:rPr>
-              <w:t>€ 55.50/m²</w:t>
-            </w:r>
-          </w:p>
-        </w:tc>
-        <w:tc>
-          <w:tcPr>
-            <w:tcW w:type="dxa" w:w="1942"/>
-          </w:tcPr>
-          <w:p>
-            <w:r/>
-            <w:r>
-              <w:rPr>
-                <w:rFonts w:ascii="Calibri" w:hAnsi="Calibri"/>
-                <w:b w:val="0"/>
-                <w:i w:val="0"/>
-                <w:color w:val="999999"/>
-                <w:sz w:val="22"/>
-              </w:rPr>
-              <w:t>€ 111.00/m²</w:t>
-            </w:r>
-          </w:p>
-        </w:tc>
-        <w:tc>
-          <w:tcPr>
-            <w:tcW w:type="dxa" w:w="1942"/>
-          </w:tcPr>
-          <w:p>
-            <w:r/>
-            <w:r>
-              <w:rPr>
-                <w:rFonts w:ascii="Calibri" w:hAnsi="Calibri"/>
-                <w:b w:val="0"/>
-                <w:i w:val="0"/>
-                <w:color w:val="999999"/>
-                <w:sz w:val="22"/>
-              </w:rPr>
-              <w:t>U ≤ 0,7 W/m²K</w:t>
-            </w:r>
-          </w:p>
-        </w:tc>
-      </w:tr>
-      <w:tr>
-        <w:trPr>
-          <w:trHeight w:val="400" w:hRule="atLeast"/>
-        </w:trPr>
-        <w:tc>
-          <w:tcPr>
-            <w:tcW w:type="dxa" w:w="3200"/>
-            <w:shd w:val="clear" w:color="auto" w:fill="FFFFFF"/>
-          </w:tcPr>
-          <w:p>
-            <w:r/>
-            <w:r>
-              <w:rPr>
-                <w:rFonts w:ascii="Calibri" w:hAnsi="Calibri"/>
-                <w:b/>
-                <w:i w:val="0"/>
-                <w:color w:val="1D1D1B"/>
-                <w:sz w:val="22"/>
-              </w:rPr>
-              <w:t>Isolerende deuren</w:t>
-            </w:r>
-          </w:p>
-        </w:tc>
-        <w:tc>
-          <w:tcPr>
-            <w:tcW w:type="dxa" w:w="1942"/>
-            <w:shd w:val="clear" w:color="auto" w:fill="FFFFFF"/>
-          </w:tcPr>
-          <w:p>
-            <w:r/>
-            <w:r>
-              <w:rPr>
-                <w:rFonts w:ascii="Calibri" w:hAnsi="Calibri"/>
-                <w:b w:val="0"/>
-                <w:i w:val="0"/>
-                <w:color w:val="1D1D1B"/>
-                <w:sz w:val="22"/>
-              </w:rPr>
-              <w:t>€ 55.50/m²</w:t>
-            </w:r>
-          </w:p>
-        </w:tc>
-        <w:tc>
-          <w:tcPr>
-            <w:tcW w:type="dxa" w:w="1942"/>
-            <w:shd w:val="clear" w:color="auto" w:fill="FFFFFF"/>
-          </w:tcPr>
-          <w:p>
-            <w:r/>
-            <w:r>
-              <w:rPr>
-                <w:rFonts w:ascii="Calibri" w:hAnsi="Calibri"/>
-                <w:b/>
-                <w:i w:val="0"/>
-                <w:color w:val="1D1D1B"/>
-                <w:sz w:val="22"/>
-              </w:rPr>
-              <w:t>€ 111.00/m²</w:t>
-            </w:r>
-          </w:p>
-        </w:tc>
-        <w:tc>
-          <w:tcPr>
-            <w:tcW w:type="dxa" w:w="1942"/>
-            <w:shd w:val="clear" w:color="auto" w:fill="FFFFFF"/>
-          </w:tcPr>
-          <w:p>
-            <w:r/>
-            <w:r>
-              <w:rPr>
-                <w:rFonts w:ascii="Calibri" w:hAnsi="Calibri"/>
-                <w:b w:val="0"/>
-                <w:i w:val="0"/>
-                <w:color w:val="1D1D1B"/>
-                <w:sz w:val="22"/>
-              </w:rPr>
-              <w:t>U ≤ 1,0 W/m²K</w:t>
-            </w:r>
-          </w:p>
-        </w:tc>
-      </w:tr>
-    </w:tbl>
-    <w:p/>
-    <w:tbl>
-      <w:tblPr>
-        <w:tblW w:w="9026" w:type="dxa"/>
-        <w:tblLook w:firstColumn="1" w:firstRow="1" w:lastColumn="0" w:lastRow="0" w:noHBand="0" w:noVBand="1" w:val="04A0"/>
-      </w:tblPr>
-      <w:tblGrid>
-        <w:gridCol w:w="3200"/>
-        <w:gridCol w:w="1942"/>
-        <w:gridCol w:w="1942"/>
-        <w:gridCol w:w="1942"/>
-      </w:tblGrid>
-      <w:tr>
-        <w:trPr>
-          <w:trHeight w:val="400" w:hRule="atLeast"/>
-        </w:trPr>
-        <w:tc>
-          <w:tcPr>
-            <w:tcW w:w="3200" w:type="dxa"/>
-            <w:shd w:val="clear" w:color="auto" w:fill="5AAA00"/>
-          </w:tcPr>
-          <w:p>
-            <w:r/>
-            <w:r>
-              <w:rPr>
-                <w:rFonts w:ascii="Calibri" w:hAnsi="Calibri"/>
-                <w:b/>
-                <w:i w:val="0"/>
-                <w:color w:val="FFFFFF"/>
-                <w:sz w:val="22"/>
-              </w:rPr>
               <w:t>Combinatie</w:t>
             </w:r>
           </w:p>
@@ -4158,6 +3765,53 @@
       <w:tblGrid>
         <w:gridCol w:w="9638"/>
       </w:tblGrid>
+      <w:tr>
+        <w:trPr>
+          <w:trHeight w:val="400" w:hRule="atLeast"/>
+        </w:trPr>
+        <w:tc>
+          <w:tcPr>
+            <w:tcW w:type="dxa" w:w="9638"/>
+            <w:shd w:val="clear" w:color="auto" w:fill="FFFFFF"/>
+          </w:tcPr>
+          <w:p>
+            <w:r/>
+            <w:r>
+              <w:rPr>
+                <w:rFonts w:ascii="Calibri" w:hAnsi="Calibri"/>
+                <w:b/>
+                <w:i w:val="0"/>
+                <w:color w:val="2E7D32"/>
+                <w:sz w:val="22"/>
+              </w:rPr>
+              <w:t>Indicatief ISDE-subsidietotaal voor uw woning: tot €1,871 (meervoudig tarief 2026, op basis van geschatte oppervlaktes)</w:t>
+            </w:r>
+          </w:p>
+        </w:tc>
+      </w:tr>
+      <w:tr>
+        <w:trPr>
+          <w:trHeight w:val="400" w:hRule="atLeast"/>
+        </w:trPr>
+        <w:tc>
+          <w:tcPr>
+            <w:tcW w:type="dxa" w:w="9638"/>
+            <w:shd w:val="clear" w:color="auto" w:fill="FFFFFF"/>
+          </w:tcPr>
+          <w:p>
+            <w:r/>
+            <w:r>
+              <w:rPr>
+                <w:rFonts w:ascii="Calibri" w:hAnsi="Calibri"/>
+                <w:b w:val="0"/>
+                <w:i/>
+                <w:sz w:val="22"/>
+              </w:rPr>
+              <w:t>De getoonde bedragen zijn de basisbedragen (ISDE 2026). Uw subsidiebedrag verdubbelt als u meer dan één isolatiemaatregel uitvoert, of een isolatiemaatregel combineert met een warmtepomp, zonneboiler of aansluiting op een warmtenet. Vraag subsidie aan binnen 24 maanden na de eerste maatregel. Subsidie verdubbelt niet bij combinatie met uitsluitend ventilatie, en de biobased bonus verdubbelt niet bij de tweede maatregel.</w:t>
+            </w:r>
+          </w:p>
+        </w:tc>
+      </w:tr>
       <w:tr>
         <w:tc>
           <w:tcPr>
@@ -4601,22 +4255,13 @@
             </w:pPr>
             <w:r>
               <w:rPr>
+                <w:b/>
                 <w:rFonts w:ascii="Calibri" w:hAnsi="Calibri" w:cs="Calibri"/>
                 <w:sz w:val="22"/>
                 <w:szCs w:val="22"/>
                 <w:color w:val="1A1A1A"/>
               </w:rPr>
-              <w:t xml:space="preserve">Bekijk uw mogelijkheden op </w:t>
-            </w:r>
-            <w:r>
-              <w:rPr>
-                <w:b/>
-                <w:rFonts w:ascii="Calibri" w:hAnsi="Calibri" w:cs="Calibri"/>
-                <w:sz w:val="22"/>
-                <w:szCs w:val="22"/>
-                <w:color w:val="1A1A1A"/>
-              </w:rPr>
-              <w:t xml:space="preserve">pandiq.nl/dashboard</w:t>
+              <w:t xml:space="preserve">Vraag nu een vrijblijvende offerte aan — inclusief subsidiecheck en aanvraagafhandeling</w:t>
             </w:r>
             <w:r>
               <w:rPr>
@@ -4627,6 +4272,21 @@
                 <w:color w:val="1A1A1A"/>
               </w:rPr>
               <w:t xml:space="preserve">  →</w:t>
+            </w:r>
+          </w:p>
+          <w:p>
+            <w:pPr>
+              <w:spacing w:before="0" w:after="0"/>
+              <w:shd w:val="clear" w:color="auto" w:fill="D4E832"/>
+            </w:pPr>
+            <w:r>
+              <w:rPr>
+                <w:rFonts w:ascii="Calibri" w:hAnsi="Calibri" w:cs="Calibri"/>
+                <w:sz w:val="18"/>
+                <w:szCs w:val="18"/>
+                <w:color w:val="333333"/>
+              </w:rPr>
+              <w:t xml:space="preserve">https://www.pandiq.nl/offerte</w:t>
             </w:r>
           </w:p>
         </w:tc>
@@ -4703,25 +4363,7 @@
         <w:sz w:val="16"/>
         <w:szCs w:val="16"/>
       </w:rPr>
-      <w:t xml:space="preserve">Indicatief rapport · </w:t>
-    </w:r>
-    <w:proofErr w:type="spellStart"/>
-    <w:r>
-      <w:rPr>
-        <w:color w:val="5A6A85"/>
-        <w:sz w:val="16"/>
-        <w:szCs w:val="16"/>
-      </w:rPr>
-      <w:t>PandIQ</w:t>
-    </w:r>
-    <w:proofErr w:type="spellEnd"/>
-    <w:r>
-      <w:rPr>
-        <w:color w:val="5A6A85"/>
-        <w:sz w:val="16"/>
-        <w:szCs w:val="16"/>
-      </w:rPr>
-      <w:t xml:space="preserve"> · www.pandiq.nl</w:t>
+      <w:t>Indicatief rapport · PandIQ · www.pandiq.nl</w:t>
     </w:r>
     <w:r>
       <w:rPr>

</xml_diff>